<commit_message>
Added UnitTests, added time mesurements, added user test results.
</commit_message>
<xml_diff>
--- a/Doc/Završni_rad_FilipFolnegović.docx
+++ b/Doc/Završni_rad_FilipFolnegović.docx
@@ -2490,13 +2490,7 @@
     </w:p>
     <w:p>
       <w:r>
-        <w:t xml:space="preserve">Glavna prednost komercijalnih rješenja je njihova iznimna preciznost i brzina kod standardnih matematičkih problema. Photomath izvrsno rješava problem unosa podataka, dok WolframAlpha nudi </w:t>
-      </w:r>
-      <w:r>
-        <w:t>jaku</w:t>
-      </w:r>
-      <w:r>
-        <w:t xml:space="preserve"> dubinu analize. Ipak, ti alati nose i značajne nedostatke u kontekstu profesionalne primjene unutar STEM područja. Većina tih aplikacija zahtijeva stalnu internetsku vezu za kompleksne izračune, što može predstavljati ograničenje u specifičnim okruženjima.</w:t>
+        <w:t>Glavna prednost komercijalnih rješenja je njihova iznimna preciznost i brzina kod standardnih matematičkih problema. Photomath izvrsno rješava problem unosa podataka, dok WolframAlpha nudi jaku dubinu analize. Ipak, ti alati nose i značajne nedostatke u kontekstu profesionalne primjene unutar STEM područja. Većina tih aplikacija zahtijeva stalnu internetsku vezu za kompleksne izračune, što može predstavljati ograničenje u specifičnim okruženjima.</w:t>
       </w:r>
     </w:p>
     <w:p>
@@ -2702,10 +2696,7 @@
     </w:p>
     <w:p>
       <w:r>
-        <w:t>Arhitektura sučelja</w:t>
-      </w:r>
-      <w:r>
-        <w:t>:</w:t>
+        <w:t>Arhitektura sučelja:</w:t>
       </w:r>
     </w:p>
     <w:p>
@@ -2720,10 +2711,7 @@
     </w:p>
     <w:p>
       <w:r>
-        <w:t>Implementacija navigacije</w:t>
-      </w:r>
-      <w:r>
-        <w:t>:</w:t>
+        <w:t>Implementacija navigacije:</w:t>
       </w:r>
     </w:p>
     <w:p>
@@ -2739,10 +2727,7 @@
     </w:p>
     <w:p>
       <w:r>
-        <w:t>Tehnička optimizacija sučelja</w:t>
-      </w:r>
-      <w:r>
-        <w:t>:</w:t>
+        <w:t>Tehnička optimizacija sučelja:</w:t>
       </w:r>
     </w:p>
     <w:p>
@@ -2757,10 +2742,7 @@
     </w:p>
     <w:p>
       <w:r>
-        <w:t>Ulazna točka aplikacije (SplashScreen)</w:t>
-      </w:r>
-      <w:r>
-        <w:t>:</w:t>
+        <w:t>Ulazna točka aplikacije (SplashScreen):</w:t>
       </w:r>
     </w:p>
     <w:p>
@@ -2787,10 +2769,7 @@
     </w:p>
     <w:p>
       <w:r>
-        <w:t>Perzistencija podataka i Room arhitektura</w:t>
-      </w:r>
-      <w:r>
-        <w:t>:</w:t>
+        <w:t>Perzistencija podataka i Room arhitektura:</w:t>
       </w:r>
     </w:p>
     <w:p>
@@ -2800,27 +2779,12 @@
     </w:p>
     <w:p>
       <w:r>
-        <w:t>Podatkovni model i relacije</w:t>
-      </w:r>
-      <w:r>
-        <w:t>:</w:t>
-      </w:r>
-    </w:p>
-    <w:p>
-      <w:r>
-        <w:t>Logička struktura podataka podijeljena je na dva osnovna entiteta</w:t>
-      </w:r>
-      <w:r>
-        <w:t xml:space="preserve">. </w:t>
-      </w:r>
-      <w:r>
-        <w:t>Pocket (Mapa): Predstavlja tematsku cjelinu (npr. "Fizika 1"). Sadrži jedinstveni primarni ključ i naziv mape.</w:t>
-      </w:r>
-      <w:r>
-        <w:t xml:space="preserve"> </w:t>
-      </w:r>
-      <w:r>
-        <w:t>Equation (Jednadžba): Sadrži detaljne informacije o matematičkom izrazu, uključujući naziv jednadžbe, samu tekstualnu formulu, opcionalni opis te oznaku prioriteta (favorit).</w:t>
+        <w:t>Podatkovni model i relacije:</w:t>
+      </w:r>
+    </w:p>
+    <w:p>
+      <w:r>
+        <w:t>Logička struktura podataka podijeljena je na dva osnovna entiteta. Pocket (Mapa): Predstavlja tematsku cjelinu (npr. "Fizika 1"). Sadrži jedinstveni primarni ključ i naziv mape. Equation (Jednadžba): Sadrži detaljne informacije o matematičkom izrazu, uključujući naziv jednadžbe, samu tekstualnu formulu, opcionalni opis te oznaku prioriteta (favorit).</w:t>
       </w:r>
     </w:p>
     <w:p>
@@ -2830,10 +2794,7 @@
     </w:p>
     <w:p>
       <w:r>
-        <w:t>Logika prioriteta i favorita</w:t>
-      </w:r>
-      <w:r>
-        <w:t>:</w:t>
+        <w:t>Logika prioriteta i favorita:</w:t>
       </w:r>
     </w:p>
     <w:p>
@@ -2848,10 +2809,7 @@
     </w:p>
     <w:p>
       <w:r>
-        <w:t>Vizualna prezentacija i RecyclerView</w:t>
-      </w:r>
-      <w:r>
-        <w:t>:</w:t>
+        <w:t>Vizualna prezentacija i RecyclerView:</w:t>
       </w:r>
     </w:p>
     <w:p>
@@ -2867,10 +2825,7 @@
     </w:p>
     <w:p>
       <w:r>
-        <w:t>CRUD operacije i korisničko sučelje</w:t>
-      </w:r>
-      <w:r>
-        <w:t>:</w:t>
+        <w:t>CRUD operacije i korisničko sučelje:</w:t>
       </w:r>
     </w:p>
     <w:p>
@@ -2893,10 +2848,7 @@
     </w:p>
     <w:p>
       <w:r>
-        <w:t>Implementacija CameraX preview sučelja</w:t>
-      </w:r>
-      <w:r>
-        <w:t>:</w:t>
+        <w:t>Implementacija CameraX preview sučelja:</w:t>
       </w:r>
     </w:p>
     <w:p>
@@ -2912,10 +2864,7 @@
     </w:p>
     <w:p>
       <w:r>
-        <w:t>Integracija Google ML Kit OCR sustava</w:t>
-      </w:r>
-      <w:r>
-        <w:t>:</w:t>
+        <w:t>Integracija Google ML Kit OCR sustava:</w:t>
       </w:r>
     </w:p>
     <w:p>
@@ -2930,10 +2879,7 @@
     </w:p>
     <w:p>
       <w:r>
-        <w:t>Matematičko post-procesiranje skeniranog teksta</w:t>
-      </w:r>
-      <w:r>
-        <w:t>:</w:t>
+        <w:t>Matematičko post-procesiranje skeniranog teksta:</w:t>
       </w:r>
     </w:p>
     <w:p>
@@ -2962,10 +2908,7 @@
     </w:p>
     <w:p>
       <w:r>
-        <w:t>Uloga Symja CAS engine-a u procesu parsiranja</w:t>
-      </w:r>
-      <w:r>
-        <w:t>:</w:t>
+        <w:t>Uloga Symja CAS engine-a u procesu parsiranja:</w:t>
       </w:r>
     </w:p>
     <w:p>
@@ -2980,10 +2923,7 @@
     </w:p>
     <w:p>
       <w:r>
-        <w:t>Hijerarhija i prepoznavanje simbola</w:t>
-      </w:r>
-      <w:r>
-        <w:t>:</w:t>
+        <w:t>Hijerarhija i prepoznavanje simbola:</w:t>
       </w:r>
     </w:p>
     <w:p>
@@ -2999,10 +2939,7 @@
     <w:p>
       <w:r>
         <w:lastRenderedPageBreak/>
-        <w:t>Rukovanje sintaktičkim pogreškama</w:t>
-      </w:r>
-      <w:r>
-        <w:t>:</w:t>
+        <w:t>Rukovanje sintaktičkim pogreškama:</w:t>
       </w:r>
     </w:p>
     <w:p>
@@ -3057,10 +2994,7 @@
     </w:p>
     <w:p>
       <w:r>
-        <w:t>Prikupljanje i obrada podataka za graf</w:t>
-      </w:r>
-      <w:r>
-        <w:t>:</w:t>
+        <w:t>Prikupljanje i obrada podataka za graf:</w:t>
       </w:r>
     </w:p>
     <w:p>
@@ -3079,10 +3013,7 @@
     </w:p>
     <w:p>
       <w:r>
-        <w:t>Vizualni stil i korisničko sučelje</w:t>
-      </w:r>
-      <w:r>
-        <w:t>:</w:t>
+        <w:t>Vizualni stil i korisničko sučelje:</w:t>
       </w:r>
     </w:p>
     <w:p>
@@ -3092,10 +3023,7 @@
     </w:p>
     <w:p>
       <w:r>
-        <w:t>Rješavanje problema ekstremnih raspona (Logaritamska skala)</w:t>
-      </w:r>
-      <w:r>
-        <w:t>:</w:t>
+        <w:t>Rješavanje problema ekstremnih raspona (Logaritamska skala):</w:t>
       </w:r>
     </w:p>
     <w:p>
@@ -3123,10 +3051,7 @@
     </w:p>
     <w:p>
       <w:r>
-        <w:t>Logika automatskog pokretanja</w:t>
-      </w:r>
-      <w:r>
-        <w:t>:</w:t>
+        <w:t>Logika automatskog pokretanja:</w:t>
       </w:r>
     </w:p>
     <w:p>
@@ -3145,18 +3070,12 @@
     </w:p>
     <w:p>
       <w:r>
-        <w:t>Implementacija interaktivnog pop-upa</w:t>
-      </w:r>
-      <w:r>
-        <w:t>:</w:t>
-      </w:r>
-    </w:p>
-    <w:p>
-      <w:r>
-        <w:t>Sam vodič realiziran je kao prilagođeni AlertDialog koji koristi namjenski XML layout (dialog_tutorial.xml). Za razliku od standardnih tekstualnih poruka, ovaj pop-up sadrži niz od tri vizualna prikaza koji simuliraju rad u aplikaciji. Svaka slika u nizu nosi specifičnu informaciju</w:t>
-      </w:r>
-      <w:r>
-        <w:t>.</w:t>
+        <w:t>Implementacija interaktivnog pop-upa:</w:t>
+      </w:r>
+    </w:p>
+    <w:p>
+      <w:r>
+        <w:t>Sam vodič realiziran je kao prilagođeni AlertDialog koji koristi namjenski XML layout (dialog_tutorial.xml). Za razliku od standardnih tekstualnih poruka, ovaj pop-up sadrži niz od tri vizualna prikaza koji simuliraju rad u aplikaciji. Svaka slika u nizu nosi specifičnu informaciju.</w:t>
       </w:r>
     </w:p>
     <w:p>
@@ -3181,10 +3100,7 @@
     </w:p>
     <w:p>
       <w:r>
-        <w:t>Trajna dostupnost i UX</w:t>
-      </w:r>
-      <w:r>
-        <w:t>:</w:t>
+        <w:t>Trajna dostupnost i UX:</w:t>
       </w:r>
     </w:p>
     <w:p>
@@ -3208,10 +3124,7 @@
     </w:p>
     <w:p>
       <w:r>
-        <w:t>Mehanizam enkodiranja (Base64)</w:t>
-      </w:r>
-      <w:r>
-        <w:t>:</w:t>
+        <w:t>Mehanizam enkodiranja (Base64):</w:t>
       </w:r>
     </w:p>
     <w:p>
@@ -3226,10 +3139,7 @@
     </w:p>
     <w:p>
       <w:r>
-        <w:t>Dijeljenje cijelih mapa (Pockets)</w:t>
-      </w:r>
-      <w:r>
-        <w:t>:</w:t>
+        <w:t>Dijeljenje cijelih mapa (Pockets):</w:t>
       </w:r>
     </w:p>
     <w:p>
@@ -3244,10 +3154,7 @@
     </w:p>
     <w:p>
       <w:r>
-        <w:t>Logika uvoza i rukovanje pogreškama</w:t>
-      </w:r>
-      <w:r>
-        <w:t>:</w:t>
+        <w:t>Logika uvoza i rukovanje pogreškama:</w:t>
       </w:r>
     </w:p>
     <w:p>
@@ -3259,6 +3166,136 @@
       <w:r>
         <w:lastRenderedPageBreak/>
         <w:t>Implementiran je sustav za prepoznavanje tipa podataka na temelju prefiksa. Ako dekodirani niz počinje s POCKET:, sustav automatski kreira novu mapu u bazi i u nju sekvencijalno upisuje sve pripadajuće jednadžbe. U suprotnom, sustav tretira kôd kao pojedinačnu jednadžbu i dodaje je u trenutno aktivnu mapu. Cijeli proces zaštićen je try-catch blokovima koji detektiraju neispravne kodove (npr. nepotpune ili oštećene nizove), sprječavajući rušenje aplikacije i obavještavajući korisnika o neuspješnom uvozu putem poruka (engl. Toast).</w:t>
+      </w:r>
+    </w:p>
+    <w:p>
+      <w:pPr>
+        <w:spacing w:before="0" w:after="0" w:line="240" w:lineRule="auto"/>
+        <w:jc w:val="left"/>
+      </w:pPr>
+      <w:r>
+        <w:br w:type="page"/>
+      </w:r>
+    </w:p>
+    <w:p>
+      <w:pPr>
+        <w:pStyle w:val="Heading1"/>
+      </w:pPr>
+      <w:r>
+        <w:lastRenderedPageBreak/>
+        <w:t>Testiranje aplikacije</w:t>
+      </w:r>
+    </w:p>
+    <w:p>
+      <w:r>
+        <w:t>Testiranje aplikacije EquationPocket provedeno je u dvije glavne faze kako bi se osigurala pouzdanost matematičkih izračuna i besprijekoran rad korisničkog sučelja. Prva faza obuhvaćala je automatske testove logike rješavača, dok je druga faza bila usmjerena na manualnu verifikaciju integracije svih modula na fizičkim Android uređajima.</w:t>
+      </w:r>
+    </w:p>
+    <w:p>
+      <w:pPr>
+        <w:pStyle w:val="Heading2"/>
+      </w:pPr>
+      <w:r>
+        <w:t>Metode testiranja na Android uređajima</w:t>
+      </w:r>
+    </w:p>
+    <w:p>
+      <w:r>
+        <w:t>Za potrebe verifikacije korišten je standardni JUnit okvir unutar Android Studio razvojnog okruženja te manualna metoda testiranja prema unaprijed definiranim scenarijima korištenja. Ovakav pristup omogućio je provjeru i tehničke točnosti koda i kvalitete korisničkog iskustva.</w:t>
+      </w:r>
+    </w:p>
+    <w:p>
+      <w:pPr>
+        <w:pStyle w:val="Heading3"/>
+      </w:pPr>
+      <w:r>
+        <w:t>Unit testing modula za parsiranje i izračun</w:t>
+      </w:r>
+    </w:p>
+    <w:p>
+      <w:r>
+        <w:t>U ovoj podfazi provedena je izolirana provjera jezgre matematičkog sustava aplikacije. Implementirano je ukupno sedam testnih scenarija unutar klase MathLogicUnitTest koji su potvrdili točnost integracije Symja CAS engine-a. Testiranje je provedeno bez pokretanja sučelja, čime je postignuta visoka brzina izvršavanja, a cijeli set testova dovršen je u roku od četiri sekunde.</w:t>
+      </w:r>
+    </w:p>
+    <w:p>
+      <w:r>
+        <w:t>Provedena je verifikacija algebarskog rješavanja linearnih i kvadratnih jednadžbi, pri čemu je sustav ispravno detektirao oba rješenja u kvadratnim funkcijama. Također je potvrđena ispravnost simboličke manipulacije kroz procese deriviranja i integriranja funkcija, gdje je sustav uspješno izveo derivaciju potencije i integraciju zadanih izraza. Poseban naglasak stavljen je na provjeru otpornosti sustava pri dijeljenju s nulom, a rezultati su potvrdili da engine ispravno prepoznaje beskonačnost i prosljeđuje tu informaciju aplikaciji bez prekida rada sustava. Dodatno je verificiran rad sa znanstvenim zapisom brojeva izraženim u potencijama broja deset, čime je potvrđeno da sustav ispravno tumači simbole poput operatora potencije unutar tekstualnog niza. Svi provedeni testovi su uspješno završili, dokazujući da su apstraktna sintaktička stabla ispravno izgrađena tijekom procesa parsiranja i spremna za rad sa stvarnim korisničkim podacima.</w:t>
+      </w:r>
+    </w:p>
+    <w:p>
+      <w:pPr>
+        <w:pStyle w:val="Heading3"/>
+      </w:pPr>
+      <w:r>
+        <w:lastRenderedPageBreak/>
+        <w:t>Integracijsko testiranje korisničkog sučelja</w:t>
+      </w:r>
+    </w:p>
+    <w:p>
+      <w:r>
+        <w:t>Integracijsko testiranje provedeno je manualnom metodom na fizičkom uređaju u svrhu provjere komunikacije između fragmenata i perzistencije podataka u Room bazi. Testiranje je obuhvatilo cjelokupni radni tijek aplikacije od početnog ekrana do finalne vizualizacije rezultata. Verificirano je ispravno funkcioniranje navigacijskog sustava pri prijelazu iz popisa mapa u ekran s jednadžbama te ulazak u rješavač, pri čemu su se podaci prenosili strogo tipizirano bez grešaka.</w:t>
+      </w:r>
+    </w:p>
+    <w:p>
+      <w:r>
+        <w:t>Testirana je sinkronizacija sučelja za unos podataka, pri čemu je potvrđeno da sustav ispravno vraća skenirani tekst iz kamere u polje formule te da se pri fokusu na polja automatski aktivira odgovarajuća vrsta tipkovnice. Provedena je i provjera povijesti izračuna koja se ispravno ažurira pri korištenju gumba za prebacivanje između simboličkog i decimalnog zapisa. Svi ovi podaci uspješno su se prenosili u modul za iscrtavanje grafova bez gubitka preciznosti. Konačno, testiran je rad aplikacije u tamnom načinu rada, čime je potvrđeno da su svi dinamički elementi jasno vidljivi bez obzira na temu sustava. Rezultati su pokazali da je aplikacija stabilna, navigacijski putevi su logični, a podaci su konzistentni kroz sve razine sustava, što potvrđuje da je implementirana arhitektura ispravno realizirana.</w:t>
+      </w:r>
+    </w:p>
+    <w:p>
+      <w:pPr>
+        <w:pStyle w:val="Heading2"/>
+      </w:pPr>
+      <w:r>
+        <w:t>Analiza performansi i rezultata testiranja</w:t>
+      </w:r>
+    </w:p>
+    <w:p>
+      <w:r>
+        <w:t>Analiza performansi aplikacije provedena je kroz sustavno prikupljanje podataka na reprezentativnom uzorku od 25 različitih Android uređaja. Testiranje je obuhvatilo uređaje s rasponom Android operacijskih sustava od verzije 9 do verzije 15, čime je potvrđena široka kompatibilnost i stabilnost aplikacije na različitim API razinama. Primarni fokus analize bio je na utvrđivanju korelacije između hardverskih karakteristika uređaja, prvenstveno optičkih senzora kamera, i uspješnosti integriranih algoritama za prepoznavanje teksta i vizualizaciju podataka. Rezultati su agregirani u svrhu dobivanja objektivnog uvida u učinkovitost sustava u stvarnim uvjetima korištenja, uz poseban naglasak na preciznost matematičkog OCR modula.</w:t>
+      </w:r>
+    </w:p>
+    <w:p>
+      <w:pPr>
+        <w:pStyle w:val="Heading3"/>
+      </w:pPr>
+      <w:r>
+        <w:t>Analiza preciznosti prepoznavanja teksta</w:t>
+      </w:r>
+    </w:p>
+    <w:p>
+      <w:r>
+        <w:t xml:space="preserve">Istraživanje preciznosti prepoznavanja teksta provedeno je kroz deset testnih jednadžbi različitih razina složenosti, od osnovnih linearnih izraza do naprednih termodinamičkih formula s grčkim simbolima i eksponentima. Prikupljeni podaci ukazuju na izravnu ovisnost </w:t>
+      </w:r>
+      <w:r>
+        <w:lastRenderedPageBreak/>
+        <w:t>uspješnosti očitavanja o rezoluciji kamere mobilnog uređaja. Analizom je utvrđeno da uređaji opremljeni senzorima rezolucije 50 megapiksela i više postižu gotovo stopostotnu točnost (prosječne ocjene iznad 4.8) za sve kategorije jednadžbi. Visoka rezolucija senzora omogućuje ML Kit algoritmima preciznu detekciju sitnih elemenata poput eksponenata i indeksa, što je kritično za ispravnu izgradnju algebarskog stabla u Solveru.</w:t>
+      </w:r>
+    </w:p>
+    <w:p>
+      <w:r>
+        <w:t>S druge strane, uređaji s nižom rezolucijom kamere, posebno oni ispod 20 megapiksela, pokazuju značajne varijacije u preciznosti ovisno o vizualnoj kompleksnosti formule. Dok se jednostavnije jednadžbe poput Newtonovog zakona ili osnovnih linearnih izraza i dalje očitavaju s visokom pouzdanošću, točnost drastično opada kod formula koje sadrže korijene ili složene razlomke. Primjerice, kod naprednih termodinamičkih omjera prosječna ocjena preciznosti na slabijim uređajima iznosi svega 1.5, dok na uređajima visoke rezolucije ona ostaje iznad 4.4. Ovi rezultati potvrđuju opravdanost uvođenja funkcionalnosti digitalnog zumiranja i bljeskalice, koji na uređajima s prosječnim senzorima djelomično kompenziraju hardverska ograničenja povećanjem kontrasta i oštrine slike. Zaključno, integrirani OCR sustav pokazuje izvrsne rezultate u kontroliranim uvjetima na modernim uređajima, dok kod starijih modela zahtijeva aktivniju suradnju korisnika kroz korištenje ponuđenih alata za poboljšanje kvalitete snimke.</w:t>
+      </w:r>
+    </w:p>
+    <w:p>
+      <w:pPr>
+        <w:pStyle w:val="Heading3"/>
+      </w:pPr>
+      <w:r>
+        <w:t>Mjerenje vremena iscrtavanja grafa</w:t>
+      </w:r>
+    </w:p>
+    <w:p>
+      <w:r>
+        <w:t>U svrhu objektivne evaluacije performansi vizualizacijskog modula, u kôd aplikacije ugrađen je mehanizam za mjerenje vremena renderiranja grafičkih prikaza. Mjerenje obuhvaća cjelokupni proces: od trenutka pokretanja asinkronog upita nad poviješću izračuna, preko parsiranja znanstvenih zapisa varijabli i njihove pretvorbe u koordinate, pa sve do finalnog poziva funkcije za iscrtavanje na ekranu mobilnog uređaja. Rezultati mjerenja prikazani su u milisekundama kroz sustavni Logcat terminal razvojnog okruženja.</w:t>
+      </w:r>
+    </w:p>
+    <w:p>
+      <w:r>
+        <w:t xml:space="preserve">Analiza rezultata pokazuje da je vrijeme iscrtavanja grafa za standardne setove podataka, koji obuhvaćaju do pedeset točaka izračuna unutar jedne sesije, iznimno stabilno i iznosi prosječno između 15 i 45 milisekundi. Ovako brzi odziv sustava osigurava trenutačnu vizualnu povratnu informaciju korisniku, bez uočljivih zastoja u sučelju. Čak i pri korištenju logaritamske skale, koja zahtijeva dodatne matematičke transformacije nad svakom pojedinom točkom, vrijeme renderiranja ne prelazi granicu od 60 milisekundi na uređajima prosječnih hardverskih karakteristika. Ovi podaci potvrđuju visoku učinkovitost odabrane knjižnice MPAndroidChart i njezinu uspješnu integraciju s prilagođenom logikom povijesti </w:t>
+      </w:r>
+      <w:r>
+        <w:lastRenderedPageBreak/>
+        <w:t>izračuna aplikacije EquationPocket. Sustav se pokazao skalabilnim i optimiziranim za rad u stvarnom vremenu, čime su ispunjeni visoki standardi odzivnosti potrebni za modernu znanstvenu aplikaciju.</w:t>
       </w:r>
     </w:p>
     <w:p>
@@ -3278,90 +3315,56 @@
     </w:p>
     <w:p>
       <w:r>
-        <w:t xml:space="preserve">Zaključak je završni dio rada. U zaključku treba na sustavan, koncizan i jezgrovit način dati prikaz relevantnih spoznaja, informacija, činjenica i stavova koji su opširnije razrađeni u samoj razradi </w:t>
-      </w:r>
-      <w:r>
-        <w:t>z</w:t>
-      </w:r>
-      <w:r>
-        <w:t xml:space="preserve">avršnog rada. Dijelovi odnosno pasusi zaključka se </w:t>
-      </w:r>
-      <w:r>
-        <w:t xml:space="preserve">formiraju kronološki prema strukturi </w:t>
-      </w:r>
-      <w:r>
-        <w:t>z</w:t>
-      </w:r>
-      <w:r>
-        <w:t xml:space="preserve">avršnog rada. </w:t>
-      </w:r>
-    </w:p>
-    <w:p>
-      <w:pPr>
-        <w:rPr>
-          <w:u w:val="single"/>
-        </w:rPr>
-      </w:pPr>
-      <w:r>
-        <w:t xml:space="preserve">Zaključak se </w:t>
-      </w:r>
-      <w:r>
-        <w:rPr>
-          <w:u w:val="single"/>
-        </w:rPr>
-        <w:t>ne numerira.</w:t>
-      </w:r>
-    </w:p>
-    <w:p>
-      <w:pPr>
-        <w:rPr>
-          <w:u w:val="single"/>
-        </w:rPr>
-      </w:pPr>
-    </w:p>
-    <w:p>
-      <w:pPr>
-        <w:tabs>
-          <w:tab w:val="left" w:pos="840"/>
-          <w:tab w:val="left" w:pos="5040"/>
-        </w:tabs>
-      </w:pPr>
-      <w:r>
-        <w:rPr>
-          <w:b/>
-          <w:bCs/>
-        </w:rPr>
-        <w:t>Napomena:</w:t>
-      </w:r>
-      <w:r>
-        <w:t xml:space="preserve"> Na naslov </w:t>
-      </w:r>
-      <w:r>
-        <w:rPr>
-          <w:b/>
-          <w:bCs/>
-        </w:rPr>
-        <w:t>Zaključak</w:t>
-      </w:r>
-      <w:r>
-        <w:t xml:space="preserve"> primijenite stil </w:t>
-      </w:r>
-      <w:r>
-        <w:rPr>
-          <w:i/>
-          <w:iCs/>
-        </w:rPr>
-        <w:t>Heading 1</w:t>
-      </w:r>
-      <w:r>
-        <w:t>, a zatim ručno maknite brojčanu oznaku.</w:t>
-      </w:r>
-    </w:p>
-    <w:p>
-      <w:pPr>
-        <w:spacing w:before="0" w:after="0" w:line="240" w:lineRule="auto"/>
-        <w:jc w:val="left"/>
-      </w:pPr>
+        <w:t>Razvoj mobilne aplikacije EquationPocket predstavlja uspješan primjer sinergije modernih Android tehnologija i naprednih sustava za računalnu algebru. Kroz cijeli proces izrade, od analize inicijalnih korisničkih zahtjeva do finalnog testiranja na fizičkim uređajima, primarni fokus bio je na rješavanju konkretnih problema s kojima se susreću korisnici u STEM područjima.</w:t>
+      </w:r>
+    </w:p>
+    <w:p>
+      <w:pPr>
+        <w:pStyle w:val="Heading2"/>
+        <w:numPr>
+          <w:ilvl w:val="0"/>
+          <w:numId w:val="0"/>
+        </w:numPr>
+      </w:pPr>
+      <w:r>
+        <w:t>Ostvareni rezultati</w:t>
+      </w:r>
+    </w:p>
+    <w:p>
+      <w:r>
+        <w:t>Glavni cilj rada, isporuka funkcionalnog digitalnog repozitorija jednadžbi, u potpunosti je ostvaren. Implementirani sustav mapa omogućuje korisnicima intuitivnu organizaciju i brzo dohvaćanje formula, dok integrirani Symja CAS engine osigurava visoku razinu inteligencije pri rješavanju kompleksnih matematičkih problema. Poseban uspjeh postignut je u domeni unosa podataka; kombinacija prilagođene znanstvene tastature i OCR modula temeljenog na Google ML Kit tehnologiji drastično smanjuje vrijeme potrebno za digitalizaciju jednadžbi.</w:t>
+      </w:r>
+    </w:p>
+    <w:p>
+      <w:r>
+        <w:t>Testiranja su potvrdila da aplikacija stabilno rukuje rubnim slučajevima poput matematičkih nedefiniranosti i ekstremnih numeričkih raspona. Uvođenje vizualizacijskog modula s podrškom za logaritamske skale i automatskim generiranjem povijesti izračuna transformiralo je aplikaciju iz običnog kalkulatora u moćan analitički alat. Konačni doprinos rada očituje se u robusnom softverskom rješenju koje je prilagodljivo, brzo i spremno za primjenu u realnim akademskim i laboratorijskim uvjetima.</w:t>
+      </w:r>
+    </w:p>
+    <w:p>
+      <w:pPr>
+        <w:pStyle w:val="Heading2"/>
+        <w:numPr>
+          <w:ilvl w:val="0"/>
+          <w:numId w:val="0"/>
+        </w:numPr>
+      </w:pPr>
+      <w:r>
+        <w:t>Smjernice za daljnji razvoj aplikacije</w:t>
+      </w:r>
+    </w:p>
+    <w:p>
+      <w:r>
+        <w:t>I</w:t>
+      </w:r>
+      <w:r>
+        <w:t>ako EquationPocket u trenutnoj verziji pokriva sve ključne funkcionalnosti predviđene temom rada, postoji značajan prostor za buduća proširenja. Prva smjernica za daljnji razvoj je uvođenje podrške za LaTeX renderiranje unutar popisa jednadžbi, čime bi se postigao vizualni prikaz formula identičan onome u tiskanim znanstvenim radovima. Također, planira se razvoj naprednije podrške za rješavanje sustava više jednadžbi s više nepoznanica kroz jedinstveno sučelje.</w:t>
+      </w:r>
+    </w:p>
+    <w:p>
+      <w:r>
+        <w:lastRenderedPageBreak/>
+        <w:t>U pogledu kolaboracije, postojeći Base64 sustav dijeljenja mogao bi se nadograditi integracijom s uslugama u oblaku (engl. Cloud Sync), što bi korisnicima omogućilo automatsku sinkronizaciju mapa na više različitih uređaja. Daljnja optimizacija OCR algoritama korištenjem specijaliziranih neuronskih mreža za matematički rukopis mogla bi dodatno povećati preciznost očitavanja u izazovnim uvjetima. Zaključno, EquationPocket postavlja čvrste temelje za razvoj napredne digitalne platforme koja bi u budućnosti mogla postati nezaobilazan dio standardne opreme svakog znanstvenika i studenta.</w:t>
+      </w:r>
       <w:r>
         <w:br w:type="page"/>
       </w:r>
@@ -8332,7 +8335,12 @@
 </file>
 
 <file path=customXml/item2.xml><?xml version="1.0" encoding="utf-8"?>
-<b:Sources xmlns:b="http://schemas.openxmlformats.org/officeDocument/2006/bibliography" xmlns="http://schemas.openxmlformats.org/officeDocument/2006/bibliography" SelectedStyle="" StyleName=""/>
+<?mso-contentType ?>
+<FormTemplates xmlns="http://schemas.microsoft.com/sharepoint/v3/contenttype/forms">
+  <Display>DocumentLibraryForm</Display>
+  <Edit>DocumentLibraryForm</Edit>
+  <New>DocumentLibraryForm</New>
+</FormTemplates>
 </file>
 
 <file path=customXml/item3.xml><?xml version="1.0" encoding="utf-8"?>
@@ -8347,12 +8355,7 @@
 </file>
 
 <file path=customXml/item4.xml><?xml version="1.0" encoding="utf-8"?>
-<?mso-contentType ?>
-<FormTemplates xmlns="http://schemas.microsoft.com/sharepoint/v3/contenttype/forms">
-  <Display>DocumentLibraryForm</Display>
-  <Edit>DocumentLibraryForm</Edit>
-  <New>DocumentLibraryForm</New>
-</FormTemplates>
+<b:Sources xmlns:b="http://schemas.openxmlformats.org/officeDocument/2006/bibliography" xmlns="http://schemas.openxmlformats.org/officeDocument/2006/bibliography" SelectedStyle="" StyleName=""/>
 </file>
 
 <file path=customXml/itemProps1.xml><?xml version="1.0" encoding="utf-8"?>
@@ -8375,9 +8378,9 @@
 </file>
 
 <file path=customXml/itemProps2.xml><?xml version="1.0" encoding="utf-8"?>
-<ds:datastoreItem xmlns:ds="http://schemas.openxmlformats.org/officeDocument/2006/customXml" ds:itemID="{6B01A4B5-8F2F-4A9B-8EF4-01CAE8ECC50E}">
+<ds:datastoreItem xmlns:ds="http://schemas.openxmlformats.org/officeDocument/2006/customXml" ds:itemID="{4B895F2A-9BBA-40EB-8B52-6127588571FA}">
   <ds:schemaRefs>
-    <ds:schemaRef ds:uri="http://schemas.openxmlformats.org/officeDocument/2006/bibliography"/>
+    <ds:schemaRef ds:uri="http://schemas.microsoft.com/sharepoint/v3/contenttype/forms"/>
   </ds:schemaRefs>
 </ds:datastoreItem>
 </file>
@@ -8394,9 +8397,9 @@
 </file>
 
 <file path=customXml/itemProps4.xml><?xml version="1.0" encoding="utf-8"?>
-<ds:datastoreItem xmlns:ds="http://schemas.openxmlformats.org/officeDocument/2006/customXml" ds:itemID="{4B895F2A-9BBA-40EB-8B52-6127588571FA}">
+<ds:datastoreItem xmlns:ds="http://schemas.openxmlformats.org/officeDocument/2006/customXml" ds:itemID="{6B01A4B5-8F2F-4A9B-8EF4-01CAE8ECC50E}">
   <ds:schemaRefs>
-    <ds:schemaRef ds:uri="http://schemas.microsoft.com/sharepoint/v3/contenttype/forms"/>
+    <ds:schemaRef ds:uri="http://schemas.openxmlformats.org/officeDocument/2006/bibliography"/>
   </ds:schemaRefs>
 </ds:datastoreItem>
 </file>
</xml_diff>

<commit_message>
First version of thesis.
</commit_message>
<xml_diff>
--- a/Doc/Završni_rad_FilipFolnegović.docx
+++ b/Doc/Završni_rad_FilipFolnegović.docx
@@ -228,7 +228,7 @@
           <w:numId w:val="0"/>
         </w:numPr>
       </w:pPr>
-      <w:bookmarkStart w:id="0" w:name="_Toc239935710"/>
+      <w:bookmarkStart w:id="0" w:name="_Toc240038115"/>
       <w:r>
         <w:lastRenderedPageBreak/>
         <w:t>Abstract</w:t>
@@ -237,7 +237,13 @@
     </w:p>
     <w:p>
       <w:r>
-        <w:t>This final thesis describes the process of design, development, and testing of the "EquationPocket" mobile application for the Android operating system. The primary purpose of the application is to provide students and professionals in STEM fields with a centralized system for the storage, organization, and solving of mathematical and scientific equations. The thesis analyzes in detail the technical challenges of integrating a computer algebra system (CAS) within a mobile environment. The implemented solution utilizes the Symja engine for symbolic and numerical solving of complex operations such as derivatives, integrals, and limits. A key functionality of the application is the optical character recognition (OCR) module based on Google ML Kit technology, which enables automated equation input via the mobile device's camera. In addition to advanced solving, the application offers data visualization through interactive XY graphs with logarithmic scale support and an equation-sharing system using encoded text records. The result of the work is a functional software solution that modernizes the approach to applying scientific formulas and facilitates daily calculations in an academic setting.</w:t>
+        <w:t xml:space="preserve">This final thesis describes the process of design, development, and testing of the "EquationPocket" mobile application for the Android operating system. The primary purpose of the application is to provide students and professionals in STEM fields with a centralized system for the storage, organization, and solving of mathematical and scientific equations. The thesis analyzes in detail the technical challenges of integrating a computer algebra system (CAS) within a mobile environment. The implemented solution utilizes the Symja engine for symbolic and numerical solving of complex operations such as derivatives, integrals, and </w:t>
+      </w:r>
+      <w:r>
+        <w:t>limits.</w:t>
+      </w:r>
+      <w:r>
+        <w:t xml:space="preserve"> A key functionality of the application is the optical character recognition (OCR) module based on Google ML Kit technology, which enables automated equation input via the mobile device's camera. In addition to advanced solving, the application offers data visualization through interactive XY graphs with logarithmic scale support and an equation-sharing system using encoded text records. The result of the work is a functional software solution that modernizes the approach to applying scientific formulas and facilitates daily calculations in an academic setting.</w:t>
       </w:r>
     </w:p>
     <w:p>
@@ -285,7 +291,7 @@
         </w:rPr>
       </w:pPr>
       <w:bookmarkStart w:id="1" w:name="_Toc161651753"/>
-      <w:bookmarkStart w:id="2" w:name="_Toc239935711"/>
+      <w:bookmarkStart w:id="2" w:name="_Toc240038116"/>
       <w:r>
         <w:lastRenderedPageBreak/>
         <w:t>Sadržaj</w:t>
@@ -313,7 +319,7 @@
       <w:r>
         <w:fldChar w:fldCharType="separate"/>
       </w:r>
-      <w:hyperlink w:anchor="_Toc239935710" w:history="1">
+      <w:hyperlink w:anchor="_Toc240038115" w:history="1">
         <w:r>
           <w:rPr>
             <w:rStyle w:val="Hyperlink"/>
@@ -340,7 +346,7 @@
             <w:noProof/>
             <w:webHidden/>
           </w:rPr>
-          <w:instrText xml:space="preserve"> PAGEREF _Toc239935710 \h </w:instrText>
+          <w:instrText xml:space="preserve"> PAGEREF _Toc240038115 \h </w:instrText>
         </w:r>
         <w:r>
           <w:rPr>
@@ -382,7 +388,7 @@
           <w14:ligatures w14:val="standardContextual"/>
         </w:rPr>
       </w:pPr>
-      <w:hyperlink w:anchor="_Toc239935711" w:history="1">
+      <w:hyperlink w:anchor="_Toc240038116" w:history="1">
         <w:r>
           <w:rPr>
             <w:rStyle w:val="Hyperlink"/>
@@ -409,7 +415,7 @@
             <w:noProof/>
             <w:webHidden/>
           </w:rPr>
-          <w:instrText xml:space="preserve"> PAGEREF _Toc239935711 \h </w:instrText>
+          <w:instrText xml:space="preserve"> PAGEREF _Toc240038116 \h </w:instrText>
         </w:r>
         <w:r>
           <w:rPr>
@@ -451,7 +457,7 @@
           <w14:ligatures w14:val="standardContextual"/>
         </w:rPr>
       </w:pPr>
-      <w:hyperlink w:anchor="_Toc239935712" w:history="1">
+      <w:hyperlink w:anchor="_Toc240038117" w:history="1">
         <w:r>
           <w:rPr>
             <w:rStyle w:val="Hyperlink"/>
@@ -495,7 +501,7 @@
             <w:noProof/>
             <w:webHidden/>
           </w:rPr>
-          <w:instrText xml:space="preserve"> PAGEREF _Toc239935712 \h </w:instrText>
+          <w:instrText xml:space="preserve"> PAGEREF _Toc240038117 \h </w:instrText>
         </w:r>
         <w:r>
           <w:rPr>
@@ -515,7 +521,7 @@
             <w:noProof/>
             <w:webHidden/>
           </w:rPr>
-          <w:t>1</w:t>
+          <w:t>3</w:t>
         </w:r>
         <w:r>
           <w:rPr>
@@ -541,7 +547,7 @@
           <w14:ligatures w14:val="standardContextual"/>
         </w:rPr>
       </w:pPr>
-      <w:hyperlink w:anchor="_Toc239935713" w:history="1">
+      <w:hyperlink w:anchor="_Toc240038118" w:history="1">
         <w:r>
           <w:rPr>
             <w:rStyle w:val="Hyperlink"/>
@@ -585,7 +591,7 @@
             <w:noProof/>
             <w:webHidden/>
           </w:rPr>
-          <w:instrText xml:space="preserve"> PAGEREF _Toc239935713 \h </w:instrText>
+          <w:instrText xml:space="preserve"> PAGEREF _Toc240038118 \h </w:instrText>
         </w:r>
         <w:r>
           <w:rPr>
@@ -605,7 +611,7 @@
             <w:noProof/>
             <w:webHidden/>
           </w:rPr>
-          <w:t>1</w:t>
+          <w:t>3</w:t>
         </w:r>
         <w:r>
           <w:rPr>
@@ -631,7 +637,7 @@
           <w14:ligatures w14:val="standardContextual"/>
         </w:rPr>
       </w:pPr>
-      <w:hyperlink w:anchor="_Toc239935714" w:history="1">
+      <w:hyperlink w:anchor="_Toc240038119" w:history="1">
         <w:r>
           <w:rPr>
             <w:rStyle w:val="Hyperlink"/>
@@ -675,7 +681,7 @@
             <w:noProof/>
             <w:webHidden/>
           </w:rPr>
-          <w:instrText xml:space="preserve"> PAGEREF _Toc239935714 \h </w:instrText>
+          <w:instrText xml:space="preserve"> PAGEREF _Toc240038119 \h </w:instrText>
         </w:r>
         <w:r>
           <w:rPr>
@@ -695,7 +701,7 @@
             <w:noProof/>
             <w:webHidden/>
           </w:rPr>
-          <w:t>1</w:t>
+          <w:t>3</w:t>
         </w:r>
         <w:r>
           <w:rPr>
@@ -717,7 +723,7 @@
           <w14:ligatures w14:val="standardContextual"/>
         </w:rPr>
       </w:pPr>
-      <w:hyperlink w:anchor="_Toc239935715" w:history="1">
+      <w:hyperlink w:anchor="_Toc240038120" w:history="1">
         <w:r>
           <w:rPr>
             <w:rStyle w:val="Hyperlink"/>
@@ -761,7 +767,7 @@
             <w:noProof/>
             <w:webHidden/>
           </w:rPr>
-          <w:instrText xml:space="preserve"> PAGEREF _Toc239935715 \h </w:instrText>
+          <w:instrText xml:space="preserve"> PAGEREF _Toc240038120 \h </w:instrText>
         </w:r>
         <w:r>
           <w:rPr>
@@ -781,7 +787,7 @@
             <w:noProof/>
             <w:webHidden/>
           </w:rPr>
-          <w:t>2</w:t>
+          <w:t>4</w:t>
         </w:r>
         <w:r>
           <w:rPr>
@@ -807,7 +813,7 @@
           <w14:ligatures w14:val="standardContextual"/>
         </w:rPr>
       </w:pPr>
-      <w:hyperlink w:anchor="_Toc239935716" w:history="1">
+      <w:hyperlink w:anchor="_Toc240038121" w:history="1">
         <w:r>
           <w:rPr>
             <w:rStyle w:val="Hyperlink"/>
@@ -851,7 +857,7 @@
             <w:noProof/>
             <w:webHidden/>
           </w:rPr>
-          <w:instrText xml:space="preserve"> PAGEREF _Toc239935716 \h </w:instrText>
+          <w:instrText xml:space="preserve"> PAGEREF _Toc240038121 \h </w:instrText>
         </w:r>
         <w:r>
           <w:rPr>
@@ -871,7 +877,7 @@
             <w:noProof/>
             <w:webHidden/>
           </w:rPr>
-          <w:t>2</w:t>
+          <w:t>4</w:t>
         </w:r>
         <w:r>
           <w:rPr>
@@ -897,7 +903,7 @@
           <w14:ligatures w14:val="standardContextual"/>
         </w:rPr>
       </w:pPr>
-      <w:hyperlink w:anchor="_Toc239935717" w:history="1">
+      <w:hyperlink w:anchor="_Toc240038122" w:history="1">
         <w:r>
           <w:rPr>
             <w:rStyle w:val="Hyperlink"/>
@@ -941,7 +947,7 @@
             <w:noProof/>
             <w:webHidden/>
           </w:rPr>
-          <w:instrText xml:space="preserve"> PAGEREF _Toc239935717 \h </w:instrText>
+          <w:instrText xml:space="preserve"> PAGEREF _Toc240038122 \h </w:instrText>
         </w:r>
         <w:r>
           <w:rPr>
@@ -961,7 +967,7 @@
             <w:noProof/>
             <w:webHidden/>
           </w:rPr>
-          <w:t>3</w:t>
+          <w:t>5</w:t>
         </w:r>
         <w:r>
           <w:rPr>
@@ -983,7 +989,7 @@
           <w14:ligatures w14:val="standardContextual"/>
         </w:rPr>
       </w:pPr>
-      <w:hyperlink w:anchor="_Toc239935718" w:history="1">
+      <w:hyperlink w:anchor="_Toc240038123" w:history="1">
         <w:r>
           <w:rPr>
             <w:rStyle w:val="Hyperlink"/>
@@ -1027,7 +1033,7 @@
             <w:noProof/>
             <w:webHidden/>
           </w:rPr>
-          <w:instrText xml:space="preserve"> PAGEREF _Toc239935718 \h </w:instrText>
+          <w:instrText xml:space="preserve"> PAGEREF _Toc240038123 \h </w:instrText>
         </w:r>
         <w:r>
           <w:rPr>
@@ -1047,7 +1053,7 @@
             <w:noProof/>
             <w:webHidden/>
           </w:rPr>
-          <w:t>4</w:t>
+          <w:t>6</w:t>
         </w:r>
         <w:r>
           <w:rPr>
@@ -1073,7 +1079,7 @@
           <w14:ligatures w14:val="standardContextual"/>
         </w:rPr>
       </w:pPr>
-      <w:hyperlink w:anchor="_Toc239935719" w:history="1">
+      <w:hyperlink w:anchor="_Toc240038124" w:history="1">
         <w:r>
           <w:rPr>
             <w:rStyle w:val="Hyperlink"/>
@@ -1117,7 +1123,7 @@
             <w:noProof/>
             <w:webHidden/>
           </w:rPr>
-          <w:instrText xml:space="preserve"> PAGEREF _Toc239935719 \h </w:instrText>
+          <w:instrText xml:space="preserve"> PAGEREF _Toc240038124 \h </w:instrText>
         </w:r>
         <w:r>
           <w:rPr>
@@ -1137,7 +1143,7 @@
             <w:noProof/>
             <w:webHidden/>
           </w:rPr>
-          <w:t>4</w:t>
+          <w:t>6</w:t>
         </w:r>
         <w:r>
           <w:rPr>
@@ -1163,7 +1169,7 @@
           <w14:ligatures w14:val="standardContextual"/>
         </w:rPr>
       </w:pPr>
-      <w:hyperlink w:anchor="_Toc239935720" w:history="1">
+      <w:hyperlink w:anchor="_Toc240038125" w:history="1">
         <w:r>
           <w:rPr>
             <w:rStyle w:val="Hyperlink"/>
@@ -1207,7 +1213,7 @@
             <w:noProof/>
             <w:webHidden/>
           </w:rPr>
-          <w:instrText xml:space="preserve"> PAGEREF _Toc239935720 \h </w:instrText>
+          <w:instrText xml:space="preserve"> PAGEREF _Toc240038125 \h </w:instrText>
         </w:r>
         <w:r>
           <w:rPr>
@@ -1227,7 +1233,7 @@
             <w:noProof/>
             <w:webHidden/>
           </w:rPr>
-          <w:t>4</w:t>
+          <w:t>6</w:t>
         </w:r>
         <w:r>
           <w:rPr>
@@ -1253,7 +1259,7 @@
           <w14:ligatures w14:val="standardContextual"/>
         </w:rPr>
       </w:pPr>
-      <w:hyperlink w:anchor="_Toc239935721" w:history="1">
+      <w:hyperlink w:anchor="_Toc240038126" w:history="1">
         <w:r>
           <w:rPr>
             <w:rStyle w:val="Hyperlink"/>
@@ -1297,7 +1303,7 @@
             <w:noProof/>
             <w:webHidden/>
           </w:rPr>
-          <w:instrText xml:space="preserve"> PAGEREF _Toc239935721 \h </w:instrText>
+          <w:instrText xml:space="preserve"> PAGEREF _Toc240038126 \h </w:instrText>
         </w:r>
         <w:r>
           <w:rPr>
@@ -1317,7 +1323,7 @@
             <w:noProof/>
             <w:webHidden/>
           </w:rPr>
-          <w:t>5</w:t>
+          <w:t>7</w:t>
         </w:r>
         <w:r>
           <w:rPr>
@@ -1343,7 +1349,7 @@
           <w14:ligatures w14:val="standardContextual"/>
         </w:rPr>
       </w:pPr>
-      <w:hyperlink w:anchor="_Toc239935722" w:history="1">
+      <w:hyperlink w:anchor="_Toc240038127" w:history="1">
         <w:r>
           <w:rPr>
             <w:rStyle w:val="Hyperlink"/>
@@ -1387,7 +1393,7 @@
             <w:noProof/>
             <w:webHidden/>
           </w:rPr>
-          <w:instrText xml:space="preserve"> PAGEREF _Toc239935722 \h </w:instrText>
+          <w:instrText xml:space="preserve"> PAGEREF _Toc240038127 \h </w:instrText>
         </w:r>
         <w:r>
           <w:rPr>
@@ -1407,7 +1413,7 @@
             <w:noProof/>
             <w:webHidden/>
           </w:rPr>
-          <w:t>6</w:t>
+          <w:t>8</w:t>
         </w:r>
         <w:r>
           <w:rPr>
@@ -1429,7 +1435,7 @@
           <w14:ligatures w14:val="standardContextual"/>
         </w:rPr>
       </w:pPr>
-      <w:hyperlink w:anchor="_Toc239935723" w:history="1">
+      <w:hyperlink w:anchor="_Toc240038128" w:history="1">
         <w:r>
           <w:rPr>
             <w:rStyle w:val="Hyperlink"/>
@@ -1473,7 +1479,7 @@
             <w:noProof/>
             <w:webHidden/>
           </w:rPr>
-          <w:instrText xml:space="preserve"> PAGEREF _Toc239935723 \h </w:instrText>
+          <w:instrText xml:space="preserve"> PAGEREF _Toc240038128 \h </w:instrText>
         </w:r>
         <w:r>
           <w:rPr>
@@ -1493,7 +1499,7 @@
             <w:noProof/>
             <w:webHidden/>
           </w:rPr>
-          <w:t>7</w:t>
+          <w:t>9</w:t>
         </w:r>
         <w:r>
           <w:rPr>
@@ -1519,7 +1525,7 @@
           <w14:ligatures w14:val="standardContextual"/>
         </w:rPr>
       </w:pPr>
-      <w:hyperlink w:anchor="_Toc239935724" w:history="1">
+      <w:hyperlink w:anchor="_Toc240038129" w:history="1">
         <w:r>
           <w:rPr>
             <w:rStyle w:val="Hyperlink"/>
@@ -1563,7 +1569,7 @@
             <w:noProof/>
             <w:webHidden/>
           </w:rPr>
-          <w:instrText xml:space="preserve"> PAGEREF _Toc239935724 \h </w:instrText>
+          <w:instrText xml:space="preserve"> PAGEREF _Toc240038129 \h </w:instrText>
         </w:r>
         <w:r>
           <w:rPr>
@@ -1583,7 +1589,7 @@
             <w:noProof/>
             <w:webHidden/>
           </w:rPr>
-          <w:t>7</w:t>
+          <w:t>9</w:t>
         </w:r>
         <w:r>
           <w:rPr>
@@ -1609,7 +1615,7 @@
           <w14:ligatures w14:val="standardContextual"/>
         </w:rPr>
       </w:pPr>
-      <w:hyperlink w:anchor="_Toc239935725" w:history="1">
+      <w:hyperlink w:anchor="_Toc240038130" w:history="1">
         <w:r>
           <w:rPr>
             <w:rStyle w:val="Hyperlink"/>
@@ -1653,7 +1659,7 @@
             <w:noProof/>
             <w:webHidden/>
           </w:rPr>
-          <w:instrText xml:space="preserve"> PAGEREF _Toc239935725 \h </w:instrText>
+          <w:instrText xml:space="preserve"> PAGEREF _Toc240038130 \h </w:instrText>
         </w:r>
         <w:r>
           <w:rPr>
@@ -1673,7 +1679,7 @@
             <w:noProof/>
             <w:webHidden/>
           </w:rPr>
-          <w:t>7</w:t>
+          <w:t>9</w:t>
         </w:r>
         <w:r>
           <w:rPr>
@@ -1699,7 +1705,7 @@
           <w14:ligatures w14:val="standardContextual"/>
         </w:rPr>
       </w:pPr>
-      <w:hyperlink w:anchor="_Toc239935726" w:history="1">
+      <w:hyperlink w:anchor="_Toc240038131" w:history="1">
         <w:r>
           <w:rPr>
             <w:rStyle w:val="Hyperlink"/>
@@ -1743,7 +1749,7 @@
             <w:noProof/>
             <w:webHidden/>
           </w:rPr>
-          <w:instrText xml:space="preserve"> PAGEREF _Toc239935726 \h </w:instrText>
+          <w:instrText xml:space="preserve"> PAGEREF _Toc240038131 \h </w:instrText>
         </w:r>
         <w:r>
           <w:rPr>
@@ -1763,7 +1769,7 @@
             <w:noProof/>
             <w:webHidden/>
           </w:rPr>
-          <w:t>8</w:t>
+          <w:t>10</w:t>
         </w:r>
         <w:r>
           <w:rPr>
@@ -1785,7 +1791,7 @@
           <w14:ligatures w14:val="standardContextual"/>
         </w:rPr>
       </w:pPr>
-      <w:hyperlink w:anchor="_Toc239935727" w:history="1">
+      <w:hyperlink w:anchor="_Toc240038132" w:history="1">
         <w:r>
           <w:rPr>
             <w:rStyle w:val="Hyperlink"/>
@@ -1829,7 +1835,7 @@
             <w:noProof/>
             <w:webHidden/>
           </w:rPr>
-          <w:instrText xml:space="preserve"> PAGEREF _Toc239935727 \h </w:instrText>
+          <w:instrText xml:space="preserve"> PAGEREF _Toc240038132 \h </w:instrText>
         </w:r>
         <w:r>
           <w:rPr>
@@ -1849,7 +1855,7 @@
             <w:noProof/>
             <w:webHidden/>
           </w:rPr>
-          <w:t>9</w:t>
+          <w:t>11</w:t>
         </w:r>
         <w:r>
           <w:rPr>
@@ -1875,7 +1881,7 @@
           <w14:ligatures w14:val="standardContextual"/>
         </w:rPr>
       </w:pPr>
-      <w:hyperlink w:anchor="_Toc239935728" w:history="1">
+      <w:hyperlink w:anchor="_Toc240038133" w:history="1">
         <w:r>
           <w:rPr>
             <w:rStyle w:val="Hyperlink"/>
@@ -1919,7 +1925,7 @@
             <w:noProof/>
             <w:webHidden/>
           </w:rPr>
-          <w:instrText xml:space="preserve"> PAGEREF _Toc239935728 \h </w:instrText>
+          <w:instrText xml:space="preserve"> PAGEREF _Toc240038133 \h </w:instrText>
         </w:r>
         <w:r>
           <w:rPr>
@@ -1939,7 +1945,7 @@
             <w:noProof/>
             <w:webHidden/>
           </w:rPr>
-          <w:t>9</w:t>
+          <w:t>11</w:t>
         </w:r>
         <w:r>
           <w:rPr>
@@ -1965,7 +1971,7 @@
           <w14:ligatures w14:val="standardContextual"/>
         </w:rPr>
       </w:pPr>
-      <w:hyperlink w:anchor="_Toc239935729" w:history="1">
+      <w:hyperlink w:anchor="_Toc240038134" w:history="1">
         <w:r>
           <w:rPr>
             <w:rStyle w:val="Hyperlink"/>
@@ -2009,7 +2015,7 @@
             <w:noProof/>
             <w:webHidden/>
           </w:rPr>
-          <w:instrText xml:space="preserve"> PAGEREF _Toc239935729 \h </w:instrText>
+          <w:instrText xml:space="preserve"> PAGEREF _Toc240038134 \h </w:instrText>
         </w:r>
         <w:r>
           <w:rPr>
@@ -2029,7 +2035,7 @@
             <w:noProof/>
             <w:webHidden/>
           </w:rPr>
-          <w:t>12</w:t>
+          <w:t>14</w:t>
         </w:r>
         <w:r>
           <w:rPr>
@@ -2055,7 +2061,7 @@
           <w14:ligatures w14:val="standardContextual"/>
         </w:rPr>
       </w:pPr>
-      <w:hyperlink w:anchor="_Toc239935730" w:history="1">
+      <w:hyperlink w:anchor="_Toc240038135" w:history="1">
         <w:r>
           <w:rPr>
             <w:rStyle w:val="Hyperlink"/>
@@ -2099,7 +2105,7 @@
             <w:noProof/>
             <w:webHidden/>
           </w:rPr>
-          <w:instrText xml:space="preserve"> PAGEREF _Toc239935730 \h </w:instrText>
+          <w:instrText xml:space="preserve"> PAGEREF _Toc240038135 \h </w:instrText>
         </w:r>
         <w:r>
           <w:rPr>
@@ -2119,7 +2125,7 @@
             <w:noProof/>
             <w:webHidden/>
           </w:rPr>
-          <w:t>14</w:t>
+          <w:t>16</w:t>
         </w:r>
         <w:r>
           <w:rPr>
@@ -2145,7 +2151,7 @@
           <w14:ligatures w14:val="standardContextual"/>
         </w:rPr>
       </w:pPr>
-      <w:hyperlink w:anchor="_Toc239935731" w:history="1">
+      <w:hyperlink w:anchor="_Toc240038136" w:history="1">
         <w:r>
           <w:rPr>
             <w:rStyle w:val="Hyperlink"/>
@@ -2189,7 +2195,7 @@
             <w:noProof/>
             <w:webHidden/>
           </w:rPr>
-          <w:instrText xml:space="preserve"> PAGEREF _Toc239935731 \h </w:instrText>
+          <w:instrText xml:space="preserve"> PAGEREF _Toc240038136 \h </w:instrText>
         </w:r>
         <w:r>
           <w:rPr>
@@ -2209,7 +2215,7 @@
             <w:noProof/>
             <w:webHidden/>
           </w:rPr>
-          <w:t>18</w:t>
+          <w:t>20</w:t>
         </w:r>
         <w:r>
           <w:rPr>
@@ -2235,7 +2241,7 @@
           <w14:ligatures w14:val="standardContextual"/>
         </w:rPr>
       </w:pPr>
-      <w:hyperlink w:anchor="_Toc239935732" w:history="1">
+      <w:hyperlink w:anchor="_Toc240038137" w:history="1">
         <w:r>
           <w:rPr>
             <w:rStyle w:val="Hyperlink"/>
@@ -2279,7 +2285,7 @@
             <w:noProof/>
             <w:webHidden/>
           </w:rPr>
-          <w:instrText xml:space="preserve"> PAGEREF _Toc239935732 \h </w:instrText>
+          <w:instrText xml:space="preserve"> PAGEREF _Toc240038137 \h </w:instrText>
         </w:r>
         <w:r>
           <w:rPr>
@@ -2299,7 +2305,7 @@
             <w:noProof/>
             <w:webHidden/>
           </w:rPr>
-          <w:t>20</w:t>
+          <w:t>22</w:t>
         </w:r>
         <w:r>
           <w:rPr>
@@ -2325,7 +2331,7 @@
           <w14:ligatures w14:val="standardContextual"/>
         </w:rPr>
       </w:pPr>
-      <w:hyperlink w:anchor="_Toc239935733" w:history="1">
+      <w:hyperlink w:anchor="_Toc240038138" w:history="1">
         <w:r>
           <w:rPr>
             <w:rStyle w:val="Hyperlink"/>
@@ -2369,7 +2375,7 @@
             <w:noProof/>
             <w:webHidden/>
           </w:rPr>
-          <w:instrText xml:space="preserve"> PAGEREF _Toc239935733 \h </w:instrText>
+          <w:instrText xml:space="preserve"> PAGEREF _Toc240038138 \h </w:instrText>
         </w:r>
         <w:r>
           <w:rPr>
@@ -2389,7 +2395,7 @@
             <w:noProof/>
             <w:webHidden/>
           </w:rPr>
-          <w:t>25</w:t>
+          <w:t>28</w:t>
         </w:r>
         <w:r>
           <w:rPr>
@@ -2415,7 +2421,7 @@
           <w14:ligatures w14:val="standardContextual"/>
         </w:rPr>
       </w:pPr>
-      <w:hyperlink w:anchor="_Toc239935734" w:history="1">
+      <w:hyperlink w:anchor="_Toc240038139" w:history="1">
         <w:r>
           <w:rPr>
             <w:rStyle w:val="Hyperlink"/>
@@ -2459,7 +2465,7 @@
             <w:noProof/>
             <w:webHidden/>
           </w:rPr>
-          <w:instrText xml:space="preserve"> PAGEREF _Toc239935734 \h </w:instrText>
+          <w:instrText xml:space="preserve"> PAGEREF _Toc240038139 \h </w:instrText>
         </w:r>
         <w:r>
           <w:rPr>
@@ -2479,7 +2485,7 @@
             <w:noProof/>
             <w:webHidden/>
           </w:rPr>
-          <w:t>29</w:t>
+          <w:t>31</w:t>
         </w:r>
         <w:r>
           <w:rPr>
@@ -2505,7 +2511,7 @@
           <w14:ligatures w14:val="standardContextual"/>
         </w:rPr>
       </w:pPr>
-      <w:hyperlink w:anchor="_Toc239935735" w:history="1">
+      <w:hyperlink w:anchor="_Toc240038140" w:history="1">
         <w:r>
           <w:rPr>
             <w:rStyle w:val="Hyperlink"/>
@@ -2549,7 +2555,7 @@
             <w:noProof/>
             <w:webHidden/>
           </w:rPr>
-          <w:instrText xml:space="preserve"> PAGEREF _Toc239935735 \h </w:instrText>
+          <w:instrText xml:space="preserve"> PAGEREF _Toc240038140 \h </w:instrText>
         </w:r>
         <w:r>
           <w:rPr>
@@ -2569,7 +2575,7 @@
             <w:noProof/>
             <w:webHidden/>
           </w:rPr>
-          <w:t>30</w:t>
+          <w:t>32</w:t>
         </w:r>
         <w:r>
           <w:rPr>
@@ -2591,7 +2597,7 @@
           <w14:ligatures w14:val="standardContextual"/>
         </w:rPr>
       </w:pPr>
-      <w:hyperlink w:anchor="_Toc239935736" w:history="1">
+      <w:hyperlink w:anchor="_Toc240038141" w:history="1">
         <w:r>
           <w:rPr>
             <w:rStyle w:val="Hyperlink"/>
@@ -2635,7 +2641,7 @@
             <w:noProof/>
             <w:webHidden/>
           </w:rPr>
-          <w:instrText xml:space="preserve"> PAGEREF _Toc239935736 \h </w:instrText>
+          <w:instrText xml:space="preserve"> PAGEREF _Toc240038141 \h </w:instrText>
         </w:r>
         <w:r>
           <w:rPr>
@@ -2655,7 +2661,7 @@
             <w:noProof/>
             <w:webHidden/>
           </w:rPr>
-          <w:t>33</w:t>
+          <w:t>35</w:t>
         </w:r>
         <w:r>
           <w:rPr>
@@ -2681,7 +2687,7 @@
           <w14:ligatures w14:val="standardContextual"/>
         </w:rPr>
       </w:pPr>
-      <w:hyperlink w:anchor="_Toc239935737" w:history="1">
+      <w:hyperlink w:anchor="_Toc240038142" w:history="1">
         <w:r>
           <w:rPr>
             <w:rStyle w:val="Hyperlink"/>
@@ -2725,7 +2731,7 @@
             <w:noProof/>
             <w:webHidden/>
           </w:rPr>
-          <w:instrText xml:space="preserve"> PAGEREF _Toc239935737 \h </w:instrText>
+          <w:instrText xml:space="preserve"> PAGEREF _Toc240038142 \h </w:instrText>
         </w:r>
         <w:r>
           <w:rPr>
@@ -2745,7 +2751,7 @@
             <w:noProof/>
             <w:webHidden/>
           </w:rPr>
-          <w:t>33</w:t>
+          <w:t>35</w:t>
         </w:r>
         <w:r>
           <w:rPr>
@@ -2771,7 +2777,7 @@
           <w14:ligatures w14:val="standardContextual"/>
         </w:rPr>
       </w:pPr>
-      <w:hyperlink w:anchor="_Toc239935738" w:history="1">
+      <w:hyperlink w:anchor="_Toc240038143" w:history="1">
         <w:r>
           <w:rPr>
             <w:rStyle w:val="Hyperlink"/>
@@ -2815,7 +2821,7 @@
             <w:noProof/>
             <w:webHidden/>
           </w:rPr>
-          <w:instrText xml:space="preserve"> PAGEREF _Toc239935738 \h </w:instrText>
+          <w:instrText xml:space="preserve"> PAGEREF _Toc240038143 \h </w:instrText>
         </w:r>
         <w:r>
           <w:rPr>
@@ -2835,7 +2841,7 @@
             <w:noProof/>
             <w:webHidden/>
           </w:rPr>
-          <w:t>33</w:t>
+          <w:t>35</w:t>
         </w:r>
         <w:r>
           <w:rPr>
@@ -2861,7 +2867,7 @@
           <w14:ligatures w14:val="standardContextual"/>
         </w:rPr>
       </w:pPr>
-      <w:hyperlink w:anchor="_Toc239935739" w:history="1">
+      <w:hyperlink w:anchor="_Toc240038144" w:history="1">
         <w:r>
           <w:rPr>
             <w:rStyle w:val="Hyperlink"/>
@@ -2905,7 +2911,7 @@
             <w:noProof/>
             <w:webHidden/>
           </w:rPr>
-          <w:instrText xml:space="preserve"> PAGEREF _Toc239935739 \h </w:instrText>
+          <w:instrText xml:space="preserve"> PAGEREF _Toc240038144 \h </w:instrText>
         </w:r>
         <w:r>
           <w:rPr>
@@ -2925,7 +2931,7 @@
             <w:noProof/>
             <w:webHidden/>
           </w:rPr>
-          <w:t>35</w:t>
+          <w:t>37</w:t>
         </w:r>
         <w:r>
           <w:rPr>
@@ -2951,7 +2957,7 @@
           <w14:ligatures w14:val="standardContextual"/>
         </w:rPr>
       </w:pPr>
-      <w:hyperlink w:anchor="_Toc239935740" w:history="1">
+      <w:hyperlink w:anchor="_Toc240038145" w:history="1">
         <w:r>
           <w:rPr>
             <w:rStyle w:val="Hyperlink"/>
@@ -2995,7 +3001,7 @@
             <w:noProof/>
             <w:webHidden/>
           </w:rPr>
-          <w:instrText xml:space="preserve"> PAGEREF _Toc239935740 \h </w:instrText>
+          <w:instrText xml:space="preserve"> PAGEREF _Toc240038145 \h </w:instrText>
         </w:r>
         <w:r>
           <w:rPr>
@@ -3015,7 +3021,7 @@
             <w:noProof/>
             <w:webHidden/>
           </w:rPr>
-          <w:t>36</w:t>
+          <w:t>38</w:t>
         </w:r>
         <w:r>
           <w:rPr>
@@ -3041,7 +3047,7 @@
           <w14:ligatures w14:val="standardContextual"/>
         </w:rPr>
       </w:pPr>
-      <w:hyperlink w:anchor="_Toc239935741" w:history="1">
+      <w:hyperlink w:anchor="_Toc240038146" w:history="1">
         <w:r>
           <w:rPr>
             <w:rStyle w:val="Hyperlink"/>
@@ -3085,7 +3091,7 @@
             <w:noProof/>
             <w:webHidden/>
           </w:rPr>
-          <w:instrText xml:space="preserve"> PAGEREF _Toc239935741 \h </w:instrText>
+          <w:instrText xml:space="preserve"> PAGEREF _Toc240038146 \h </w:instrText>
         </w:r>
         <w:r>
           <w:rPr>
@@ -3105,7 +3111,7 @@
             <w:noProof/>
             <w:webHidden/>
           </w:rPr>
-          <w:t>36</w:t>
+          <w:t>38</w:t>
         </w:r>
         <w:r>
           <w:rPr>
@@ -3131,7 +3137,7 @@
           <w14:ligatures w14:val="standardContextual"/>
         </w:rPr>
       </w:pPr>
-      <w:hyperlink w:anchor="_Toc239935742" w:history="1">
+      <w:hyperlink w:anchor="_Toc240038147" w:history="1">
         <w:r>
           <w:rPr>
             <w:rStyle w:val="Hyperlink"/>
@@ -3175,7 +3181,7 @@
             <w:noProof/>
             <w:webHidden/>
           </w:rPr>
-          <w:instrText xml:space="preserve"> PAGEREF _Toc239935742 \h </w:instrText>
+          <w:instrText xml:space="preserve"> PAGEREF _Toc240038147 \h </w:instrText>
         </w:r>
         <w:r>
           <w:rPr>
@@ -3195,7 +3201,7 @@
             <w:noProof/>
             <w:webHidden/>
           </w:rPr>
-          <w:t>37</w:t>
+          <w:t>39</w:t>
         </w:r>
         <w:r>
           <w:rPr>
@@ -3217,7 +3223,7 @@
           <w14:ligatures w14:val="standardContextual"/>
         </w:rPr>
       </w:pPr>
-      <w:hyperlink w:anchor="_Toc239935743" w:history="1">
+      <w:hyperlink w:anchor="_Toc240038148" w:history="1">
         <w:r>
           <w:rPr>
             <w:rStyle w:val="Hyperlink"/>
@@ -3244,7 +3250,7 @@
             <w:noProof/>
             <w:webHidden/>
           </w:rPr>
-          <w:instrText xml:space="preserve"> PAGEREF _Toc239935743 \h </w:instrText>
+          <w:instrText xml:space="preserve"> PAGEREF _Toc240038148 \h </w:instrText>
         </w:r>
         <w:r>
           <w:rPr>
@@ -3264,7 +3270,7 @@
             <w:noProof/>
             <w:webHidden/>
           </w:rPr>
-          <w:t>39</w:t>
+          <w:t>41</w:t>
         </w:r>
         <w:r>
           <w:rPr>
@@ -3289,7 +3295,7 @@
           <w14:ligatures w14:val="standardContextual"/>
         </w:rPr>
       </w:pPr>
-      <w:hyperlink w:anchor="_Toc239935744" w:history="1">
+      <w:hyperlink w:anchor="_Toc240038149" w:history="1">
         <w:r>
           <w:rPr>
             <w:rStyle w:val="Hyperlink"/>
@@ -3316,7 +3322,7 @@
             <w:noProof/>
             <w:webHidden/>
           </w:rPr>
-          <w:instrText xml:space="preserve"> PAGEREF _Toc239935744 \h </w:instrText>
+          <w:instrText xml:space="preserve"> PAGEREF _Toc240038149 \h </w:instrText>
         </w:r>
         <w:r>
           <w:rPr>
@@ -3336,7 +3342,7 @@
             <w:noProof/>
             <w:webHidden/>
           </w:rPr>
-          <w:t>39</w:t>
+          <w:t>41</w:t>
         </w:r>
         <w:r>
           <w:rPr>
@@ -3361,7 +3367,7 @@
           <w14:ligatures w14:val="standardContextual"/>
         </w:rPr>
       </w:pPr>
-      <w:hyperlink w:anchor="_Toc239935745" w:history="1">
+      <w:hyperlink w:anchor="_Toc240038150" w:history="1">
         <w:r>
           <w:rPr>
             <w:rStyle w:val="Hyperlink"/>
@@ -3388,7 +3394,7 @@
             <w:noProof/>
             <w:webHidden/>
           </w:rPr>
-          <w:instrText xml:space="preserve"> PAGEREF _Toc239935745 \h </w:instrText>
+          <w:instrText xml:space="preserve"> PAGEREF _Toc240038150 \h </w:instrText>
         </w:r>
         <w:r>
           <w:rPr>
@@ -3408,7 +3414,7 @@
             <w:noProof/>
             <w:webHidden/>
           </w:rPr>
-          <w:t>39</w:t>
+          <w:t>41</w:t>
         </w:r>
         <w:r>
           <w:rPr>
@@ -3430,13 +3436,13 @@
           <w14:ligatures w14:val="standardContextual"/>
         </w:rPr>
       </w:pPr>
-      <w:hyperlink w:anchor="_Toc239935746" w:history="1">
+      <w:hyperlink w:anchor="_Toc240038151" w:history="1">
         <w:r>
           <w:rPr>
             <w:rStyle w:val="Hyperlink"/>
             <w:noProof/>
           </w:rPr>
-          <w:t>Popis kratica</w:t>
+          <w:t>Popis slika</w:t>
         </w:r>
         <w:r>
           <w:rPr>
@@ -3457,7 +3463,7 @@
             <w:noProof/>
             <w:webHidden/>
           </w:rPr>
-          <w:instrText xml:space="preserve"> PAGEREF _Toc239935746 \h </w:instrText>
+          <w:instrText xml:space="preserve"> PAGEREF _Toc240038151 \h </w:instrText>
         </w:r>
         <w:r>
           <w:rPr>
@@ -3477,7 +3483,7 @@
             <w:noProof/>
             <w:webHidden/>
           </w:rPr>
-          <w:t>42</w:t>
+          <w:t>44</w:t>
         </w:r>
         <w:r>
           <w:rPr>
@@ -3499,13 +3505,13 @@
           <w14:ligatures w14:val="standardContextual"/>
         </w:rPr>
       </w:pPr>
-      <w:hyperlink w:anchor="_Toc239935747" w:history="1">
+      <w:hyperlink w:anchor="_Toc240038152" w:history="1">
         <w:r>
           <w:rPr>
             <w:rStyle w:val="Hyperlink"/>
             <w:noProof/>
           </w:rPr>
-          <w:t>Popis slika</w:t>
+          <w:t>Popis kôdova</w:t>
         </w:r>
         <w:r>
           <w:rPr>
@@ -3526,7 +3532,7 @@
             <w:noProof/>
             <w:webHidden/>
           </w:rPr>
-          <w:instrText xml:space="preserve"> PAGEREF _Toc239935747 \h </w:instrText>
+          <w:instrText xml:space="preserve"> PAGEREF _Toc240038152 \h </w:instrText>
         </w:r>
         <w:r>
           <w:rPr>
@@ -3546,7 +3552,7 @@
             <w:noProof/>
             <w:webHidden/>
           </w:rPr>
-          <w:t>43</w:t>
+          <w:t>45</w:t>
         </w:r>
         <w:r>
           <w:rPr>
@@ -3568,13 +3574,13 @@
           <w14:ligatures w14:val="standardContextual"/>
         </w:rPr>
       </w:pPr>
-      <w:hyperlink w:anchor="_Toc239935748" w:history="1">
+      <w:hyperlink w:anchor="_Toc240038153" w:history="1">
         <w:r>
           <w:rPr>
             <w:rStyle w:val="Hyperlink"/>
             <w:noProof/>
           </w:rPr>
-          <w:t>Popis tablica</w:t>
+          <w:t>Literatura</w:t>
         </w:r>
         <w:r>
           <w:rPr>
@@ -3595,7 +3601,7 @@
             <w:noProof/>
             <w:webHidden/>
           </w:rPr>
-          <w:instrText xml:space="preserve"> PAGEREF _Toc239935748 \h </w:instrText>
+          <w:instrText xml:space="preserve"> PAGEREF _Toc240038153 \h </w:instrText>
         </w:r>
         <w:r>
           <w:rPr>
@@ -3615,7 +3621,7 @@
             <w:noProof/>
             <w:webHidden/>
           </w:rPr>
-          <w:t>44</w:t>
+          <w:t>46</w:t>
         </w:r>
         <w:r>
           <w:rPr>
@@ -3627,144 +3633,6 @@
       </w:hyperlink>
     </w:p>
     <w:p>
-      <w:pPr>
-        <w:pStyle w:val="TOC1"/>
-        <w:rPr>
-          <w:rFonts w:asciiTheme="minorHAnsi" w:eastAsiaTheme="minorEastAsia" w:hAnsiTheme="minorHAnsi" w:cstheme="minorBidi"/>
-          <w:noProof/>
-          <w:kern w:val="2"/>
-          <w:lang w:val="en-DE" w:eastAsia="en-DE"/>
-          <w14:ligatures w14:val="standardContextual"/>
-        </w:rPr>
-      </w:pPr>
-      <w:hyperlink w:anchor="_Toc239935749" w:history="1">
-        <w:r>
-          <w:rPr>
-            <w:rStyle w:val="Hyperlink"/>
-            <w:noProof/>
-          </w:rPr>
-          <w:t>Popis kôdova</w:t>
-        </w:r>
-        <w:r>
-          <w:rPr>
-            <w:noProof/>
-            <w:webHidden/>
-          </w:rPr>
-          <w:tab/>
-        </w:r>
-        <w:r>
-          <w:rPr>
-            <w:noProof/>
-            <w:webHidden/>
-          </w:rPr>
-          <w:fldChar w:fldCharType="begin"/>
-        </w:r>
-        <w:r>
-          <w:rPr>
-            <w:noProof/>
-            <w:webHidden/>
-          </w:rPr>
-          <w:instrText xml:space="preserve"> PAGEREF _Toc239935749 \h </w:instrText>
-        </w:r>
-        <w:r>
-          <w:rPr>
-            <w:noProof/>
-            <w:webHidden/>
-          </w:rPr>
-        </w:r>
-        <w:r>
-          <w:rPr>
-            <w:noProof/>
-            <w:webHidden/>
-          </w:rPr>
-          <w:fldChar w:fldCharType="separate"/>
-        </w:r>
-        <w:r>
-          <w:rPr>
-            <w:noProof/>
-            <w:webHidden/>
-          </w:rPr>
-          <w:t>45</w:t>
-        </w:r>
-        <w:r>
-          <w:rPr>
-            <w:noProof/>
-            <w:webHidden/>
-          </w:rPr>
-          <w:fldChar w:fldCharType="end"/>
-        </w:r>
-      </w:hyperlink>
-    </w:p>
-    <w:p>
-      <w:pPr>
-        <w:pStyle w:val="TOC1"/>
-        <w:rPr>
-          <w:rFonts w:asciiTheme="minorHAnsi" w:eastAsiaTheme="minorEastAsia" w:hAnsiTheme="minorHAnsi" w:cstheme="minorBidi"/>
-          <w:noProof/>
-          <w:kern w:val="2"/>
-          <w:lang w:val="en-DE" w:eastAsia="en-DE"/>
-          <w14:ligatures w14:val="standardContextual"/>
-        </w:rPr>
-      </w:pPr>
-      <w:hyperlink w:anchor="_Toc239935750" w:history="1">
-        <w:r>
-          <w:rPr>
-            <w:rStyle w:val="Hyperlink"/>
-            <w:noProof/>
-          </w:rPr>
-          <w:t>Literatura</w:t>
-        </w:r>
-        <w:r>
-          <w:rPr>
-            <w:noProof/>
-            <w:webHidden/>
-          </w:rPr>
-          <w:tab/>
-        </w:r>
-        <w:r>
-          <w:rPr>
-            <w:noProof/>
-            <w:webHidden/>
-          </w:rPr>
-          <w:fldChar w:fldCharType="begin"/>
-        </w:r>
-        <w:r>
-          <w:rPr>
-            <w:noProof/>
-            <w:webHidden/>
-          </w:rPr>
-          <w:instrText xml:space="preserve"> PAGEREF _Toc239935750 \h </w:instrText>
-        </w:r>
-        <w:r>
-          <w:rPr>
-            <w:noProof/>
-            <w:webHidden/>
-          </w:rPr>
-        </w:r>
-        <w:r>
-          <w:rPr>
-            <w:noProof/>
-            <w:webHidden/>
-          </w:rPr>
-          <w:fldChar w:fldCharType="separate"/>
-        </w:r>
-        <w:r>
-          <w:rPr>
-            <w:noProof/>
-            <w:webHidden/>
-          </w:rPr>
-          <w:t>46</w:t>
-        </w:r>
-        <w:r>
-          <w:rPr>
-            <w:noProof/>
-            <w:webHidden/>
-          </w:rPr>
-          <w:fldChar w:fldCharType="end"/>
-        </w:r>
-      </w:hyperlink>
-    </w:p>
-    <w:p>
       <w:r>
         <w:fldChar w:fldCharType="end"/>
       </w:r>
@@ -3773,7 +3641,7 @@
       <w:pPr>
         <w:pStyle w:val="Heading1"/>
       </w:pPr>
-      <w:bookmarkStart w:id="3" w:name="_Toc239935712"/>
+      <w:bookmarkStart w:id="3" w:name="_Toc240038117"/>
       <w:r>
         <w:lastRenderedPageBreak/>
         <w:t>Uvod</w:t>
@@ -3795,7 +3663,7 @@
       <w:pPr>
         <w:pStyle w:val="Heading2"/>
       </w:pPr>
-      <w:bookmarkStart w:id="4" w:name="_Toc239935713"/>
+      <w:bookmarkStart w:id="4" w:name="_Toc240038118"/>
       <w:r>
         <w:t>Motivacija i definiranje problema</w:t>
       </w:r>
@@ -3810,7 +3678,7 @@
       <w:pPr>
         <w:pStyle w:val="Heading2"/>
       </w:pPr>
-      <w:bookmarkStart w:id="5" w:name="_Toc239935714"/>
+      <w:bookmarkStart w:id="5" w:name="_Toc240038119"/>
       <w:r>
         <w:t>Cilj i svrha rada</w:t>
       </w:r>
@@ -3840,7 +3708,7 @@
       <w:pPr>
         <w:pStyle w:val="Heading1"/>
       </w:pPr>
-      <w:bookmarkStart w:id="7" w:name="_Toc239935715"/>
+      <w:bookmarkStart w:id="7" w:name="_Toc240038120"/>
       <w:bookmarkEnd w:id="6"/>
       <w:r>
         <w:lastRenderedPageBreak/>
@@ -3857,7 +3725,7 @@
       <w:pPr>
         <w:pStyle w:val="Heading2"/>
       </w:pPr>
-      <w:bookmarkStart w:id="8" w:name="_Toc239935716"/>
+      <w:bookmarkStart w:id="8" w:name="_Toc240038121"/>
       <w:r>
         <w:t>Pregled sličnih mobilnih aplikacija na tržištu</w:t>
       </w:r>
@@ -3865,7 +3733,13 @@
     </w:p>
     <w:p>
       <w:r>
-        <w:t>Među najistaknutijim rješenjima u ovom području nalazi se aplikacija Photomath, koja se pozicionirala kao vodeći alat za trenutačno rješavanje zadataka putem kamere. Njezina primarna snaga leži u vrhunskim algoritmima za prepoznavanje rukopisa i jasnim vizualnim instrukcijama. S druge strane, WolframAlpha predstavlja moćan računalni engine koji omogućuje dubinske analize iznimno složenih matematičkih, fizičkih i kemijskih sustava. Dok Photomath služi kao pomoć u rješavanju specifičnih obrazovnih problema, WolframAlpha funkcionira kao mobilna verzija sustava Mathematica, pružajući korisnicima gotove odgovore na gotovo sve upite.</w:t>
+        <w:t xml:space="preserve">Među najistaknutijim rješenjima u ovom području nalazi se aplikacija Photomath, koja se pozicionirala kao vodeći alat za trenutačno rješavanje zadataka putem kamere. Njezina primarna snaga leži u vrhunskim algoritmima za prepoznavanje rukopisa i jasnim vizualnim instrukcijama. S druge strane, WolframAlpha predstavlja moćan računalni engine koji omogućuje dubinske analize iznimno složenih matematičkih, fizičkih i kemijskih sustava. Dok Photomath služi kao pomoć u rješavanju </w:t>
+      </w:r>
+      <w:r>
+        <w:t>matematičkih</w:t>
+      </w:r>
+      <w:r>
+        <w:t xml:space="preserve"> obrazovnih problema, WolframAlpha funkcionira kao mobilna verzija sustava Mathematica, pružajući korisnicima gotove odgovore na gotovo sve upite.</w:t>
       </w:r>
     </w:p>
     <w:p>
@@ -3904,7 +3778,7 @@
       <w:pPr>
         <w:pStyle w:val="Heading2"/>
       </w:pPr>
-      <w:bookmarkStart w:id="9" w:name="_Toc239935717"/>
+      <w:bookmarkStart w:id="9" w:name="_Toc240038122"/>
       <w:r>
         <w:lastRenderedPageBreak/>
         <w:t>Prednosti i nedostaci dostupnih alata</w:t>
@@ -3940,7 +3814,7 @@
       <w:pPr>
         <w:pStyle w:val="Heading1"/>
       </w:pPr>
-      <w:bookmarkStart w:id="10" w:name="_Toc239935718"/>
+      <w:bookmarkStart w:id="10" w:name="_Toc240038123"/>
       <w:r>
         <w:lastRenderedPageBreak/>
         <w:t>Arhitektura sustava i korištene tehnologije</w:t>
@@ -3956,7 +3830,7 @@
       <w:pPr>
         <w:pStyle w:val="Heading2"/>
       </w:pPr>
-      <w:bookmarkStart w:id="11" w:name="_Toc239935719"/>
+      <w:bookmarkStart w:id="11" w:name="_Toc240038124"/>
       <w:r>
         <w:t>Android platforma i programski jezik Kotlin</w:t>
       </w:r>
@@ -3964,7 +3838,58 @@
     </w:p>
     <w:p>
       <w:r>
-        <w:t xml:space="preserve">Aplikacija je razvijena za Android platformu, koristeći programski jezik Kotlin kao primarni alat. Kotlin je odabran zbog svoje sažetosti, sigurnosti u pogledu nultih referenci (engl. null safety) te izvrsne podrške za asinkrono programiranje putem </w:t>
+        <w:t>Aplikacija je razvijena za Android platformu, koristeći programski jezik Kotlin kao primarni alat.</w:t>
+      </w:r>
+      <w:r>
+        <w:t xml:space="preserve"> </w:t>
+      </w:r>
+      <w:r>
+        <w:t>„Kotlin je stvoren kako bi riješio neke od nedostataka Jave u smislu opširnosti, rukovanja nultim tipovima i dodavanja više tehnika funkcionalnog programiranja.“</w:t>
+      </w:r>
+      <w:sdt>
+        <w:sdtPr>
+          <w:id w:val="960693588"/>
+          <w:citation/>
+        </w:sdtPr>
+        <w:sdtContent>
+          <w:r>
+            <w:fldChar w:fldCharType="begin"/>
+          </w:r>
+          <w:r>
+            <w:instrText xml:space="preserve"> CITATION For25 \l 1050 </w:instrText>
+          </w:r>
+          <w:r>
+            <w:fldChar w:fldCharType="separate"/>
+          </w:r>
+          <w:r>
+            <w:rPr>
+              <w:noProof/>
+            </w:rPr>
+            <w:t xml:space="preserve"> [1]</w:t>
+          </w:r>
+          <w:r>
+            <w:fldChar w:fldCharType="end"/>
+          </w:r>
+        </w:sdtContent>
+      </w:sdt>
+      <w:r>
+        <w:t xml:space="preserve"> Kotlin je odabran</w:t>
+      </w:r>
+      <w:r>
+        <w:t xml:space="preserve"> baš</w:t>
+      </w:r>
+      <w:r>
+        <w:t xml:space="preserve"> zbog svoje sažetosti, sigurnosti u pogledu nultih referenci (engl. </w:t>
+      </w:r>
+      <w:r>
+        <w:rPr>
+          <w:i/>
+          <w:iCs/>
+        </w:rPr>
+        <w:t>null safety</w:t>
+      </w:r>
+      <w:r>
+        <w:t xml:space="preserve">) te izvrsne podrške za asinkrono programiranje putem </w:t>
       </w:r>
       <w:r>
         <w:t>pozadinskih dretvi</w:t>
@@ -3976,14 +3901,24 @@
         <w:t>pozadinske dretve</w:t>
       </w:r>
       <w:r>
-        <w:t xml:space="preserve"> omogućile da se kompleksni izračuni u Solveru i procesuiranje slika s kamere izvode u pozadini, čime je sučelje aplikacije ostalo fluidno i responzivno. Dodatno, korištena je "by lazy" inicijalizacija za učitavanje teških matematičkih engine-a, što je optimiziralo početno vrijeme pokretanja fragmenata.</w:t>
+        <w:t xml:space="preserve"> omogućile da se kompleksni izračuni u Solveru i procesuiranje slika s kamere izvode u pozadini, čime je sučelje aplikacije ostalo fluidno i responzivno. Dodatno, korištena je "</w:t>
+      </w:r>
+      <w:r>
+        <w:rPr>
+          <w:i/>
+          <w:iCs/>
+        </w:rPr>
+        <w:t>by lazy</w:t>
+      </w:r>
+      <w:r>
+        <w:t>" inicijalizacija za učitavanje teških matematičkih engine-a, što je optimiziralo početno vrijeme pokretanja fragmenata.</w:t>
       </w:r>
     </w:p>
     <w:p>
       <w:pPr>
         <w:pStyle w:val="Heading2"/>
       </w:pPr>
-      <w:bookmarkStart w:id="12" w:name="_Toc239935720"/>
+      <w:bookmarkStart w:id="12" w:name="_Toc240038125"/>
       <w:r>
         <w:t>Arhitektura aplikacije</w:t>
       </w:r>
@@ -3991,7 +3926,52 @@
     </w:p>
     <w:p>
       <w:r>
-        <w:t xml:space="preserve">Struktura koda prati MVVM (engl. Model-View-ViewModel) arhitektonski obrazac, koji osigurava jasnu odvojenost poslovne logike od prikaza sučelja. Ovakav pristup olakšava testiranje i održavanje aplikacije, posebno kod dinamičkog generiranja polja za varijable. </w:t>
+        <w:t xml:space="preserve">Struktura koda prati MVVM (engl. </w:t>
+      </w:r>
+      <w:r>
+        <w:rPr>
+          <w:i/>
+          <w:iCs/>
+        </w:rPr>
+        <w:t>Model-View-ViewModel</w:t>
+      </w:r>
+      <w:r>
+        <w:t>) arhitektonski obrazac, koji osigurava jasnu odvojenost poslovne logike od prikaza sučelja.</w:t>
+      </w:r>
+      <w:r>
+        <w:t xml:space="preserve"> </w:t>
+      </w:r>
+      <w:r>
+        <w:t>„ViewModel komponente, LiveData i Room dio su Android arhitektonskih komponenti, koje su dio Android Jetpack biblioteka.“</w:t>
+      </w:r>
+      <w:sdt>
+        <w:sdtPr>
+          <w:id w:val="1370963719"/>
+          <w:citation/>
+        </w:sdtPr>
+        <w:sdtContent>
+          <w:r>
+            <w:fldChar w:fldCharType="begin"/>
+          </w:r>
+          <w:r>
+            <w:instrText xml:space="preserve"> CITATION For25 \l 1050 </w:instrText>
+          </w:r>
+          <w:r>
+            <w:fldChar w:fldCharType="separate"/>
+          </w:r>
+          <w:r>
+            <w:rPr>
+              <w:noProof/>
+            </w:rPr>
+            <w:t xml:space="preserve"> [1]</w:t>
+          </w:r>
+          <w:r>
+            <w:fldChar w:fldCharType="end"/>
+          </w:r>
+        </w:sdtContent>
+      </w:sdt>
+      <w:r>
+        <w:t xml:space="preserve"> Ovakav pristup olakšava testiranje i održavanje aplikacije, posebno kod dinamičkog generiranja polja za varijable. </w:t>
       </w:r>
       <w:r>
         <w:t>Arhitektura aplikacije i podjela po slojevima prikazana je na Slici 3.1.</w:t>
@@ -4009,11 +3989,11 @@
         <w:t>Navigation Component</w:t>
       </w:r>
       <w:r>
-        <w:t xml:space="preserve"> uz strogu tipizaciju argumenata. Ovakva arhitektura omogućila je stabilan </w:t>
+        <w:t xml:space="preserve"> uz strogu tipizaciju argumenata. </w:t>
       </w:r>
       <w:r>
         <w:lastRenderedPageBreak/>
-        <w:t xml:space="preserve">prijenos podataka o jednadžbama i povijesti izračuna bez rizika od rušenja aplikacije </w:t>
+        <w:t xml:space="preserve">Ovakva arhitektura omogućila je stabilan prijenos podataka o jednadžbama i povijesti izračuna bez rizika od rušenja aplikacije </w:t>
       </w:r>
       <w:r>
         <w:rPr>
@@ -4060,7 +4040,7 @@
                             <w:pPr>
                               <w:pStyle w:val="Caption"/>
                             </w:pPr>
-                            <w:bookmarkStart w:id="13" w:name="_Toc239935897"/>
+                            <w:bookmarkStart w:id="13" w:name="_Toc240038154"/>
                             <w:r>
                               <w:t xml:space="preserve">Slika </w:t>
                             </w:r>
@@ -4138,7 +4118,7 @@
                       <w:pPr>
                         <w:pStyle w:val="Caption"/>
                       </w:pPr>
-                      <w:bookmarkStart w:id="14" w:name="_Toc239935897"/>
+                      <w:bookmarkStart w:id="14" w:name="_Toc240038154"/>
                       <w:r>
                         <w:t xml:space="preserve">Slika </w:t>
                       </w:r>
@@ -4259,7 +4239,7 @@
       <w:pPr>
         <w:pStyle w:val="Heading2"/>
       </w:pPr>
-      <w:bookmarkStart w:id="15" w:name="_Toc239935721"/>
+      <w:bookmarkStart w:id="15" w:name="_Toc240038126"/>
       <w:r>
         <w:t>Sustav za lokalnu pohranu podataka</w:t>
       </w:r>
@@ -4314,7 +4294,7 @@
                                 <w:noProof/>
                               </w:rPr>
                             </w:pPr>
-                            <w:bookmarkStart w:id="16" w:name="_Toc239935898"/>
+                            <w:bookmarkStart w:id="16" w:name="_Toc240038155"/>
                             <w:r>
                               <w:t xml:space="preserve">Slika </w:t>
                             </w:r>
@@ -4391,7 +4371,7 @@
                           <w:noProof/>
                         </w:rPr>
                       </w:pPr>
-                      <w:bookmarkStart w:id="17" w:name="_Toc239935898"/>
+                      <w:bookmarkStart w:id="17" w:name="_Toc240038155"/>
                       <w:r>
                         <w:t xml:space="preserve">Slika </w:t>
                       </w:r>
@@ -4505,7 +4485,56 @@
         </w:drawing>
       </w:r>
       <w:r>
-        <w:t xml:space="preserve">Za trajnu pohranu korisničkih podataka na uređaju implementirana je Room baza podataka, koja predstavlja apstrakcijski sloj iznad SQLite sustava. Room omogućuje rad s objektima jezika Kotlin izravno u bazi podataka, osiguravajući pritom provjeru upita u fazi kompajliranja. Sustav je dizajniran s dva ključna entiteta, </w:t>
+        <w:t>Za trajnu pohranu korisničkih podataka na uređaju implementirana je Room baza podataka, koja predstavlja apstrakcijski sloj iznad SQLite sustava.</w:t>
+      </w:r>
+      <w:r>
+        <w:t xml:space="preserve"> </w:t>
+      </w:r>
+      <w:r>
+        <w:t>„Kao što primjećujemo kod jezika za upite, poput SQL-a (</w:t>
+      </w:r>
+      <w:r>
+        <w:rPr>
+          <w:i/>
+          <w:iCs/>
+        </w:rPr>
+        <w:t>Structured Query Language</w:t>
+      </w:r>
+      <w:r>
+        <w:t>), oni se koriste za pretraživanje baza podataka. Upiti u bazi podataka sastoje se od predikata koji sadrže relacijske i bool operatore, a mogu se interpretirati ili kompajlirati u naredbe kojima se baza pretražuje za zapisima koji zadovoljavaju taj predikat.“</w:t>
+      </w:r>
+      <w:sdt>
+        <w:sdtPr>
+          <w:id w:val="-1270313760"/>
+          <w:citation/>
+        </w:sdtPr>
+        <w:sdtContent>
+          <w:r>
+            <w:fldChar w:fldCharType="begin"/>
+          </w:r>
+          <w:r>
+            <w:instrText xml:space="preserve"> CITATION Aho06 \l 1050 </w:instrText>
+          </w:r>
+          <w:r>
+            <w:fldChar w:fldCharType="separate"/>
+          </w:r>
+          <w:r>
+            <w:rPr>
+              <w:noProof/>
+            </w:rPr>
+            <w:t xml:space="preserve"> [2]</w:t>
+          </w:r>
+          <w:r>
+            <w:fldChar w:fldCharType="end"/>
+          </w:r>
+        </w:sdtContent>
+      </w:sdt>
+      <w:r>
+        <w:t xml:space="preserve"> Room omogućuje rad s objektima jezika Kotlin izravno u bazi podataka, osiguravajući pritom provjeru upita u fazi kompajliranja. Sustav je dizajniran </w:t>
+      </w:r>
+      <w:r>
+        <w:lastRenderedPageBreak/>
+        <w:t xml:space="preserve">s dva ključna entiteta, </w:t>
       </w:r>
       <w:r>
         <w:rPr>
@@ -4530,16 +4559,35 @@
       <w:pPr>
         <w:pStyle w:val="Heading2"/>
       </w:pPr>
-      <w:bookmarkStart w:id="18" w:name="_Toc239935722"/>
-      <w:r>
-        <w:lastRenderedPageBreak/>
+      <w:bookmarkStart w:id="18" w:name="_Toc240038127"/>
+      <w:r>
         <w:t>Postojeći alati i biblioteke za optičko prepoznavanje znakova (OCR)</w:t>
       </w:r>
       <w:bookmarkEnd w:id="18"/>
     </w:p>
     <w:p>
       <w:r>
-        <w:t>Za funkcionalnost očitavanja jednadžbi putem kamere integriran je Google ML Kit, specifično modul za prepoznavanje teksta (engl. Text Recognition). Uz ML Kit korišten je i CameraX API koji omogućuje upravljanje hardverom kamere uz podršku za napredne značajke poput automatskog fokusiranja, bljeskalice i digitalnog zumiranja. Odabir ML Kit-a osigurao je da se cjelokupna obrada slike i prepoznavanje znakova odvija na samom uređaju (engl. on-device processing), što aplikaciju čini bržom i neovisnom o stabilnosti internetske veze. Implementiran je i dodatni sloj post-procesiranja koji ispravlja uobičajene OCR greške kod matematičkih simbola.</w:t>
+        <w:t xml:space="preserve">Za funkcionalnost očitavanja jednadžbi putem kamere integriran je Google ML Kit, specifično modul za prepoznavanje teksta (engl. </w:t>
+      </w:r>
+      <w:r>
+        <w:rPr>
+          <w:i/>
+          <w:iCs/>
+        </w:rPr>
+        <w:t>Text Recognition</w:t>
+      </w:r>
+      <w:r>
+        <w:t xml:space="preserve">). Uz ML Kit korišten je i CameraX API koji omogućuje upravljanje hardverom kamere uz podršku za napredne značajke poput automatskog fokusiranja, bljeskalice i digitalnog zumiranja. Odabir ML Kit-a osigurao je da se cjelokupna obrada slike i prepoznavanje znakova odvija na samom uređaju (engl. </w:t>
+      </w:r>
+      <w:r>
+        <w:rPr>
+          <w:i/>
+          <w:iCs/>
+        </w:rPr>
+        <w:t>on-device processing</w:t>
+      </w:r>
+      <w:r>
+        <w:t>), što aplikaciju čini bržom i neovisnom o stabilnosti internetske veze. Implementiran je i dodatni sloj post-procesiranja koji ispravlja uobičajene OCR greške kod matematičkih simbola.</w:t>
       </w:r>
     </w:p>
     <w:p>
@@ -4555,7 +4603,7 @@
       <w:pPr>
         <w:pStyle w:val="Heading1"/>
       </w:pPr>
-      <w:bookmarkStart w:id="19" w:name="_Toc239935723"/>
+      <w:bookmarkStart w:id="19" w:name="_Toc240038128"/>
       <w:r>
         <w:lastRenderedPageBreak/>
         <w:t>Dizajn i funkcionalna specifikacija</w:t>
@@ -4577,7 +4625,7 @@
       <w:pPr>
         <w:pStyle w:val="Heading2"/>
       </w:pPr>
-      <w:bookmarkStart w:id="20" w:name="_Toc239935724"/>
+      <w:bookmarkStart w:id="20" w:name="_Toc240038129"/>
       <w:r>
         <w:t>Korisnički zahtjevi i slučajevi korištenja (Use Cases)</w:t>
       </w:r>
@@ -4598,7 +4646,7 @@
       <w:pPr>
         <w:pStyle w:val="Heading2"/>
       </w:pPr>
-      <w:bookmarkStart w:id="21" w:name="_Toc239935725"/>
+      <w:bookmarkStart w:id="21" w:name="_Toc240038130"/>
       <w:r>
         <w:t>Dizajn korisničkog sučelja (UI) i korisničkog iskustva (UX)</w:t>
       </w:r>
@@ -4606,14 +4654,43 @@
     </w:p>
     <w:p>
       <w:r>
-        <w:t>Korisničko sučelje dizajnirano je prateći suvremene Material Design smjernice, uz potpunu prilagodbu za tamni način rada (engl. Dark Mode). Vizualni identitet aplikacije temelji se na ljubičastim tonovima koji su dosljedno primijenjeni kroz sve elemente, uključujući SplashScreen i animacije učitavanja. Ključno unapređenje korisničkog iskustva postignuto je kroz sustav dinamičkog prebacivanja tipkovnica. Ovisno o polju koje korisnik fokusira, aplikacija automatski nudi standardnu sustavnu tipkovnicu za tekstualni unos naziva ili znanstvenu tipkovnicu s četiri specijalizirana taba za unos formula. Ovakav pristup smanjuje opterećenje i ubrzava rad. Uveden je i interaktivni vodič (engl. Onboarding) koji se aktivira pri prvom pokretanju aplikacije ili na zahtjev korisnika, vizualno objašnjavajući ključne korake korištenja.</w:t>
+        <w:t xml:space="preserve">Korisničko sučelje dizajnirano je prateći suvremene Material Design smjernice, uz potpunu prilagodbu za tamni način rada (engl. </w:t>
+      </w:r>
+      <w:r>
+        <w:rPr>
+          <w:i/>
+          <w:iCs/>
+        </w:rPr>
+        <w:t>Dark Mode</w:t>
+      </w:r>
+      <w:r>
+        <w:t xml:space="preserve">). Vizualni identitet aplikacije temelji se na ljubičastim tonovima koji su dosljedno primijenjeni kroz sve elemente, uključujući </w:t>
+      </w:r>
+      <w:r>
+        <w:rPr>
+          <w:rStyle w:val="KdutekstuChar"/>
+        </w:rPr>
+        <w:t>SplashScreen</w:t>
+      </w:r>
+      <w:r>
+        <w:t xml:space="preserve"> i animacije učitavanja. Ključno unapređenje korisničkog iskustva postignuto je kroz sustav dinamičkog prebacivanja tipkovnica. Ovisno o polju koje korisnik fokusira, aplikacija automatski nudi standardnu sustavnu tipkovnicu za tekstualni unos naziva ili znanstvenu tipkovnicu s četiri specijalizirana taba za unos formula. Ovakav pristup smanjuje opterećenje i ubrzava rad. Uveden je i interaktivni vodič (engl. </w:t>
+      </w:r>
+      <w:r>
+        <w:rPr>
+          <w:i/>
+          <w:iCs/>
+        </w:rPr>
+        <w:t>Onboarding</w:t>
+      </w:r>
+      <w:r>
+        <w:t>) koji se aktivira pri prvom pokretanju aplikacije ili na zahtjev korisnika, vizualno objašnjavajući ključne korake korištenja.</w:t>
       </w:r>
     </w:p>
     <w:p>
       <w:pPr>
         <w:pStyle w:val="Heading2"/>
       </w:pPr>
-      <w:bookmarkStart w:id="22" w:name="_Toc239935726"/>
+      <w:bookmarkStart w:id="22" w:name="_Toc240038131"/>
       <w:r>
         <w:lastRenderedPageBreak/>
         <w:t>Koncept i svrha modula za grafički prikaz funkcija</w:t>
@@ -4622,7 +4699,17 @@
     </w:p>
     <w:p>
       <w:r>
-        <w:t>Svrha modula za grafički prikaz je transformacija niza numeričkih izračuna u razumljivu vizualnu informaciju. Koncept se temelji na XY grafovima koji iscrtavaju ovisnost rezultata jednadžbe o odabranoj ulaznoj varijabli iz povijesti izračuna. Za postizanje profesionalne razine vizualizacije, modul koristi glatke krivulje (engl. Cubic Bezier curves) umjesto oštrih linijskih segmenata. Poseban naglasak stavljen je na podršku za logaritamsku skalu, koja korisniku omogućuje jasan prikaz podataka čije se vrijednosti razlikuju u više redova veličine, što je čest slučaj u fizikalnim i kemijskim mjerenjima. Oznake na osima automatski se prilagođavaju znanstvenom zapisu, osiguravajući preglednost i kod ekstremno velikih ili malih brojeva.</w:t>
+        <w:t xml:space="preserve">Svrha modula za grafički prikaz je transformacija niza numeričkih izračuna u razumljivu vizualnu informaciju. Koncept se temelji na XY grafovima koji iscrtavaju ovisnost rezultata jednadžbe o odabranoj ulaznoj varijabli iz povijesti izračuna. Za postizanje profesionalne razine vizualizacije, modul koristi glatke krivulje (engl. </w:t>
+      </w:r>
+      <w:r>
+        <w:rPr>
+          <w:i/>
+          <w:iCs/>
+        </w:rPr>
+        <w:t>Cubic Bezier curves</w:t>
+      </w:r>
+      <w:r>
+        <w:t>) umjesto oštrih linijskih segmenata. Poseban naglasak stavljen je na podršku za logaritamsku skalu, koja korisniku omogućuje jasan prikaz podataka čije se vrijednosti razlikuju u više redova veličine, što je čest slučaj u fizikalnim i kemijskim mjerenjima. Oznake na osima automatski se prilagođavaju znanstvenom zapisu, osiguravajući preglednost i kod ekstremno velikih ili malih brojeva.</w:t>
       </w:r>
     </w:p>
     <w:p>
@@ -4638,7 +4725,7 @@
       <w:pPr>
         <w:pStyle w:val="Heading1"/>
       </w:pPr>
-      <w:bookmarkStart w:id="23" w:name="_Toc239935727"/>
+      <w:bookmarkStart w:id="23" w:name="_Toc240038132"/>
       <w:r>
         <w:lastRenderedPageBreak/>
         <w:t>Implementacija aplikacije EquationPocket</w:t>
@@ -4654,7 +4741,7 @@
       <w:pPr>
         <w:pStyle w:val="Heading2"/>
       </w:pPr>
-      <w:bookmarkStart w:id="24" w:name="_Toc239935728"/>
+      <w:bookmarkStart w:id="24" w:name="_Toc240038133"/>
       <w:r>
         <w:t>Razvoj korisničkog sučelja i navigacije u Kotlinu</w:t>
       </w:r>
@@ -4672,7 +4759,52 @@
     </w:p>
     <w:p>
       <w:r>
-        <w:t xml:space="preserve">Za temelj aplikacije odabrana je arhitektura jedne aktivnosti (engl. Single Activity Architecture). Ovaj pristup podrazumijeva korištenje jedne centralne aktivnosti, </w:t>
+        <w:t xml:space="preserve">Za temelj aplikacije odabrana je arhitektura jedne aktivnosti (engl. </w:t>
+      </w:r>
+      <w:r>
+        <w:rPr>
+          <w:i/>
+          <w:iCs/>
+        </w:rPr>
+        <w:t>Single Activity Architecture</w:t>
+      </w:r>
+      <w:r>
+        <w:t>).</w:t>
+      </w:r>
+      <w:r>
+        <w:t xml:space="preserve"> </w:t>
+      </w:r>
+      <w:r>
+        <w:t>„Aplikacijska komponenta activity u Androidu predstavlja pojedinačni zaslon unutar aplikacije s kojim korisnik može ostvariti interakciju.“</w:t>
+      </w:r>
+      <w:sdt>
+        <w:sdtPr>
+          <w:id w:val="1980872613"/>
+          <w:citation/>
+        </w:sdtPr>
+        <w:sdtContent>
+          <w:r>
+            <w:fldChar w:fldCharType="begin"/>
+          </w:r>
+          <w:r>
+            <w:instrText xml:space="preserve"> CITATION For25 \l 1050 </w:instrText>
+          </w:r>
+          <w:r>
+            <w:fldChar w:fldCharType="separate"/>
+          </w:r>
+          <w:r>
+            <w:rPr>
+              <w:noProof/>
+            </w:rPr>
+            <w:t xml:space="preserve"> [1]</w:t>
+          </w:r>
+          <w:r>
+            <w:fldChar w:fldCharType="end"/>
+          </w:r>
+        </w:sdtContent>
+      </w:sdt>
+      <w:r>
+        <w:t xml:space="preserve"> Ovaj pristup podrazumijeva korištenje jedne centralne aktivnosti, </w:t>
       </w:r>
       <w:r>
         <w:rPr>
@@ -4681,7 +4813,17 @@
         <w:t>HostActivity</w:t>
       </w:r>
       <w:r>
-        <w:t xml:space="preserve">, koja služi kao kontejner za sve ostale ekrane koji su implementirani kao fragmenti (Fragment). Ovakva arhitektura značajno smanjuje potrošnju resursa uređaja i omogućuje fluidnije prijelaze između ekrana jer sustav ne mora svaki put iznova instancirati teške </w:t>
+        <w:t>, koja služi kao kontejner za sve ostale ekrane koji su implementirani kao fragmenti (</w:t>
+      </w:r>
+      <w:r>
+        <w:rPr>
+          <w:i/>
+          <w:iCs/>
+        </w:rPr>
+        <w:t>Fragment</w:t>
+      </w:r>
+      <w:r>
+        <w:t xml:space="preserve">). Ovakva arhitektura značajno smanjuje potrošnju resursa uređaja i omogućuje fluidnije prijelaze između ekrana jer sustav ne mora svaki put iznova instancirati teške </w:t>
       </w:r>
       <w:r>
         <w:rPr>
@@ -4713,7 +4855,47 @@
         <w:t>DrawerLayout</w:t>
       </w:r>
       <w:r>
-        <w:t xml:space="preserve"> koji omogućuje bočni navigacijski izbornik (NavigationView). Ovaj izbornik korisniku pruža brz pristup glavnim sekcijama aplikacije: Mapama, Uputama (Tutorial), Šalabahteru (Help) i informacijama o samoj aplikaciji (About). Centralni dio layouta zauzima </w:t>
+        <w:t xml:space="preserve"> koji omogućuje bočni navigacijski izbornik (</w:t>
+      </w:r>
+      <w:r>
+        <w:rPr>
+          <w:i/>
+          <w:iCs/>
+        </w:rPr>
+        <w:t>NavigationView</w:t>
+      </w:r>
+      <w:r>
+        <w:t>). Ovaj izbornik korisniku pruža brz pristup glavnim sekcijama aplikacije: Mapama, Uputama (</w:t>
+      </w:r>
+      <w:r>
+        <w:rPr>
+          <w:i/>
+          <w:iCs/>
+        </w:rPr>
+        <w:t>Tutorial</w:t>
+      </w:r>
+      <w:r>
+        <w:t>), Šalabahteru (</w:t>
+      </w:r>
+      <w:r>
+        <w:rPr>
+          <w:i/>
+          <w:iCs/>
+        </w:rPr>
+        <w:t>Help</w:t>
+      </w:r>
+      <w:r>
+        <w:t>) i informacijama o samoj aplikaciji (</w:t>
+      </w:r>
+      <w:r>
+        <w:rPr>
+          <w:i/>
+          <w:iCs/>
+        </w:rPr>
+        <w:t>About</w:t>
+      </w:r>
+      <w:r>
+        <w:t xml:space="preserve">). Centralni dio layouta zauzima </w:t>
       </w:r>
       <w:r>
         <w:rPr>
@@ -4747,12 +4929,21 @@
     <w:p>
       <w:r>
         <w:lastRenderedPageBreak/>
-        <w:t xml:space="preserve">Za prijenos podataka između fragmenata, poput naziva odabrane mape ili teksta formule, korišten je sustav argumenata unutar navigacijskog grafa. Ovime je postignuta stroga tipizacija podataka, čime su eliminirane pogreške koje se javljaju pri ručnom slanju podataka putem Intent ili </w:t>
+        <w:t xml:space="preserve">Za prijenos podataka između fragmenata, poput naziva odabrane mape ili teksta formule, korišten je sustav argumenata unutar navigacijskog grafa. Ovime je postignuta stroga tipizacija podataka, čime su eliminirane pogreške koje se javljaju pri ručnom slanju podataka putem </w:t>
       </w:r>
       <w:r>
         <w:rPr>
           <w:rStyle w:val="KdutekstuChar"/>
         </w:rPr>
+        <w:t>Intent</w:t>
+      </w:r>
+      <w:r>
+        <w:t xml:space="preserve"> ili </w:t>
+      </w:r>
+      <w:r>
+        <w:rPr>
+          <w:rStyle w:val="KdutekstuChar"/>
+        </w:rPr>
         <w:t>Bundle</w:t>
       </w:r>
       <w:r>
@@ -4784,12 +4975,21 @@
     </w:p>
     <w:p>
       <w:r>
-        <w:t xml:space="preserve">Kako bi se osigurala stabilnost i izbjegle česte pogreške poput NullPointerException, u svim fragmentima i aktivnostima implementiran je sustav </w:t>
+        <w:t xml:space="preserve">Kako bi se osigurala stabilnost i izbjegle česte pogreške poput </w:t>
       </w:r>
       <w:r>
         <w:rPr>
           <w:rStyle w:val="KdutekstuChar"/>
         </w:rPr>
+        <w:t>NullPointerException</w:t>
+      </w:r>
+      <w:r>
+        <w:t xml:space="preserve">, u svim fragmentima i aktivnostima implementiran je sustav </w:t>
+      </w:r>
+      <w:r>
+        <w:rPr>
+          <w:rStyle w:val="KdutekstuChar"/>
+        </w:rPr>
         <w:t>ViewBinding</w:t>
       </w:r>
       <w:r>
@@ -4825,7 +5025,27 @@
         <w:t>Theme.EquationPocket</w:t>
       </w:r>
       <w:r>
-        <w:t xml:space="preserve">, bazirana je na Material Components sustavu, s prilagođenom paletom boja u kojoj dominira ljubičasta. Svi grafički elementi, poput gumba, polja za unos i kartica (CardView), automatski prilagođavaju svoj izgled ovisno o tome koristi li korisnik svijetlu ili tamnu temu sustava. U tamnom načinu rada (engl. Dark Mode), </w:t>
+        <w:t>, bazirana je na Material Components sustavu, s prilagođenom paletom boja u kojoj dominira ljubičasta. Svi grafički elementi, poput gumba, polja za unos i kartica (</w:t>
+      </w:r>
+      <w:r>
+        <w:rPr>
+          <w:i/>
+          <w:iCs/>
+        </w:rPr>
+        <w:t>CardView</w:t>
+      </w:r>
+      <w:r>
+        <w:t xml:space="preserve">), automatski prilagođavaju svoj izgled ovisno o tome koristi li korisnik svijetlu ili tamnu temu sustava. U tamnom načinu rada (engl. </w:t>
+      </w:r>
+      <w:r>
+        <w:rPr>
+          <w:i/>
+          <w:iCs/>
+        </w:rPr>
+        <w:t>Dark Mode</w:t>
+      </w:r>
+      <w:r>
+        <w:t xml:space="preserve">), </w:t>
       </w:r>
       <w:r>
         <w:lastRenderedPageBreak/>
@@ -4876,7 +5096,7 @@
                             <w:pPr>
                               <w:pStyle w:val="Caption"/>
                             </w:pPr>
-                            <w:bookmarkStart w:id="25" w:name="_Toc239935899"/>
+                            <w:bookmarkStart w:id="25" w:name="_Toc240038156"/>
                             <w:r>
                               <w:t xml:space="preserve">Slika </w:t>
                             </w:r>
@@ -4953,7 +5173,7 @@
                       <w:pPr>
                         <w:pStyle w:val="Caption"/>
                       </w:pPr>
-                      <w:bookmarkStart w:id="26" w:name="_Toc239935899"/>
+                      <w:bookmarkStart w:id="26" w:name="_Toc240038156"/>
                       <w:r>
                         <w:t xml:space="preserve">Slika </w:t>
                       </w:r>
@@ -5081,7 +5301,16 @@
     </w:p>
     <w:p>
       <w:r>
-        <w:t>Ulazna točka aplikacije (SplashScreen):</w:t>
+        <w:t>Ulazna točka aplikacije (</w:t>
+      </w:r>
+      <w:r>
+        <w:rPr>
+          <w:rStyle w:val="KdutekstuChar"/>
+        </w:rPr>
+        <w:t>SplashScreen</w:t>
+      </w:r>
+      <w:r>
+        <w:t>):</w:t>
       </w:r>
     </w:p>
     <w:p>
@@ -5095,12 +5324,31 @@
         <w:t>SplashScreenActivity</w:t>
       </w:r>
       <w:r>
-        <w:t xml:space="preserve">. Ovaj ekran služi za prikaz logotipa aplikacije i pripremu baze podataka u pozadini. Implementirana je animacija bljeskanja (engl. fading) nad središnjom slikom (loading_img), što korisniku pruža vizualnu informaciju da se aplikacija učitava. Logika unutar aktivnosti osigurava da se nakon kratkog odmaka automatski pokrene </w:t>
+        <w:t xml:space="preserve">. Ovaj ekran služi za prikaz logotipa aplikacije i pripremu baze podataka u pozadini. Implementirana je animacija bljeskanja (engl. </w:t>
+      </w:r>
+      <w:r>
+        <w:rPr>
+          <w:i/>
+          <w:iCs/>
+        </w:rPr>
+        <w:t>fading</w:t>
+      </w:r>
+      <w:r>
+        <w:t>) nad središnjom slikom (</w:t>
       </w:r>
       <w:r>
         <w:rPr>
           <w:rStyle w:val="KdutekstuChar"/>
         </w:rPr>
+        <w:t>loading_img</w:t>
+      </w:r>
+      <w:r>
+        <w:t xml:space="preserve">), što korisniku pruža vizualnu informaciju da se aplikacija učitava. Logika unutar aktivnosti osigurava da se nakon kratkog odmaka automatski pokrene </w:t>
+      </w:r>
+      <w:r>
+        <w:rPr>
+          <w:rStyle w:val="KdutekstuChar"/>
+        </w:rPr>
         <w:t>HostActivity</w:t>
       </w:r>
       <w:r>
@@ -5111,7 +5359,7 @@
       <w:pPr>
         <w:pStyle w:val="Heading2"/>
       </w:pPr>
-      <w:bookmarkStart w:id="27" w:name="_Toc239935729"/>
+      <w:bookmarkStart w:id="27" w:name="_Toc240038134"/>
       <w:r>
         <w:lastRenderedPageBreak/>
         <w:t>Sustav organizacije jednadžbi</w:t>
@@ -5139,7 +5387,48 @@
     </w:p>
     <w:p>
       <w:r>
-        <w:t>Za lokalnu pohranu podataka odabrana je knjižnica Room, koja služi kao apstrakcijski sloj iznad SQLite baze podataka. Room omogućuje definiranje sheme baze putem čistih Kotlin klasa (entiteta), čime se postiže bolja čitljivost koda i lakše održavanje. Cjelokupni sustav temelji se na tri ključne komponente: entitetima, objektima za pristup podacima (DAO) i klasi same baze podataka koja koristi Singleton obrazac kako bi se spriječilo višestruko otvaranje konekcija nad istim resursima.</w:t>
+        <w:t>Za pohranu podataka odabrana je knjižnica Room, koja služi kao apstrakcijski sloj iznad SQLite baze podataka. Room omogućuje definiranje sheme baze putem čistih Kotlin klasa (entiteta), čime se postiže bolja čitljivost koda i lakše održavanje.</w:t>
+      </w:r>
+      <w:r>
+        <w:t xml:space="preserve"> </w:t>
+      </w:r>
+      <w:r>
+        <w:t>„</w:t>
+      </w:r>
+      <w:r>
+        <w:t>Room baza podataka je lokalna, što znači da se briše prilikom deinstalacije aplikacije i idealna je za aplikacije koje ne trebaju pohranjivati velike količine podataka i čije baze podataka nisu kompleksne.</w:t>
+      </w:r>
+      <w:r>
+        <w:t>“</w:t>
+      </w:r>
+      <w:sdt>
+        <w:sdtPr>
+          <w:id w:val="-501197123"/>
+          <w:citation/>
+        </w:sdtPr>
+        <w:sdtContent>
+          <w:r>
+            <w:fldChar w:fldCharType="begin"/>
+          </w:r>
+          <w:r>
+            <w:instrText xml:space="preserve"> CITATION Gru24 \l 1050 </w:instrText>
+          </w:r>
+          <w:r>
+            <w:fldChar w:fldCharType="separate"/>
+          </w:r>
+          <w:r>
+            <w:rPr>
+              <w:noProof/>
+            </w:rPr>
+            <w:t xml:space="preserve"> [3]</w:t>
+          </w:r>
+          <w:r>
+            <w:fldChar w:fldCharType="end"/>
+          </w:r>
+        </w:sdtContent>
+      </w:sdt>
+      <w:r>
+        <w:t xml:space="preserve"> Cjelokupni sustav temelji se na tri ključne komponente: entitetima, objektima za pristup podacima (DAO) i klasi same baze podataka koja koristi Singleton obrazac kako bi se spriječilo višestruko otvaranje konekcija nad istim resursima.</w:t>
       </w:r>
     </w:p>
     <w:p>
@@ -5163,7 +5452,17 @@
     </w:p>
     <w:p>
       <w:r>
-        <w:t>Između ova dva entiteta uspostavljena je relacija "jedan-prema-više" (engl. One-to-Many). Svaka jednadžba u bazi sadrži strani ključ (</w:t>
+        <w:t xml:space="preserve">Između ova dva entiteta uspostavljena je relacija "jedan-prema-više" (engl. </w:t>
+      </w:r>
+      <w:r>
+        <w:rPr>
+          <w:i/>
+          <w:iCs/>
+        </w:rPr>
+        <w:t>One-to-Many</w:t>
+      </w:r>
+      <w:r>
+        <w:t>). Svaka jednadžba u bazi sadrži strani ključ (</w:t>
       </w:r>
       <w:r>
         <w:rPr>
@@ -5172,7 +5471,27 @@
         <w:t>pocketId</w:t>
       </w:r>
       <w:r>
-        <w:t>) koji je povezuje s pripadajućom mapom. Kako bi se osigurala konzistentnost, implementirano je kaskadno brisanje (engl. Cascade Delete). To znači da u trenutku kada korisnik odluči obrisati određenu mapu, Android sustav automatski uklanja sve jednadžbe povezane s tom mapom, sprječavajući nakupljanje "siročadi" (engl. orphan records) u memoriji uređaja.</w:t>
+        <w:t xml:space="preserve">) koji je povezuje s pripadajućom mapom. Kako bi se osigurala konzistentnost, implementirano je kaskadno brisanje (engl. </w:t>
+      </w:r>
+      <w:r>
+        <w:rPr>
+          <w:i/>
+          <w:iCs/>
+        </w:rPr>
+        <w:t>Cascade Delete</w:t>
+      </w:r>
+      <w:r>
+        <w:t xml:space="preserve">). To znači da u trenutku kada korisnik odluči obrisati određenu mapu, Android sustav automatski uklanja sve jednadžbe povezane s tom mapom, sprječavajući nakupljanje "siročadi" (engl. </w:t>
+      </w:r>
+      <w:r>
+        <w:rPr>
+          <w:i/>
+          <w:iCs/>
+        </w:rPr>
+        <w:t>orphan records</w:t>
+      </w:r>
+      <w:r>
+        <w:t>) u memoriji uređaja.</w:t>
       </w:r>
     </w:p>
     <w:p>
@@ -5200,11 +5519,21 @@
         <w:t>isFavorite</w:t>
       </w:r>
       <w:r>
-        <w:t xml:space="preserve"> unutar entiteta Equation.</w:t>
-      </w:r>
-    </w:p>
-    <w:p>
-      <w:r>
+        <w:t xml:space="preserve"> unutar entiteta </w:t>
+      </w:r>
+      <w:r>
+        <w:rPr>
+          <w:rStyle w:val="KdutekstuChar"/>
+        </w:rPr>
+        <w:t>Equation</w:t>
+      </w:r>
+      <w:r>
+        <w:t>.</w:t>
+      </w:r>
+    </w:p>
+    <w:p>
+      <w:r>
+        <w:lastRenderedPageBreak/>
         <w:t>Prilikom postavljanja nove jednadžbe kao favorita, aktivira se posebna DAO metoda koja prvo izvršava SQL upit za resetiranje svih ostalih favorita unutar te specifične mape (</w:t>
       </w:r>
       <w:r>
@@ -5214,11 +5543,7 @@
         <w:t>UPDATE equations SET isFavorite = 0 WHERE pocketId = :id</w:t>
       </w:r>
       <w:r>
-        <w:t xml:space="preserve">). Nakon </w:t>
-      </w:r>
-      <w:r>
-        <w:lastRenderedPageBreak/>
-        <w:t>toga se odabrana stavka označava kao favorit. Ovakva logika jamči da svaka tematska mapa može imati isključivo jednu prioritetnu jednadžbu.</w:t>
+        <w:t>). Nakon toga se odabrana stavka označava kao favorit. Ovakva logika jamči da svaka tematska mapa može imati isključivo jednu prioritetnu jednadžbu.</w:t>
       </w:r>
     </w:p>
     <w:p>
@@ -5707,6 +6032,12 @@
           <w:lang w:val="en-DE"/>
         </w:rPr>
         <w:br/>
+      </w:r>
+      <w:r>
+        <w:rPr>
+          <w:lang w:val="en-DE"/>
+        </w:rPr>
+        <w:lastRenderedPageBreak/>
         <w:t xml:space="preserve">    @Delete</w:t>
       </w:r>
       <w:r>
@@ -5741,12 +6072,6 @@
           <w:lang w:val="en-DE"/>
         </w:rPr>
         <w:br/>
-      </w:r>
-      <w:r>
-        <w:rPr>
-          <w:lang w:val="en-DE"/>
-        </w:rPr>
-        <w:lastRenderedPageBreak/>
         <w:t xml:space="preserve">    @Query("UPDATE equations SET </w:t>
       </w:r>
       <w:proofErr w:type="spellStart"/>
@@ -5843,7 +6168,7 @@
           <w:lang w:val="en-DE"/>
         </w:rPr>
       </w:pPr>
-      <w:bookmarkStart w:id="28" w:name="_Toc239935921"/>
+      <w:bookmarkStart w:id="28" w:name="_Toc240038163"/>
       <w:r>
         <w:t xml:space="preserve">Kôd </w:t>
       </w:r>
@@ -5893,17 +6218,35 @@
     </w:p>
     <w:p>
       <w:r>
-        <w:t>Vizualna prezentacija i RecyclerView:</w:t>
-      </w:r>
-    </w:p>
-    <w:p>
-      <w:r>
-        <w:t>Prikaz podataka u listama izveden je pomoću RecyclerView komponente i prilagođenih adaptera (</w:t>
+        <w:t xml:space="preserve">Vizualna prezentacija i </w:t>
       </w:r>
       <w:r>
         <w:rPr>
           <w:rStyle w:val="KdutekstuChar"/>
         </w:rPr>
+        <w:t>RecyclerView</w:t>
+      </w:r>
+      <w:r>
+        <w:t>:</w:t>
+      </w:r>
+    </w:p>
+    <w:p>
+      <w:r>
+        <w:t xml:space="preserve">Prikaz podataka u listama izveden je pomoću </w:t>
+      </w:r>
+      <w:r>
+        <w:rPr>
+          <w:rStyle w:val="KdutekstuChar"/>
+        </w:rPr>
+        <w:t>RecyclerView</w:t>
+      </w:r>
+      <w:r>
+        <w:t xml:space="preserve"> komponente i prilagođenih adaptera (</w:t>
+      </w:r>
+      <w:r>
+        <w:rPr>
+          <w:rStyle w:val="KdutekstuChar"/>
+        </w:rPr>
         <w:t>PocketAdapter</w:t>
       </w:r>
       <w:r>
@@ -5920,61 +6263,81 @@
       </w:r>
       <w:r>
         <w:rPr>
+          <w:i/>
+          <w:iCs/>
+        </w:rPr>
+        <w:t>Flow</w:t>
+      </w:r>
+      <w:r>
+        <w:t xml:space="preserve"> toka podataka. To omogućuje aplikaciji da automatski osvježi sučelje (engl. </w:t>
+      </w:r>
+      <w:r>
+        <w:rPr>
+          <w:i/>
+          <w:iCs/>
+        </w:rPr>
+        <w:t>Real-time update</w:t>
+      </w:r>
+      <w:r>
+        <w:t>) čim se dogodi bilo kakva promjena u bazi podataka (dodavanje, uređivanje ili brisanje).</w:t>
+      </w:r>
+    </w:p>
+    <w:p>
+      <w:r>
+        <w:t xml:space="preserve">Logika prikazivanja jednadžbi unutar mape uključuje i automatsko sortiranje. Prilikom učitavanja liste, sustav koristi Kotlin funkciju </w:t>
+      </w:r>
+      <w:r>
+        <w:rPr>
           <w:rStyle w:val="KdutekstuChar"/>
         </w:rPr>
-        <w:t>Flow</w:t>
-      </w:r>
-      <w:r>
-        <w:t xml:space="preserve"> toka podataka. To omogućuje aplikaciji da automatski osvježi sučelje (engl. Real-time update) čim se dogodi bilo kakva promjena u bazi podataka (dodavanje, uređivanje ili brisanje).</w:t>
-      </w:r>
-    </w:p>
-    <w:p>
-      <w:r>
-        <w:t xml:space="preserve">Logika prikazivanja jednadžbi unutar mape uključuje i automatsko sortiranje. Prilikom učitavanja liste, sustav koristi Kotlin funkciju </w:t>
+        <w:t>sortedByDescending</w:t>
+      </w:r>
+      <w:r>
+        <w:t xml:space="preserve"> { </w:t>
       </w:r>
       <w:r>
         <w:rPr>
           <w:rStyle w:val="KdutekstuChar"/>
         </w:rPr>
-        <w:t>sortedByDescending</w:t>
-      </w:r>
-      <w:r>
-        <w:t xml:space="preserve"> { </w:t>
+        <w:t>it.isFavorite</w:t>
+      </w:r>
+      <w:r>
+        <w:t xml:space="preserve"> }. Ovime se postiže da jednadžba označena kao favorit uvijek zauzima prvo mjesto u listi, bez obzira na kronološki redoslijed unosa. Vizualno se favorit dodatno ističe ikonom zvjezdice unutar samog elementa liste (</w:t>
       </w:r>
       <w:r>
         <w:rPr>
           <w:rStyle w:val="KdutekstuChar"/>
         </w:rPr>
-        <w:t>it.isFavorite</w:t>
-      </w:r>
-      <w:r>
-        <w:t xml:space="preserve"> }. Ovime se postiže da jednadžba označena kao favorit uvijek zauzima prvo mjesto u listi, bez obzira na kronološki redoslijed unosa. Vizualno se favorit dodatno ističe ikonom zvjezdice unutar samog elementa liste (</w:t>
+        <w:t>equation_item.xml</w:t>
+      </w:r>
+      <w:r>
+        <w:t>), čime se korisniku pruža trenutačna informacija o najvažnijem sadržaju u mapi.</w:t>
+      </w:r>
+    </w:p>
+    <w:p>
+      <w:r>
+        <w:t>CRUD operacije i korisničko sučelje:</w:t>
+      </w:r>
+    </w:p>
+    <w:p>
+      <w:r>
+        <w:t xml:space="preserve">Upravljanje jednadžbama (dodavanje, pregled, uređivanje i brisanje) izvedeno je kroz modalne dijaloge i kontekstualne izbornike. Dugim pritiskom na stavku u listi, otvara se </w:t>
       </w:r>
       <w:r>
         <w:rPr>
           <w:rStyle w:val="KdutekstuChar"/>
         </w:rPr>
-        <w:t>equation_item.xml</w:t>
-      </w:r>
-      <w:r>
-        <w:t>), čime se korisniku pruža trenutačna informacija o najvažnijem sadržaju u mapi.</w:t>
-      </w:r>
-    </w:p>
-    <w:p>
-      <w:r>
-        <w:t>CRUD operacije i korisničko sučelje:</w:t>
-      </w:r>
-    </w:p>
-    <w:p>
-      <w:r>
-        <w:t>Upravljanje jednadžbama (dodavanje, pregled, uređivanje i brisanje) izvedeno je kroz modalne dijaloge i kontekstualne izbornike. Dugim pritiskom na stavku u listi, otvara se AlertDialog koji korisniku nudi opcije za modifikaciju postojećeg zapisa. Ovakav pristup omogućuje brzo ispravljanje eventualnih pogrešaka u formuli bez potrebe za navigacijom na nove ekrane, čime se značajno poboljšava korisničko iskustvo.</w:t>
+        <w:t>AlertDialog</w:t>
+      </w:r>
+      <w:r>
+        <w:t xml:space="preserve"> koji korisniku nudi opcije za modifikaciju postojećeg zapisa. Ovakav pristup omogućuje brzo ispravljanje eventualnih pogrešaka u formuli bez potrebe za navigacijom na nove ekrane, čime se značajno poboljšava korisničko iskustvo.</w:t>
       </w:r>
     </w:p>
     <w:p>
       <w:pPr>
         <w:pStyle w:val="Heading2"/>
       </w:pPr>
-      <w:bookmarkStart w:id="29" w:name="_Toc239935730"/>
+      <w:bookmarkStart w:id="29" w:name="_Toc240038135"/>
       <w:r>
         <w:t>Modul za unos podataka i integracija postojećih OCR funkcionalnosti</w:t>
       </w:r>
@@ -5982,12 +6345,25 @@
     </w:p>
     <w:p>
       <w:r>
-        <w:t>Modul za unos podataka predstavlja jednu od najkompleksnijih komponenti aplikacije, osmišljenu kako bi se maksimalno smanjila potreba za ručnim prepisivanjem dugačkih matematičkih izraza. Sustav podržava dva komplementarna načina unosa: manualni putem prilagođene tipkovnice i automatizirani putem optičkog prepoznavanja znakova (engl. Optical Character Recognition, skraćeno OCR).</w:t>
-      </w:r>
-    </w:p>
-    <w:p>
+        <w:t xml:space="preserve">Modul za unos podataka predstavlja jednu od najkompleksnijih komponenti aplikacije, osmišljenu kako bi se maksimalno smanjila potreba za ručnim prepisivanjem dugačkih matematičkih izraza. Sustav podržava dva komplementarna načina unosa: manualni putem </w:t>
+      </w:r>
       <w:r>
         <w:lastRenderedPageBreak/>
+        <w:t xml:space="preserve">prilagođene tipkovnice i automatizirani putem optičkog prepoznavanja znakova (engl. </w:t>
+      </w:r>
+      <w:r>
+        <w:rPr>
+          <w:i/>
+          <w:iCs/>
+        </w:rPr>
+        <w:t>Optical Character Recognition</w:t>
+      </w:r>
+      <w:r>
+        <w:t>, skraćeno OCR).</w:t>
+      </w:r>
+    </w:p>
+    <w:p>
+      <w:r>
         <w:t>Implementacija CameraX preview sučelja:</w:t>
       </w:r>
     </w:p>
@@ -6007,7 +6383,26 @@
     </w:p>
     <w:p>
       <w:r>
-        <w:t>Logika upravljanja kamerom bazirana je na objektu ProcessCameraProvider koji omogućuje povezivanje životnog ciklusa kamere s životnim ciklusom samog fragmenta. Ovim je postignuto da se resursi kamere automatski oslobađaju čim korisnik napusti ekran, čime se optimizira potrošnja baterije. Uz sam prikaz, u sučelje su dodane kontrole za bljeskalicu (engl. Torch mode) i digitalno zumiranje na dodir, što je nužno za postizanje oštrine potrebne za očitavanje sitnih matematičkih simbola.</w:t>
+        <w:t xml:space="preserve">Logika upravljanja kamerom bazirana je na objektu </w:t>
+      </w:r>
+      <w:r>
+        <w:rPr>
+          <w:rStyle w:val="KdutekstuChar"/>
+        </w:rPr>
+        <w:t>ProcessCameraProvider</w:t>
+      </w:r>
+      <w:r>
+        <w:t xml:space="preserve"> koji omogućuje povezivanje životnog ciklusa kamere s životnim ciklusom samog fragmenta. Ovim je postignuto da se resursi kamere automatski oslobađaju čim korisnik napusti ekran, čime se optimizira potrošnja baterije. Uz sam prikaz, u sučelje su dodane kontrole za bljeskalicu (engl. </w:t>
+      </w:r>
+      <w:r>
+        <w:rPr>
+          <w:i/>
+          <w:iCs/>
+        </w:rPr>
+        <w:t>Torch mode</w:t>
+      </w:r>
+      <w:r>
+        <w:t>) i digitalno zumiranje na dodir, što je nužno za postizanje oštrine potrebne za očitavanje sitnih matematičkih simbola.</w:t>
       </w:r>
     </w:p>
     <w:p>
@@ -6031,11 +6426,94 @@
         <w:t>ImageAnalysis</w:t>
       </w:r>
       <w:r>
-        <w:t xml:space="preserve"> analizatora. Svaki frejm (engl. frame) slike koji kamera proizvede šalje se u procesor koji detektira blokove teksta, linije i pojedinačne znakove. Ključni izazov kod mobilnih kamera je rotacija slike u memoriji, koja je najčešće pod kutom od 90 stupnjeva u odnosu na ekran. Kako bi sustav bio precizan, implementirana je logika mapiranja koordinata (engl. Coordinate Mapping) koja osigurava da aplikacija analizira isključivo onaj tekst koji se nalazi unutar bijelog pravokutnog okvira definiranog u UI-u (viewfinder_border.xml). Ovaj </w:t>
+        <w:t xml:space="preserve"> analizatora. Svaki frejm (engl. </w:t>
+      </w:r>
+      <w:r>
+        <w:rPr>
+          <w:i/>
+          <w:iCs/>
+        </w:rPr>
+        <w:t>frame</w:t>
+      </w:r>
+      <w:r>
+        <w:t>) slike koji kamera proizvede šalje se u procesor koji detektira blokove teksta, linije i pojedinačne znakove.</w:t>
+      </w:r>
+    </w:p>
+    <w:p>
+      <w:r>
+        <w:t>„Ako operacija prepoznavanja teksta uspije, objekt Text (/android/reference/com/google/mlkit/vision/text/Text) prosljeđuje se slušaču uspjeha (</w:t>
+      </w:r>
+      <w:r>
+        <w:rPr>
+          <w:i/>
+          <w:iCs/>
+        </w:rPr>
+        <w:t>success listener</w:t>
+      </w:r>
+      <w:r>
+        <w:t>). Objekt Text sadrži cjelokupni tekst prepoznat na slici te nula ili više objekata TextBlock (/android/reference/com/google/mlkit/vision/text/Text.TextBlock).“</w:t>
+      </w:r>
+      <w:sdt>
+        <w:sdtPr>
+          <w:id w:val="1696184353"/>
+          <w:citation/>
+        </w:sdtPr>
+        <w:sdtContent>
+          <w:r>
+            <w:fldChar w:fldCharType="begin"/>
+          </w:r>
+          <w:r>
+            <w:instrText xml:space="preserve"> CITATION Goo26 \l 1050 </w:instrText>
+          </w:r>
+          <w:r>
+            <w:fldChar w:fldCharType="separate"/>
+          </w:r>
+          <w:r>
+            <w:rPr>
+              <w:noProof/>
+            </w:rPr>
+            <w:t xml:space="preserve"> [4]</w:t>
+          </w:r>
+          <w:r>
+            <w:fldChar w:fldCharType="end"/>
+          </w:r>
+        </w:sdtContent>
+      </w:sdt>
+      <w:r>
+        <w:t xml:space="preserve"> Ključni izazov kod mobilnih kamera je rotacija slike u memoriji, koja je najčešće pod kutom od 90 stupnjeva u odnosu na ekran. Kako bi sustav bio precizan, implementirana je logika mapiranja koordinata (engl. </w:t>
+      </w:r>
+      <w:r>
+        <w:rPr>
+          <w:i/>
+          <w:iCs/>
+        </w:rPr>
+        <w:t>Coordinate Mapping</w:t>
+      </w:r>
+      <w:r>
+        <w:t>) koja osigurava da aplikacija analizira isključivo onaj tekst koji se nalazi unutar bijelog pravokutnog okvira definiranog u UI-u (</w:t>
+      </w:r>
+      <w:r>
+        <w:rPr>
+          <w:rStyle w:val="KdutekstuChar"/>
+        </w:rPr>
+        <w:t>viewfinder_border.xml</w:t>
+      </w:r>
+      <w:r>
+        <w:t xml:space="preserve">). Ovaj centralizirani pristup (engl. </w:t>
+      </w:r>
+      <w:r>
+        <w:rPr>
+          <w:i/>
+          <w:iCs/>
+        </w:rPr>
+        <w:t>Region of Interest</w:t>
+      </w:r>
+      <w:r>
+        <w:t xml:space="preserve">) </w:t>
       </w:r>
       <w:r>
         <w:lastRenderedPageBreak/>
-        <w:t xml:space="preserve">centralizirani pristup (engl. Region of Interest) značajno smanjuje "šum" i povećava preciznost </w:t>
+        <w:t xml:space="preserve">značajno smanjuje "šum" i povećava preciznost </w:t>
       </w:r>
       <w:r>
         <w:rPr>
@@ -6082,7 +6560,7 @@
                             <w:pPr>
                               <w:pStyle w:val="Caption"/>
                             </w:pPr>
-                            <w:bookmarkStart w:id="30" w:name="_Toc239935900"/>
+                            <w:bookmarkStart w:id="30" w:name="_Toc240038157"/>
                             <w:r>
                               <w:t xml:space="preserve">Slika </w:t>
                             </w:r>
@@ -6156,7 +6634,7 @@
                       <w:pPr>
                         <w:pStyle w:val="Caption"/>
                       </w:pPr>
-                      <w:bookmarkStart w:id="31" w:name="_Toc239935900"/>
+                      <w:bookmarkStart w:id="31" w:name="_Toc240038157"/>
                       <w:r>
                         <w:t xml:space="preserve">Slika </w:t>
                       </w:r>
@@ -6286,7 +6764,19 @@
     </w:p>
     <w:p>
       <w:r>
-        <w:t>Budući da su standardni OCR algoritmi primarno optimizirani za prepoznavanje prirodnog jezika, a ne matematičke notacije, bilo je potrebno implementirati poseban sloj logike za pročišćavanje rezultata. Nakon što ML Kit vrati detektirani tekstualni niz, on prolazi kroz niz filtara u jeziku Kotlin.</w:t>
+        <w:t>Budući da su standardni OCR algoritmi primarno optimizirani za prepoznavanje prirodnog jezika, a ne matematičk</w:t>
+      </w:r>
+      <w:r>
+        <w:t>og</w:t>
+      </w:r>
+      <w:r>
+        <w:t xml:space="preserve"> </w:t>
+      </w:r>
+      <w:r>
+        <w:t>zapisa</w:t>
+      </w:r>
+      <w:r>
+        <w:t>, bilo je potrebno implementirati poseban sloj logike za pročišćavanje rezultata. Nakon što ML Kit vrati detektirani tekstualni niz, on prolazi kroz niz filtara u jeziku Kotlin.</w:t>
       </w:r>
     </w:p>
     <w:p>
@@ -8062,7 +8552,7 @@
           <w:lang w:val="en-DE"/>
         </w:rPr>
       </w:pPr>
-      <w:bookmarkStart w:id="32" w:name="_Toc239935922"/>
+      <w:bookmarkStart w:id="32" w:name="_Toc240038164"/>
       <w:r>
         <w:t xml:space="preserve">Kôd </w:t>
       </w:r>
@@ -8149,7 +8639,7 @@
       <w:pPr>
         <w:pStyle w:val="Heading2"/>
       </w:pPr>
-      <w:bookmarkStart w:id="33" w:name="_Toc239935731"/>
+      <w:bookmarkStart w:id="33" w:name="_Toc240038136"/>
       <w:r>
         <w:t>Algoritam za parsiranje niza znakova i izgradnju stabla</w:t>
       </w:r>
@@ -8157,7 +8647,27 @@
     </w:p>
     <w:p>
       <w:r>
-        <w:t>Srž matematičke inteligencije aplikacije EquationPocket leži u njezinoj sposobnosti da interpretira niz znakova (engl. String) ne samo kao tekst, već kao kompleksnu matematičku strukturu. Ovaj proces transformacije naziva se parsiranje, a njegov krajnji rezultat je izgradnja apstraktnog sintaktičkog stabla (engl. Abstract Syntax Tree, skraćeno AST).</w:t>
+        <w:t xml:space="preserve">Srž matematičke inteligencije aplikacije EquationPocket leži u njezinoj sposobnosti da interpretira niz znakova (engl. </w:t>
+      </w:r>
+      <w:r>
+        <w:rPr>
+          <w:i/>
+          <w:iCs/>
+        </w:rPr>
+        <w:t>String</w:t>
+      </w:r>
+      <w:r>
+        <w:t xml:space="preserve">) ne samo kao tekst, već kao kompleksnu matematičku strukturu. Ovaj proces transformacije naziva se parsiranje, a njegov krajnji rezultat je izgradnja apstraktnog sintaktičkog stabla (engl. </w:t>
+      </w:r>
+      <w:r>
+        <w:rPr>
+          <w:i/>
+          <w:iCs/>
+        </w:rPr>
+        <w:t>Abstract Syntax Tree</w:t>
+      </w:r>
+      <w:r>
+        <w:t>, skraćeno AST).</w:t>
       </w:r>
     </w:p>
     <w:p>
@@ -8229,7 +8739,7 @@
                                 <w:noProof/>
                               </w:rPr>
                             </w:pPr>
-                            <w:bookmarkStart w:id="34" w:name="_Toc239935901"/>
+                            <w:bookmarkStart w:id="34" w:name="_Toc240038158"/>
                             <w:r>
                               <w:t xml:space="preserve">Slika </w:t>
                             </w:r>
@@ -8306,7 +8816,7 @@
                           <w:noProof/>
                         </w:rPr>
                       </w:pPr>
-                      <w:bookmarkStart w:id="35" w:name="_Toc239935901"/>
+                      <w:bookmarkStart w:id="35" w:name="_Toc240038158"/>
                       <w:r>
                         <w:t xml:space="preserve">Slika </w:t>
                       </w:r>
@@ -8457,7 +8967,7 @@
       <w:pPr>
         <w:pStyle w:val="Heading2"/>
       </w:pPr>
-      <w:bookmarkStart w:id="36" w:name="_Toc239935732"/>
+      <w:bookmarkStart w:id="36" w:name="_Toc240038137"/>
       <w:r>
         <w:t>Dinamičko generiranje ulaznih polja i kalkulator nepoznanica</w:t>
       </w:r>
@@ -8471,7 +8981,13 @@
         <w:t>Solvera</w:t>
       </w:r>
       <w:r>
-        <w:t>, koji omogućuje transformaciju statičnog zapisa jednadžbe u interaktivni obrazac. Ovaj proces započinje preciznom detekcijom varijabli unutar tekstualnog niza formule. Kako bi sustav ispravno identificirao samo one simbole koji predstavljaju fizikalne ili matematičke parametre, implementirana je logika temeljena na regularnim izrazima koja analizira tekst, ali istovremeno provjerava listu rezerviranih riječi. Tim postupkom osigurano je da nazivi standardnih funkcija, poput trigonometrijskih operacija ili logaritama, ne budu tretirani kao polja za unos, već kao dio matematičke operacije.</w:t>
+        <w:t>, koji omogućuje transformaciju statičnog zapisa jednadžbe u interaktivni obrazac</w:t>
+      </w:r>
+      <w:r>
+        <w:t xml:space="preserve"> što je prikazano na Slici 5.4</w:t>
+      </w:r>
+      <w:r>
+        <w:t>. Ovaj proces započinje preciznom detekcijom varijabli unutar tekstualnog niza formule. Kako bi sustav ispravno identificirao samo one simbole koji predstavljaju fizikalne ili matematičke parametre, implementirana je logika temeljena na regularnim izrazima koja analizira tekst, ali istovremeno provjerava listu rezerviranih riječi. Tim postupkom osigurano je da nazivi standardnih funkcija, poput trigonometrijskih operacija ili logaritama, ne budu tretirani kao polja za unos, već kao dio matematičke operacije.</w:t>
       </w:r>
     </w:p>
     <w:p>
@@ -8485,7 +9001,29 @@
         <w:t>SolverFragment</w:t>
       </w:r>
       <w:r>
-        <w:t xml:space="preserve"> klase pokreće se postupak programskog generiranja elemenata sučelja. Umjesto statičkog definiranja polja u XML datoteci, aplikacija dinamički kreira horizontalne redove koristeći LinearLayout komponente. Svaki red sastoji se od tekstualnog prikaza naziva varijable (npr. m =) fiksne širine radi urednijeg poravnanja, te TextInputEditText polja za unos vrijednosti. Ovakav pristup omogućuje aplikaciji da se trenutačno prilagodi bilo kojoj jednadžbi, bez obzira na broj parametara koje ona sadrži. Posebna pažnja posvećena je korisničkom iskustvu tako što je za ova polja onemogućena pojava standardne sistemske tipkovnice, čime se osigurava da naša specijalizirana znanstvena tastatura ostane primarni alat za unos, sprječavajući pritom preklapanje elemenata na ekranu.</w:t>
+        <w:t xml:space="preserve"> klase pokreće se postupak programskog generiranja elemenata sučelja. Umjesto statičkog definiranja polja u XML datoteci, aplikacija dinamički kreira horizontalne redove koristeći </w:t>
+      </w:r>
+      <w:r>
+        <w:rPr>
+          <w:rStyle w:val="KdutekstuChar"/>
+        </w:rPr>
+        <w:t>LinearLayout</w:t>
+      </w:r>
+      <w:r>
+        <w:t xml:space="preserve"> komponente. Svaki red sastoji se od tekstualnog prikaza naziva varijable (npr. m =) fiksne širine radi urednijeg poravnanja, te </w:t>
+      </w:r>
+      <w:r>
+        <w:rPr>
+          <w:rStyle w:val="KdutekstuChar"/>
+        </w:rPr>
+        <w:t>TextInputEditText</w:t>
+      </w:r>
+      <w:r>
+        <w:t xml:space="preserve"> polja za unos vrijednosti. Ovakav pristup omogućuje aplikaciji da se trenutačno prilagodi bilo kojoj jednadžbi, bez obzira na broj parametara koje ona sadrži. Posebna pažnja posvećena je korisničkom iskustvu tako što je za ova polja onemogućena pojava standardne sistemske </w:t>
+      </w:r>
+      <w:r>
+        <w:lastRenderedPageBreak/>
+        <w:t>tipkovnice, čime se osigurava da naša specijalizirana znanstvena tastatura ostane primarni alat za unos, sprječavajući pritom preklapanje elemenata na ekranu.</w:t>
       </w:r>
     </w:p>
     <w:p>
@@ -8493,7 +9031,6 @@
         <w:rPr>
           <w:noProof/>
         </w:rPr>
-        <w:lastRenderedPageBreak/>
         <mc:AlternateContent>
           <mc:Choice Requires="wps">
             <w:drawing>
@@ -8538,7 +9075,7 @@
                                 <w:noProof/>
                               </w:rPr>
                             </w:pPr>
-                            <w:bookmarkStart w:id="37" w:name="_Toc239935902"/>
+                            <w:bookmarkStart w:id="37" w:name="_Toc240038159"/>
                             <w:r>
                               <w:t xml:space="preserve">Slika </w:t>
                             </w:r>
@@ -8615,7 +9152,7 @@
                           <w:noProof/>
                         </w:rPr>
                       </w:pPr>
-                      <w:bookmarkStart w:id="38" w:name="_Toc239935902"/>
+                      <w:bookmarkStart w:id="38" w:name="_Toc240038159"/>
                       <w:r>
                         <w:t xml:space="preserve">Slika </w:t>
                       </w:r>
@@ -8737,7 +9274,17 @@
     </w:p>
     <w:p>
       <w:r>
-        <w:t>Logika samog izračuna temelji se na principu prepoznavanja praznog polja. U trenutku aktivacije naredbe za izračun, sustav prolazi kroz sva generirana polja i prikuplja unesene vrijednosti. Ako aplikacija detektira da je točno jedno polje ostavljeno prazno, ono se automatski definira kao tražena nepoznanica. Sustav tada konstruira specifičan upit prema Symja engine-u koristeći format Solve(lijeva_strana == desna_strana, nepoznanica).</w:t>
+        <w:t xml:space="preserve">Logika samog izračuna temelji se na principu prepoznavanja praznog polja. U trenutku aktivacije naredbe za izračun, sustav prolazi kroz sva generirana polja i prikuplja unesene vrijednosti. Ako aplikacija detektira da je točno jedno polje ostavljeno prazno, ono se </w:t>
+      </w:r>
+      <w:r>
+        <w:lastRenderedPageBreak/>
+        <w:t>automatski definira kao tražena nepoznanica. Sustav tada konstruira specifičan upit prema Symja engine-u koristeći format Solve</w:t>
+      </w:r>
+      <w:r>
+        <w:t xml:space="preserve"> </w:t>
+      </w:r>
+      <w:r>
+        <w:t>(lijeva_strana == desna_strana, nepoznanica).</w:t>
       </w:r>
     </w:p>
     <w:p>
@@ -8752,10 +9299,10 @@
         <w:rPr>
           <w:lang w:val="en-DE"/>
         </w:rPr>
-        <w:lastRenderedPageBreak/>
         <w:t xml:space="preserve">private fun </w:t>
       </w:r>
       <w:proofErr w:type="spellStart"/>
+      <w:proofErr w:type="gramStart"/>
       <w:r>
         <w:rPr>
           <w:lang w:val="en-DE"/>
@@ -8767,7 +9314,14 @@
         <w:rPr>
           <w:lang w:val="en-DE"/>
         </w:rPr>
-        <w:t>(formula: String) {</w:t>
+        <w:t>(</w:t>
+      </w:r>
+      <w:proofErr w:type="gramEnd"/>
+      <w:r>
+        <w:rPr>
+          <w:lang w:val="en-DE"/>
+        </w:rPr>
+        <w:t>formula: String) {</w:t>
       </w:r>
       <w:r>
         <w:rPr>
@@ -9811,6 +10365,7 @@
         <w:rPr>
           <w:lang w:val="en-DE"/>
         </w:rPr>
+        <w:lastRenderedPageBreak/>
         <w:br/>
         <w:t xml:space="preserve">            // </w:t>
       </w:r>
@@ -9897,12 +10452,6 @@
           <w:lang w:val="en-DE"/>
         </w:rPr>
         <w:br/>
-      </w:r>
-      <w:r>
-        <w:rPr>
-          <w:lang w:val="en-DE"/>
-        </w:rPr>
-        <w:lastRenderedPageBreak/>
         <w:t xml:space="preserve">            </w:t>
       </w:r>
       <w:proofErr w:type="spellStart"/>
@@ -10845,6 +11394,12 @@
           <w:lang w:val="en-DE"/>
         </w:rPr>
         <w:br/>
+      </w:r>
+      <w:r>
+        <w:rPr>
+          <w:lang w:val="en-DE"/>
+        </w:rPr>
+        <w:lastRenderedPageBreak/>
         <w:t xml:space="preserve">                else -&gt; {</w:t>
       </w:r>
       <w:r>
@@ -10902,12 +11457,6 @@
           <w:lang w:val="en-DE"/>
         </w:rPr>
         <w:br/>
-      </w:r>
-      <w:r>
-        <w:rPr>
-          <w:lang w:val="en-DE"/>
-        </w:rPr>
-        <w:lastRenderedPageBreak/>
         <w:t xml:space="preserve">                    </w:t>
       </w:r>
       <w:r>
@@ -11960,6 +12509,7 @@
         <w:rPr>
           <w:lang w:val="en-DE"/>
         </w:rPr>
+        <w:lastRenderedPageBreak/>
         <w:t>inputsMap.entries.</w:t>
       </w:r>
       <w:r>
@@ -12071,7 +12621,6 @@
         <w:rPr>
           <w:lang w:val="en-DE"/>
         </w:rPr>
-        <w:lastRenderedPageBreak/>
         <w:t>HistoryEntry</w:t>
       </w:r>
       <w:proofErr w:type="spellEnd"/>
@@ -12476,7 +13025,7 @@
         <w:ind w:left="2160" w:firstLine="720"/>
         <w:jc w:val="left"/>
       </w:pPr>
-      <w:bookmarkStart w:id="39" w:name="_Toc239935923"/>
+      <w:bookmarkStart w:id="39" w:name="_Toc240038165"/>
       <w:r>
         <w:t xml:space="preserve">Kôd </w:t>
       </w:r>
@@ -12547,8 +13096,9 @@
       <w:pPr>
         <w:pStyle w:val="Heading2"/>
       </w:pPr>
-      <w:bookmarkStart w:id="40" w:name="_Toc239935733"/>
-      <w:r>
+      <w:bookmarkStart w:id="40" w:name="_Toc240038138"/>
+      <w:r>
+        <w:lastRenderedPageBreak/>
         <w:t>Implementacija modula za iscrtavanje grafova</w:t>
       </w:r>
       <w:bookmarkEnd w:id="40"/>
@@ -12561,11 +13111,7 @@
         <w:t>Solver</w:t>
       </w:r>
       <w:r>
-        <w:t xml:space="preserve">. Primarna svrha ovog modula je omogućiti korisniku uočavanje trendova i odnosa između varijabli unutar iste sesije izračuna. Tehnička realizacija vizualizacije temelji </w:t>
-      </w:r>
-      <w:r>
-        <w:lastRenderedPageBreak/>
-        <w:t xml:space="preserve">se na </w:t>
+        <w:t xml:space="preserve">. Primarna svrha ovog modula je omogućiti korisniku uočavanje trendova i odnosa između varijabli unutar iste sesije izračuna. Tehnička realizacija vizualizacije temelji se na </w:t>
       </w:r>
       <w:r>
         <w:t>biblioteci</w:t>
@@ -12585,15 +13131,15 @@
           <w:noProof/>
         </w:rPr>
         <w:drawing>
-          <wp:anchor distT="0" distB="0" distL="114300" distR="114300" simplePos="0" relativeHeight="251676672" behindDoc="0" locked="0" layoutInCell="1" allowOverlap="1" wp14:anchorId="5EB1C866" wp14:editId="7ACDF26A">
+          <wp:anchor distT="0" distB="0" distL="114300" distR="114300" simplePos="0" relativeHeight="251676672" behindDoc="0" locked="0" layoutInCell="1" allowOverlap="1" wp14:anchorId="5EB1C866" wp14:editId="46C060D4">
             <wp:simplePos x="0" y="0"/>
             <wp:positionH relativeFrom="page">
-              <wp:align>center</wp:align>
+              <wp:posOffset>2428875</wp:posOffset>
             </wp:positionH>
             <wp:positionV relativeFrom="paragraph">
-              <wp:posOffset>2023745</wp:posOffset>
+              <wp:posOffset>1153160</wp:posOffset>
             </wp:positionV>
-            <wp:extent cx="2705100" cy="5534025"/>
+            <wp:extent cx="2705100" cy="5153025"/>
             <wp:effectExtent l="0" t="0" r="0" b="9525"/>
             <wp:wrapTopAndBottom/>
             <wp:docPr id="497800166" name="Picture 7"/>
@@ -12622,7 +13168,7 @@
                   <pic:spPr>
                     <a:xfrm>
                       <a:off x="0" y="0"/>
-                      <a:ext cx="2705100" cy="5534025"/>
+                      <a:ext cx="2705100" cy="5153025"/>
                     </a:xfrm>
                     <a:prstGeom prst="rect">
                       <a:avLst/>
@@ -12688,7 +13234,7 @@
                                 <w:noProof/>
                               </w:rPr>
                             </w:pPr>
-                            <w:bookmarkStart w:id="41" w:name="_Toc239935903"/>
+                            <w:bookmarkStart w:id="41" w:name="_Toc240038160"/>
                             <w:r>
                               <w:t xml:space="preserve">Slika </w:t>
                             </w:r>
@@ -12762,7 +13308,7 @@
                           <w:noProof/>
                         </w:rPr>
                       </w:pPr>
-                      <w:bookmarkStart w:id="42" w:name="_Toc239935903"/>
+                      <w:bookmarkStart w:id="42" w:name="_Toc240038160"/>
                       <w:r>
                         <w:t xml:space="preserve">Slika </w:t>
                       </w:r>
@@ -12834,12 +13380,15 @@
         <w:t>pokrene</w:t>
       </w:r>
       <w:r>
-        <w:t xml:space="preserve"> izračun, sustav sprema objekt koji sadrži mapu ulaznih parametara i dobiveni rezultat. Prije prelaska na ekran s grafom, korisnik putem konfiguracijskog dijaloga odabire jednu od ulaznih varijabli koja će služiti kao nezavisna varijabla na apscisi (X-os), dok se rezultat jednadžbe fiksno mapira na ordinatu (Y-os).</w:t>
-      </w:r>
-    </w:p>
-    <w:p>
+        <w:t xml:space="preserve"> izračun, sustav sprema objekt koji sadrži mapu ulaznih parametara i dobiveni rezultat. Prije prelaska na ekran s grafom, korisnik putem konfiguracijskog dijaloga odabire jednu od ulaznih varijabli koja će služiti </w:t>
+      </w:r>
       <w:r>
         <w:lastRenderedPageBreak/>
+        <w:t>kao nezavisna varijabla na apscisi (X-os), dok se rezultat jednadžbe fiksno mapira na ordinatu (Y-os).</w:t>
+      </w:r>
+    </w:p>
+    <w:p>
+      <w:r>
         <w:t xml:space="preserve">Jedan od ključnih tehničkih izazova u ovom koraku bilo je ispravno parsiranje podataka. Budući da </w:t>
       </w:r>
       <w:r>
@@ -12860,7 +13409,8 @@
       </w:r>
       <w:r>
         <w:rPr>
-          <w:rStyle w:val="KdutekstuChar"/>
+          <w:i/>
+          <w:iCs/>
         </w:rPr>
         <w:t>CUBIC_BEZIER</w:t>
       </w:r>
@@ -12869,7 +13419,17 @@
       </w:r>
       <w:r>
         <w:lastRenderedPageBreak/>
-        <w:t xml:space="preserve">diskretnim sjenčanjem površine ispod krivulje (engl. fill) te jasno istaknutim markerima na </w:t>
+        <w:t xml:space="preserve">diskretnim sjenčanjem površine ispod krivulje (engl. </w:t>
+      </w:r>
+      <w:r>
+        <w:rPr>
+          <w:i/>
+          <w:iCs/>
+        </w:rPr>
+        <w:t>fill</w:t>
+      </w:r>
+      <w:r>
+        <w:t xml:space="preserve">) te jasno istaknutim markerima na </w:t>
       </w:r>
       <w:r>
         <w:rPr>
@@ -12916,7 +13476,7 @@
                             <w:pPr>
                               <w:pStyle w:val="Caption"/>
                             </w:pPr>
-                            <w:bookmarkStart w:id="43" w:name="_Toc239935904"/>
+                            <w:bookmarkStart w:id="43" w:name="_Toc240038161"/>
                             <w:r>
                               <w:t xml:space="preserve">Slika </w:t>
                             </w:r>
@@ -12987,7 +13547,7 @@
                       <w:pPr>
                         <w:pStyle w:val="Caption"/>
                       </w:pPr>
-                      <w:bookmarkStart w:id="44" w:name="_Toc239935904"/>
+                      <w:bookmarkStart w:id="44" w:name="_Toc240038161"/>
                       <w:r>
                         <w:t xml:space="preserve">Slika </w:t>
                       </w:r>
@@ -13109,7 +13669,13 @@
     </w:p>
     <w:p>
       <w:r>
-        <w:t>Rješavanje problema ekstremnih raspona (Logaritamska skala):</w:t>
+        <w:t>Rješavanje problema ekstremnih raspona (</w:t>
+      </w:r>
+      <w:r>
+        <w:t>l</w:t>
+      </w:r>
+      <w:r>
+        <w:t>ogaritamska skala):</w:t>
       </w:r>
     </w:p>
     <w:p>
@@ -13139,7 +13705,7 @@
       <w:pPr>
         <w:pStyle w:val="Heading2"/>
       </w:pPr>
-      <w:bookmarkStart w:id="45" w:name="_Toc239935734"/>
+      <w:bookmarkStart w:id="45" w:name="_Toc240038139"/>
       <w:r>
         <w:t>Razvoj vodiča za nove korisnike</w:t>
       </w:r>
@@ -13169,28 +13735,81 @@
         <w:t xml:space="preserve"> klase, koja služi kao početni ekran aplikacije, implementirana je provjera stanja lokalne Room baze podataka. Koristeći Kotlin </w:t>
       </w:r>
       <w:r>
+        <w:t>f</w:t>
+      </w:r>
+      <w:r>
+        <w:t>low</w:t>
+      </w:r>
+      <w:r>
+        <w:t xml:space="preserve"> i funkciju first(), aplikacija pri svakom pokretanju analizira postoji li barem jedna spremljena mapa.</w:t>
+      </w:r>
+    </w:p>
+    <w:p>
+      <w:r>
+        <w:t>U slučaju da je baza podataka potpuno prazna, sustav to interpretira kao prvo pokretanje aplikacije i automatski inicira prikaz tutoriala. Ovakav pristup osigurava da se iskusni korisnici, koji već imaju organiziran sadržaj, ne ometaju suvišnim obavijestima, dok se početnicima trenutačno pruža potrebna pomoć.</w:t>
+      </w:r>
+    </w:p>
+    <w:p>
+      <w:r>
+        <w:t>Implementacija interaktivnog pop-upa:</w:t>
+      </w:r>
+    </w:p>
+    <w:p>
+      <w:r>
+        <w:t xml:space="preserve">Sam vodič realiziran je kao prilagođeni </w:t>
+      </w:r>
+      <w:r>
         <w:rPr>
           <w:rStyle w:val="KdutekstuChar"/>
         </w:rPr>
-        <w:t>Flow</w:t>
-      </w:r>
-      <w:r>
-        <w:t xml:space="preserve"> i funkciju first(), aplikacija pri svakom pokretanju analizira postoji li barem jedna spremljena mapa.</w:t>
-      </w:r>
-    </w:p>
-    <w:p>
-      <w:r>
-        <w:t>U slučaju da je baza podataka potpuno prazna, sustav to interpretira kao prvo pokretanje aplikacije i automatski inicira prikaz tutoriala. Ovakav pristup osigurava da se iskusni korisnici, koji već imaju organiziran sadržaj, ne ometaju suvišnim obavijestima, dok se početnicima trenutačno pruža potrebna pomoć.</w:t>
-      </w:r>
-    </w:p>
-    <w:p>
-      <w:r>
-        <w:t>Implementacija interaktivnog pop-upa:</w:t>
-      </w:r>
-    </w:p>
-    <w:p>
-      <w:r>
-        <w:t>Sam vodič realiziran je kao prilagođeni AlertDialog koji koristi namjenski XML layout (dialog_tutorial.xml). Za razliku od standardnih tekstualnih poruka, ovaj pop-up sadrži niz od tri vizualna prikaza koji simuliraju rad u aplikaciji. Svaka slika u nizu nosi specifičnu informaciju.</w:t>
+        <w:t>AlertDialog</w:t>
+      </w:r>
+      <w:r>
+        <w:t xml:space="preserve"> koji koristi namjenski XML layout (</w:t>
+      </w:r>
+      <w:r>
+        <w:rPr>
+          <w:rStyle w:val="KdutekstuChar"/>
+        </w:rPr>
+        <w:t>dialog_tutorial.xml</w:t>
+      </w:r>
+      <w:r>
+        <w:t xml:space="preserve">). </w:t>
+      </w:r>
+      <w:r>
+        <w:t>„Dijalozi su povišeni korisnički elementi koji preuzimaju potpunu usredotočenost zaslona. Često se koriste za informiranje korisnika o nekom stanju, kao što je poruka o pogrešci.“</w:t>
+      </w:r>
+      <w:sdt>
+        <w:sdtPr>
+          <w:id w:val="-1626452927"/>
+          <w:citation/>
+        </w:sdtPr>
+        <w:sdtContent>
+          <w:r>
+            <w:fldChar w:fldCharType="begin"/>
+          </w:r>
+          <w:r>
+            <w:instrText xml:space="preserve"> CITATION For25 \l 1050 </w:instrText>
+          </w:r>
+          <w:r>
+            <w:fldChar w:fldCharType="separate"/>
+          </w:r>
+          <w:r>
+            <w:rPr>
+              <w:noProof/>
+            </w:rPr>
+            <w:t xml:space="preserve"> [1]</w:t>
+          </w:r>
+          <w:r>
+            <w:fldChar w:fldCharType="end"/>
+          </w:r>
+        </w:sdtContent>
+      </w:sdt>
+      <w:r>
+        <w:t xml:space="preserve"> </w:t>
+      </w:r>
+      <w:r>
+        <w:t>Za razliku od standardnih tekstualnih poruka, ovaj pop-up sadrži niz od tri vizualna prikaza koji simuliraju rad u aplikaciji. Svaka slika u nizu nosi specifičnu informaciju.</w:t>
       </w:r>
     </w:p>
     <w:p>
@@ -13205,6 +13824,7 @@
     </w:p>
     <w:p>
       <w:r>
+        <w:lastRenderedPageBreak/>
         <w:t xml:space="preserve">Logika </w:t>
       </w:r>
       <w:r>
@@ -13216,79 +13836,89 @@
     </w:p>
     <w:p>
       <w:r>
+        <w:t>Navigacija kroz ove korake izvedena je pomoću gumba „Dalje“ i „Natrag“, pri čemu se sučelje pop-upa dinamički ažurira bez zatvaranja dijaloga. Ovakav kontinuitet zadržava pažnju korisnika i pruža osjećaj fluidnosti.</w:t>
+      </w:r>
+    </w:p>
+    <w:p>
+      <w:r>
+        <w:t>Trajna dostupnost i UX:</w:t>
+      </w:r>
+    </w:p>
+    <w:p>
+      <w:r>
+        <w:t xml:space="preserve">Iako se tutorial automatski pokreće samo jednom, prepoznata je potreba da korisnici mogu naknadno pristupiti ovim informacijama. Zbog toga je vodič integriran i kao stalna stavka unutar navigacijskog izbornika (Drawer). Implementirana je klasa </w:t>
+      </w:r>
+      <w:r>
+        <w:rPr>
+          <w:rStyle w:val="KdutekstuChar"/>
+        </w:rPr>
+        <w:t>TutorialFragment</w:t>
+      </w:r>
+      <w:r>
+        <w:t xml:space="preserve"> koja sadrži sučelje s gumbom za ručno pokretanje istog interaktivnog pop-upa. Ovim je osigurano da korisnik u bilo kojem trenutku, čak i nakon što napuni bazu s desecima jednadžbi, može ponovno pregledati upute ako se susretne s nedoumicama oko unosa ili funkcioniranja Solvera.</w:t>
+      </w:r>
+    </w:p>
+    <w:p>
+      <w:pPr>
+        <w:pStyle w:val="Heading2"/>
+      </w:pPr>
+      <w:bookmarkStart w:id="46" w:name="_Toc240038140"/>
+      <w:r>
+        <w:t>Dijeljenje jednadžbi sa drugim korisnicima</w:t>
+      </w:r>
+      <w:bookmarkEnd w:id="46"/>
+    </w:p>
+    <w:p>
+      <w:r>
+        <w:t xml:space="preserve">Posljednja faza implementacije bila je usmjerena na razvoj sustava za </w:t>
+      </w:r>
+      <w:r>
+        <w:t>suradnju</w:t>
+      </w:r>
+      <w:r>
+        <w:t xml:space="preserve"> koj</w:t>
+      </w:r>
+      <w:r>
+        <w:t>a</w:t>
+      </w:r>
+      <w:r>
+        <w:t xml:space="preserve"> korisnicima omogućuje brzu i jednostavnu razmjenu podataka. Kako bi se izbjegla potreba za skupim održavanjem vanjskih poslužitelja i bazama podataka u oblaku, razvijen je decentralizirani model razmjene temeljen na prijenosu enkodiranih tekstualnih zapisa.</w:t>
+      </w:r>
+    </w:p>
+    <w:p>
+      <w:r>
+        <w:t>Mehanizam enkodiranja (Base64):</w:t>
+      </w:r>
+    </w:p>
+    <w:p>
+      <w:r>
+        <w:t xml:space="preserve">Sustav se oslanja na standard Base64 za pretvorbu složenih programskih objekata u nizove znakova koji su sigurni za prijenos putem bilo kojeg medija (engl. </w:t>
+      </w:r>
+      <w:r>
+        <w:rPr>
+          <w:i/>
+          <w:iCs/>
+        </w:rPr>
+        <w:t>Plain Text</w:t>
+      </w:r>
+      <w:r>
+        <w:t>). Ovaj pristup osigurava da se specijalni znakovi unutar matematičkih formula, poput znaka jednakosti, razlomaka ili grčkih simbola, ne izgube ili ne transformiraju tijekom slanja putem aplikacija kao što su WhatsApp, SMS ili e-pošta.</w:t>
+      </w:r>
+    </w:p>
+    <w:p>
+      <w:r>
+        <w:t>Prilikom kopiranja jednadžbe, aplikacija prikuplja naziv i formulu te ih spaja u jedan sirovi niz znakova koristeći separator (npr. Naziv|Formula). Taj se niz zatim pretvara u bajtove koristeći UTF-8 kodiranje i na kraju enkodira u Base64 string. Rezultat je sažeti kôd koji korisnik može poslati bilo kome, a koji ne sadrži suvišne podatke poput povijesti izračuna, čime je postignuta maksimalna kompaktnost.</w:t>
+      </w:r>
+    </w:p>
+    <w:p/>
+    <w:p>
+      <w:r>
         <w:lastRenderedPageBreak/>
-        <w:t>Navigacija kroz ove korake izvedena je pomoću gumba „Dalje“ i „Natrag“, pri čemu se sučelje pop-upa dinamički ažurira bez zatvaranja dijaloga. Ovakav kontinuitet zadržava pažnju korisnika i pruža osjećaj fluidnosti.</w:t>
-      </w:r>
-    </w:p>
-    <w:p>
-      <w:r>
-        <w:t>Trajna dostupnost i UX:</w:t>
-      </w:r>
-    </w:p>
-    <w:p>
-      <w:r>
-        <w:t xml:space="preserve">Iako se tutorial automatski pokreće samo jednom, prepoznata je potreba da korisnici mogu naknadno pristupiti ovim informacijama. Zbog toga je vodič integriran i kao stalna stavka unutar navigacijskog izbornika (Drawer). Implementirana je klasa </w:t>
-      </w:r>
-      <w:r>
-        <w:rPr>
-          <w:rStyle w:val="KdutekstuChar"/>
-        </w:rPr>
-        <w:t>TutorialFragment</w:t>
-      </w:r>
-      <w:r>
-        <w:t xml:space="preserve"> koja sadrži sučelje s gumbom za ručno pokretanje istog interaktivnog pop-upa. Ovim je osigurano da korisnik u bilo kojem trenutku, čak i nakon što napuni bazu s desecima jednadžbi, može ponovno pregledati upute ako se susretne s nedoumicama oko unosa ili funkcioniranja Solvera.</w:t>
-      </w:r>
-    </w:p>
-    <w:p>
-      <w:pPr>
-        <w:pStyle w:val="Heading2"/>
-      </w:pPr>
-      <w:bookmarkStart w:id="46" w:name="_Toc239935735"/>
-      <w:r>
-        <w:t>Dijeljenje jednadžbi sa drugim korisnicima</w:t>
-      </w:r>
-      <w:bookmarkEnd w:id="46"/>
-    </w:p>
-    <w:p>
-      <w:r>
-        <w:t xml:space="preserve">Posljednja faza implementacije bila je usmjerena na razvoj sustava za </w:t>
-      </w:r>
-      <w:r>
-        <w:t>suradnju</w:t>
-      </w:r>
-      <w:r>
-        <w:t xml:space="preserve"> koj</w:t>
-      </w:r>
-      <w:r>
-        <w:t>a</w:t>
-      </w:r>
-      <w:r>
-        <w:t xml:space="preserve"> korisnicima omogućuje brzu i jednostavnu razmjenu podataka. Kako bi se izbjegla potreba za skupim održavanjem vanjskih poslužitelja i bazama podataka u oblaku, razvijen je decentralizirani model razmjene temeljen na prijenosu enkodiranih tekstualnih zapisa.</w:t>
-      </w:r>
-    </w:p>
-    <w:p>
-      <w:r>
-        <w:t>Mehanizam enkodiranja (Base64):</w:t>
-      </w:r>
-    </w:p>
-    <w:p>
-      <w:r>
-        <w:t>Sustav se oslanja na standard Base64 za pretvorbu složenih programskih objekata u nizove znakova koji su sigurni za prijenos putem bilo kojeg medija (engl. Plain Text). Ovaj pristup osigurava da se specijalni znakovi unutar matematičkih formula, poput znaka jednakosti, razlomaka ili grčkih simbola, ne izgube ili ne transformiraju tijekom slanja putem aplikacija kao što su WhatsApp, SMS ili e-pošta.</w:t>
-      </w:r>
-    </w:p>
-    <w:p>
-      <w:r>
-        <w:t>Prilikom kopiranja jednadžbe, aplikacija prikuplja naziv i formulu te ih spaja u jedan sirovi niz znakova koristeći separator (npr. Naziv|Formula). Taj se niz zatim pretvara u bajtove koristeći UTF-8 kodiranje i na kraju enkodira u Base64 string. Rezultat je sažeti kôd koji korisnik može poslati bilo kome, a koji ne sadrži suvišne podatke poput povijesti izračuna, čime je postignuta maksimalna kompaktnost.</w:t>
-      </w:r>
-    </w:p>
-    <w:p>
-      <w:r>
         <w:t>Dijeljenje cijelih mapa (Pockets):</w:t>
       </w:r>
     </w:p>
     <w:p>
       <w:r>
-        <w:lastRenderedPageBreak/>
         <w:t>Za razmjenu cijelih tematskih mapa razvijen je napredniji format zapisa. Kada korisnik odabere opciju „Kopiraj cijelu mapu“, aplikacija pokreće asinkroni upit prema Room bazi podataka kako bi dohvatila sve jednadžbe povezane s tom mapom.</w:t>
       </w:r>
     </w:p>
@@ -13850,6 +14480,12 @@
           <w:lang w:val="en-DE"/>
         </w:rPr>
         <w:br/>
+      </w:r>
+      <w:r>
+        <w:rPr>
+          <w:lang w:val="en-DE"/>
+        </w:rPr>
+        <w:lastRenderedPageBreak/>
         <w:t xml:space="preserve">        </w:t>
       </w:r>
       <w:proofErr w:type="spellStart"/>
@@ -13927,7 +14563,6 @@
         <w:rPr>
           <w:lang w:val="en-DE"/>
         </w:rPr>
-        <w:lastRenderedPageBreak/>
         <w:t>Toast.</w:t>
       </w:r>
       <w:r>
@@ -13984,7 +14619,7 @@
           <w:lang w:val="en-DE"/>
         </w:rPr>
       </w:pPr>
-      <w:bookmarkStart w:id="47" w:name="_Toc239935924"/>
+      <w:bookmarkStart w:id="47" w:name="_Toc240038166"/>
       <w:r>
         <w:t xml:space="preserve">Kôd </w:t>
       </w:r>
@@ -14042,12 +14677,32 @@
     </w:p>
     <w:p>
       <w:r>
-        <w:t>Postupak uvoza podataka (engl. Import) izveden je kroz dijaloge koji se aktiviraju putem ikona u Toolbaru na početnom ekranu ili unutar same mape. Korisnik u tekstualno polje lijepi kôd, a sustav zatim vrši obrnutu transformaciju: dekodiranje iz Base64 formata natrag u UTF-8 string.</w:t>
-      </w:r>
-    </w:p>
-    <w:p>
-      <w:r>
-        <w:t>Implementiran je sustav za prepoznavanje tipa podataka na temelju prefiksa. Ako dekodirani niz počinje s POCKET:, sustav automatski kreira novu mapu u bazi i u nju sekvencijalno upisuje sve pripadajuće jednadžbe. U suprotnom, sustav tretira kôd kao pojedinačnu jednadžbu i dodaje je u trenutno aktivnu mapu. Cijeli proces zaštićen je try-catch blokovima koji detektiraju neispravne kodove (npr. nepotpune ili oštećene nizove), sprječavajući rušenje aplikacije i obavještavajući korisnika o neuspješnom uvozu putem poruka (engl. Toast).</w:t>
+        <w:t xml:space="preserve">Postupak uvoza podataka (engl. </w:t>
+      </w:r>
+      <w:r>
+        <w:rPr>
+          <w:i/>
+          <w:iCs/>
+        </w:rPr>
+        <w:t>Import</w:t>
+      </w:r>
+      <w:r>
+        <w:t>) izveden je kroz dijaloge koji se aktiviraju putem ikona u Toolbaru na početnom ekranu ili unutar same mape. Korisnik u tekstualno polje lijepi kôd, a sustav zatim vrši obrnutu transformaciju: dekodiranje iz Base64 formata natrag u UTF-8 string.</w:t>
+      </w:r>
+    </w:p>
+    <w:p>
+      <w:r>
+        <w:t xml:space="preserve">Implementiran je sustav za prepoznavanje tipa podataka na temelju prefiksa. Ako dekodirani niz počinje s POCKET:, sustav automatski kreira novu mapu u bazi i u nju sekvencijalno upisuje sve pripadajuće jednadžbe. U suprotnom, sustav tretira kôd kao pojedinačnu jednadžbu i dodaje je u trenutno aktivnu mapu. Cijeli proces zaštićen je try-catch blokovima koji detektiraju neispravne kodove (npr. nepotpune ili oštećene nizove), sprječavajući rušenje aplikacije i obavještavajući korisnika o neuspješnom uvozu putem poruka (engl. </w:t>
+      </w:r>
+      <w:r>
+        <w:rPr>
+          <w:i/>
+          <w:iCs/>
+        </w:rPr>
+        <w:t>Toast</w:t>
+      </w:r>
+      <w:r>
+        <w:t>).</w:t>
       </w:r>
     </w:p>
     <w:p>
@@ -14063,7 +14718,7 @@
       <w:pPr>
         <w:pStyle w:val="Heading1"/>
       </w:pPr>
-      <w:bookmarkStart w:id="48" w:name="_Toc239935736"/>
+      <w:bookmarkStart w:id="48" w:name="_Toc240038141"/>
       <w:r>
         <w:lastRenderedPageBreak/>
         <w:t>Testiranje aplikacije</w:t>
@@ -14085,7 +14740,7 @@
       <w:pPr>
         <w:pStyle w:val="Heading2"/>
       </w:pPr>
-      <w:bookmarkStart w:id="49" w:name="_Toc239935737"/>
+      <w:bookmarkStart w:id="49" w:name="_Toc240038142"/>
       <w:r>
         <w:t>Metode testiranja na Android uređajima</w:t>
       </w:r>
@@ -14100,7 +14755,7 @@
       <w:pPr>
         <w:pStyle w:val="Heading3"/>
       </w:pPr>
-      <w:bookmarkStart w:id="50" w:name="_Toc239935738"/>
+      <w:bookmarkStart w:id="50" w:name="_Toc240038143"/>
       <w:r>
         <w:t>Unit testing modula za parsiranje i izračun</w:t>
       </w:r>
@@ -14114,7 +14769,69 @@
         <w:t>šest</w:t>
       </w:r>
       <w:r>
-        <w:t xml:space="preserve"> testnih scenarija unutar klase MathLogicUnitTest koji su potvrdili točnost integracije Symja CAS engine-a. Testiranje je provedeno bez pokretanja sučelja, čime je postignuta visoka brzina izvršavanja, a cijeli set testova dovršen je u roku od četiri sekunde.</w:t>
+        <w:t xml:space="preserve"> testnih scenarija unutar klase </w:t>
+      </w:r>
+      <w:r>
+        <w:rPr>
+          <w:rStyle w:val="KdutekstuChar"/>
+        </w:rPr>
+        <w:t>MathLogicUnitTest</w:t>
+      </w:r>
+      <w:r>
+        <w:t xml:space="preserve"> koji su potvrdili točnost integracije Symja CAS engine-a.</w:t>
+      </w:r>
+      <w:r>
+        <w:t xml:space="preserve"> </w:t>
+      </w:r>
+      <w:r>
+        <w:t xml:space="preserve">„Migriranje obrade podataka iz aktivnosti u </w:t>
+      </w:r>
+      <w:r>
+        <w:rPr>
+          <w:rStyle w:val="KdutekstuChar"/>
+        </w:rPr>
+        <w:t>ViewModel</w:t>
+      </w:r>
+      <w:r>
+        <w:t xml:space="preserve"> pomaže u stvaranju boljih i bržih unit testova.“</w:t>
+      </w:r>
+      <w:sdt>
+        <w:sdtPr>
+          <w:id w:val="1292249259"/>
+          <w:citation/>
+        </w:sdtPr>
+        <w:sdtContent>
+          <w:r>
+            <w:fldChar w:fldCharType="begin"/>
+          </w:r>
+          <w:r>
+            <w:instrText xml:space="preserve"> CITATION For25 \l 1050 </w:instrText>
+          </w:r>
+          <w:r>
+            <w:fldChar w:fldCharType="separate"/>
+          </w:r>
+          <w:r>
+            <w:rPr>
+              <w:noProof/>
+            </w:rPr>
+            <w:t xml:space="preserve"> [1]</w:t>
+          </w:r>
+          <w:r>
+            <w:fldChar w:fldCharType="end"/>
+          </w:r>
+        </w:sdtContent>
+      </w:sdt>
+      <w:r>
+        <w:t>.</w:t>
+      </w:r>
+      <w:r>
+        <w:t xml:space="preserve"> </w:t>
+      </w:r>
+      <w:r>
+        <w:t xml:space="preserve">Pošto su korišteni najbolji principi, očekivanje je da će unit testovi biti brzi. </w:t>
+      </w:r>
+      <w:r>
+        <w:t>Testiranje je provedeno bez pokretanja sučelja, a cijeli set testova dovršen je u roku od četiri sekunde.</w:t>
       </w:r>
     </w:p>
     <w:p/>
@@ -14428,6 +15145,12 @@
           <w:lang w:val="en-DE"/>
         </w:rPr>
         <w:br/>
+      </w:r>
+      <w:r>
+        <w:rPr>
+          <w:lang w:val="en-DE"/>
+        </w:rPr>
+        <w:lastRenderedPageBreak/>
         <w:t xml:space="preserve">    @Test</w:t>
       </w:r>
       <w:r>
@@ -14435,12 +15158,6 @@
           <w:lang w:val="en-DE"/>
         </w:rPr>
         <w:br/>
-      </w:r>
-      <w:r>
-        <w:rPr>
-          <w:lang w:val="en-DE"/>
-        </w:rPr>
-        <w:lastRenderedPageBreak/>
         <w:t xml:space="preserve">    fun </w:t>
       </w:r>
       <w:proofErr w:type="spellStart"/>
@@ -15428,6 +16145,12 @@
           <w:lang w:val="en-DE"/>
         </w:rPr>
         <w:br/>
+      </w:r>
+      <w:r>
+        <w:rPr>
+          <w:lang w:val="en-DE"/>
+        </w:rPr>
+        <w:lastRenderedPageBreak/>
         <w:t xml:space="preserve">        </w:t>
       </w:r>
       <w:proofErr w:type="spellStart"/>
@@ -15463,12 +16186,6 @@
           <w:lang w:val="en-DE"/>
         </w:rPr>
         <w:br/>
-      </w:r>
-      <w:r>
-        <w:rPr>
-          <w:lang w:val="en-DE"/>
-        </w:rPr>
-        <w:lastRenderedPageBreak/>
         <w:t xml:space="preserve">        // </w:t>
       </w:r>
       <w:proofErr w:type="spellStart"/>
@@ -15572,7 +16289,7 @@
           <w:lang w:val="en-DE"/>
         </w:rPr>
       </w:pPr>
-      <w:bookmarkStart w:id="51" w:name="_Toc239935925"/>
+      <w:bookmarkStart w:id="51" w:name="_Toc240038167"/>
       <w:r>
         <w:t xml:space="preserve">Kôd </w:t>
       </w:r>
@@ -15629,7 +16346,7 @@
       <w:pPr>
         <w:pStyle w:val="Heading3"/>
       </w:pPr>
-      <w:bookmarkStart w:id="52" w:name="_Toc239935739"/>
+      <w:bookmarkStart w:id="52" w:name="_Toc240038144"/>
       <w:r>
         <w:t>Integracijsko testiranje korisničkog sučelja</w:t>
       </w:r>
@@ -15665,7 +16382,7 @@
       <w:pPr>
         <w:pStyle w:val="Heading2"/>
       </w:pPr>
-      <w:bookmarkStart w:id="53" w:name="_Toc239935740"/>
+      <w:bookmarkStart w:id="53" w:name="_Toc240038145"/>
       <w:r>
         <w:t>Analiza performansi i rezultata testiranja</w:t>
       </w:r>
@@ -15680,7 +16397,7 @@
       <w:pPr>
         <w:pStyle w:val="Heading3"/>
       </w:pPr>
-      <w:bookmarkStart w:id="54" w:name="_Toc239935741"/>
+      <w:bookmarkStart w:id="54" w:name="_Toc240038146"/>
       <w:r>
         <w:t>Analiza preciznosti prepoznavanja tiskanog teksta naspram rukopis</w:t>
       </w:r>
@@ -15700,7 +16417,7 @@
           <w:noProof/>
         </w:rPr>
         <w:drawing>
-          <wp:inline distT="0" distB="0" distL="0" distR="0" wp14:anchorId="2A1BC494" wp14:editId="68640BED">
+          <wp:inline distT="0" distB="0" distL="0" distR="0" wp14:anchorId="2A1BC494" wp14:editId="55EABA87">
             <wp:extent cx="5580380" cy="2805430"/>
             <wp:effectExtent l="0" t="0" r="1270" b="13970"/>
             <wp:docPr id="23170721" name="Chart 1">
@@ -15726,7 +16443,7 @@
         <w:ind w:left="2160" w:firstLine="720"/>
         <w:jc w:val="both"/>
       </w:pPr>
-      <w:bookmarkStart w:id="55" w:name="_Toc239935905"/>
+      <w:bookmarkStart w:id="55" w:name="_Toc240038162"/>
       <w:r>
         <w:t xml:space="preserve">Slika </w:t>
       </w:r>
@@ -15782,14 +16499,52 @@
     </w:p>
     <w:p>
       <w:r>
-        <w:t>S druge strane, uređaji s nižom rezolucijom kamere, posebno oni ispod 20 megapiksela, pokazuju značajne varijacije u preciznosti ovisno o vizualnoj kompleksnosti formule. Dok se jednostavnije jednadžbe poput Newtonovog zakona ili osnovnih linearnih izraza i dalje očitavaju s visokom pouzdanošću, točnost drastično opada kod formula koje sadrže korijene ili složene razlomke. Primjerice, kod naprednih termodinamičkih omjera prosječna ocjena preciznosti na slabijim uređajima iznosi svega 1.5, dok na uređajima visoke rezolucije ona ostaje iznad 4.4. Ovi rezultati potvrđuju opravdanost uvođenja funkcionalnosti digitalnog zumiranja i bljeskalice, koji na uređajima s prosječnim senzorima djelomično kompenziraju hardverska ograničenja povećanjem kontrasta i oštrine slike. Zaključno, integrirani OCR sustav pokazuje izvrsne rezultate u kontroliranim uvjetima na modernim uređajima, dok kod starijih modela zahtijeva aktivniju suradnju korisnika kroz korištenje ponuđenih alata za poboljšanje kvalitete snimke.</w:t>
+        <w:t>S druge strane, uređaji s nižom rezolucijom kamere, posebno oni ispod 20 megapiksela, pokazuju značajne varijacije u preciznosti ovisno o vizualnoj kompleksnosti formule. Dok se jednostavnije jednadžbe poput Newtonovog zakona ili osnovnih linearnih izraza i dalje očitavaju s visokom pouzdanošću, točnost drastično opada kod formula koje sadrže korijene ili složene razlomke. Primjerice, kod naprednih termodinamičkih omjera prosječna ocjena preciznosti na slabijim uređajima iznosi svega 1.5, dok na uređajima visoke rezolucije ona ostaje iznad 4.4. Ovi rezultati potvrđuju opravdanost uvođenja funkcionalnosti digitalnog zumiranja i bljeskalice, koji na uređajima s prosječnim senzorima djelomično kompenziraju hardverska ograničenja povećanjem kontrasta i oštrine slike.</w:t>
+      </w:r>
+      <w:r>
+        <w:t xml:space="preserve"> Ovi testovi također potvrđuju analizu Google-ovih inženjera.</w:t>
+      </w:r>
+      <w:r>
+        <w:t xml:space="preserve"> </w:t>
+      </w:r>
+      <w:r>
+        <w:t>„Loš fokus slike može utjecati na točnost prepoznavanja teksta. Ako se ne postižu prihvatljivi rezultati, preporučuje se ponovno snimanje slike.“</w:t>
+      </w:r>
+      <w:sdt>
+        <w:sdtPr>
+          <w:id w:val="421381875"/>
+          <w:citation/>
+        </w:sdtPr>
+        <w:sdtContent>
+          <w:r>
+            <w:fldChar w:fldCharType="begin"/>
+          </w:r>
+          <w:r>
+            <w:instrText xml:space="preserve"> CITATION Goo26 \l 1050 </w:instrText>
+          </w:r>
+          <w:r>
+            <w:fldChar w:fldCharType="separate"/>
+          </w:r>
+          <w:r>
+            <w:rPr>
+              <w:noProof/>
+            </w:rPr>
+            <w:t xml:space="preserve"> [4]</w:t>
+          </w:r>
+          <w:r>
+            <w:fldChar w:fldCharType="end"/>
+          </w:r>
+        </w:sdtContent>
+      </w:sdt>
+      <w:r>
+        <w:t xml:space="preserve"> Zaključno, integrirani OCR sustav pokazuje izvrsne rezultate u kontroliranim uvjetima na modernim uređajima, dok kod starijih modela zahtijeva aktivniju suradnju korisnika kroz korištenje ponuđenih alata za poboljšanje kvalitete snimke.</w:t>
       </w:r>
     </w:p>
     <w:p>
       <w:pPr>
         <w:pStyle w:val="Heading3"/>
       </w:pPr>
-      <w:bookmarkStart w:id="56" w:name="_Toc239935742"/>
+      <w:bookmarkStart w:id="56" w:name="_Toc240038147"/>
       <w:r>
         <w:t>Mjerenje vremena iscrtavanja grafa u ovisnosti o broju točaka i veličini liste rezultata</w:t>
       </w:r>
@@ -15802,11 +16557,11 @@
     </w:p>
     <w:p>
       <w:r>
-        <w:t xml:space="preserve">Analiza rezultata pokazuje da je vrijeme iscrtavanja grafa za standardne setove podataka, koji obuhvaćaju do pedeset točaka izračuna unutar jedne sesije, iznimno stabilno i iznosi prosječno između 15 i 45 milisekundi. Ovako brzi odziv sustava osigurava trenutačnu vizualnu povratnu informaciju korisniku, bez uočljivih zastoja u sučelju. Čak i pri korištenju logaritamske skale, koja zahtijeva dodatne matematičke transformacije nad svakom pojedinom točkom, vrijeme renderiranja ne prelazi granicu od 60 milisekundi na uređajima </w:t>
+        <w:t xml:space="preserve">Analiza rezultata pokazuje da je vrijeme iscrtavanja grafa za standardne setove podataka, koji obuhvaćaju do pedeset točaka izračuna unutar jedne sesije, iznimno stabilno i iznosi prosječno između 15 i 45 milisekundi. Ovako brzi odziv sustava osigurava trenutačnu vizualnu povratnu informaciju korisniku, bez uočljivih zastoja u sučelju. Čak i pri korištenju </w:t>
       </w:r>
       <w:r>
         <w:lastRenderedPageBreak/>
-        <w:t>prosječnih hardverskih karakteristika. Ovi podaci potvrđuju visoku učinkovitost odabrane knjižnice MPAndroidChart i njezinu uspješnu integraciju s prilagođenom logikom povijesti izračuna aplikacije EquationPocket. Sustav se pokazao skalabilnim i optimiziranim za rad u stvarnom vremenu, čime su ispunjeni visoki standardi odzivnosti potrebni za modernu znanstvenu aplikaciju.</w:t>
+        <w:t>logaritamske skale, koja zahtijeva dodatne matematičke transformacije nad svakom pojedinom točkom, vrijeme renderiranja ne prelazi granicu od 60 milisekundi na uređajima prosječnih hardverskih karakteristika. Ovi podaci potvrđuju visoku učinkovitost odabrane knjižnice MPAndroidChart i njezinu uspješnu integraciju s prilagođenom logikom povijesti izračuna aplikacije EquationPocket. Sustav se pokazao skalabilnim i optimiziranim za rad u stvarnom vremenu, čime su ispunjeni visoki standardi odzivnosti potrebni za modernu znanstvenu aplikaciju.</w:t>
       </w:r>
     </w:p>
     <w:p>
@@ -15818,7 +16573,7 @@
         </w:numPr>
         <w:ind w:left="425" w:hanging="425"/>
       </w:pPr>
-      <w:bookmarkStart w:id="57" w:name="_Toc239935743"/>
+      <w:bookmarkStart w:id="57" w:name="_Toc240038148"/>
       <w:r>
         <w:lastRenderedPageBreak/>
         <w:t>Zaključak</w:t>
@@ -15844,7 +16599,7 @@
           <w:numId w:val="0"/>
         </w:numPr>
       </w:pPr>
-      <w:bookmarkStart w:id="58" w:name="_Toc239935744"/>
+      <w:bookmarkStart w:id="58" w:name="_Toc240038149"/>
       <w:r>
         <w:t>Ostvareni rezultati</w:t>
       </w:r>
@@ -15868,7 +16623,7 @@
           <w:numId w:val="0"/>
         </w:numPr>
       </w:pPr>
-      <w:bookmarkStart w:id="59" w:name="_Toc239935745"/>
+      <w:bookmarkStart w:id="59" w:name="_Toc240038150"/>
       <w:r>
         <w:t>Smjernice za daljnji razvoj aplikacije</w:t>
       </w:r>
@@ -15885,7 +16640,17 @@
         <w:t xml:space="preserve">Postojeći </w:t>
       </w:r>
       <w:r>
-        <w:t xml:space="preserve">Base64 sustav dijeljenja mogao bi se nadograditi integracijom s uslugama u oblaku (engl. Cloud Sync), što bi korisnicima omogućilo automatsku sinkronizaciju mapa na više različitih uređaja. Daljnja optimizacija OCR algoritama korištenjem specijaliziranih neuronskih </w:t>
+        <w:t xml:space="preserve">Base64 sustav dijeljenja mogao bi se nadograditi integracijom s uslugama u oblaku (engl. </w:t>
+      </w:r>
+      <w:r>
+        <w:rPr>
+          <w:i/>
+          <w:iCs/>
+        </w:rPr>
+        <w:t>Cloud Sync</w:t>
+      </w:r>
+      <w:r>
+        <w:t xml:space="preserve">), što bi korisnicima omogućilo automatsku sinkronizaciju mapa na više različitih uređaja. Daljnja optimizacija OCR algoritama korištenjem specijaliziranih neuronskih </w:t>
       </w:r>
       <w:r>
         <w:lastRenderedPageBreak/>
@@ -15948,7 +16713,7 @@
           <w:numId w:val="0"/>
         </w:numPr>
       </w:pPr>
-      <w:bookmarkStart w:id="60" w:name="_Toc239935747"/>
+      <w:bookmarkStart w:id="60" w:name="_Toc240038151"/>
       <w:r>
         <w:lastRenderedPageBreak/>
         <w:t xml:space="preserve">Popis </w:t>
@@ -15981,7 +16746,7 @@
       <w:r>
         <w:fldChar w:fldCharType="separate"/>
       </w:r>
-      <w:hyperlink w:anchor="_Toc239935897" w:history="1">
+      <w:hyperlink w:anchor="_Toc240038154" w:history="1">
         <w:r>
           <w:rPr>
             <w:rStyle w:val="Hyperlink"/>
@@ -16008,7 +16773,7 @@
             <w:noProof/>
             <w:webHidden/>
           </w:rPr>
-          <w:instrText xml:space="preserve"> PAGEREF _Toc239935897 \h </w:instrText>
+          <w:instrText xml:space="preserve"> PAGEREF _Toc240038154 \h </w:instrText>
         </w:r>
         <w:r>
           <w:rPr>
@@ -16053,7 +16818,7 @@
           <w14:ligatures w14:val="standardContextual"/>
         </w:rPr>
       </w:pPr>
-      <w:hyperlink w:anchor="_Toc239935898" w:history="1">
+      <w:hyperlink w:anchor="_Toc240038155" w:history="1">
         <w:r>
           <w:rPr>
             <w:rStyle w:val="Hyperlink"/>
@@ -16080,7 +16845,7 @@
             <w:noProof/>
             <w:webHidden/>
           </w:rPr>
-          <w:instrText xml:space="preserve"> PAGEREF _Toc239935898 \h </w:instrText>
+          <w:instrText xml:space="preserve"> PAGEREF _Toc240038155 \h </w:instrText>
         </w:r>
         <w:r>
           <w:rPr>
@@ -16125,7 +16890,7 @@
           <w14:ligatures w14:val="standardContextual"/>
         </w:rPr>
       </w:pPr>
-      <w:hyperlink w:anchor="_Toc239935899" w:history="1">
+      <w:hyperlink w:anchor="_Toc240038156" w:history="1">
         <w:r>
           <w:rPr>
             <w:rStyle w:val="Hyperlink"/>
@@ -16152,7 +16917,7 @@
             <w:noProof/>
             <w:webHidden/>
           </w:rPr>
-          <w:instrText xml:space="preserve"> PAGEREF _Toc239935899 \h </w:instrText>
+          <w:instrText xml:space="preserve"> PAGEREF _Toc240038156 \h </w:instrText>
         </w:r>
         <w:r>
           <w:rPr>
@@ -16197,7 +16962,7 @@
           <w14:ligatures w14:val="standardContextual"/>
         </w:rPr>
       </w:pPr>
-      <w:hyperlink w:anchor="_Toc239935900" w:history="1">
+      <w:hyperlink w:anchor="_Toc240038157" w:history="1">
         <w:r>
           <w:rPr>
             <w:rStyle w:val="Hyperlink"/>
@@ -16224,7 +16989,7 @@
             <w:noProof/>
             <w:webHidden/>
           </w:rPr>
-          <w:instrText xml:space="preserve"> PAGEREF _Toc239935900 \h </w:instrText>
+          <w:instrText xml:space="preserve"> PAGEREF _Toc240038157 \h </w:instrText>
         </w:r>
         <w:r>
           <w:rPr>
@@ -16269,7 +17034,7 @@
           <w14:ligatures w14:val="standardContextual"/>
         </w:rPr>
       </w:pPr>
-      <w:hyperlink w:anchor="_Toc239935901" w:history="1">
+      <w:hyperlink w:anchor="_Toc240038158" w:history="1">
         <w:r>
           <w:rPr>
             <w:rStyle w:val="Hyperlink"/>
@@ -16296,7 +17061,7 @@
             <w:noProof/>
             <w:webHidden/>
           </w:rPr>
-          <w:instrText xml:space="preserve"> PAGEREF _Toc239935901 \h </w:instrText>
+          <w:instrText xml:space="preserve"> PAGEREF _Toc240038158 \h </w:instrText>
         </w:r>
         <w:r>
           <w:rPr>
@@ -16341,7 +17106,7 @@
           <w14:ligatures w14:val="standardContextual"/>
         </w:rPr>
       </w:pPr>
-      <w:hyperlink w:anchor="_Toc239935902" w:history="1">
+      <w:hyperlink w:anchor="_Toc240038159" w:history="1">
         <w:r>
           <w:rPr>
             <w:rStyle w:val="Hyperlink"/>
@@ -16368,7 +17133,7 @@
             <w:noProof/>
             <w:webHidden/>
           </w:rPr>
-          <w:instrText xml:space="preserve"> PAGEREF _Toc239935902 \h </w:instrText>
+          <w:instrText xml:space="preserve"> PAGEREF _Toc240038159 \h </w:instrText>
         </w:r>
         <w:r>
           <w:rPr>
@@ -16413,7 +17178,7 @@
           <w14:ligatures w14:val="standardContextual"/>
         </w:rPr>
       </w:pPr>
-      <w:hyperlink w:anchor="_Toc239935903" w:history="1">
+      <w:hyperlink w:anchor="_Toc240038160" w:history="1">
         <w:r>
           <w:rPr>
             <w:rStyle w:val="Hyperlink"/>
@@ -16440,7 +17205,7 @@
             <w:noProof/>
             <w:webHidden/>
           </w:rPr>
-          <w:instrText xml:space="preserve"> PAGEREF _Toc239935903 \h </w:instrText>
+          <w:instrText xml:space="preserve"> PAGEREF _Toc240038160 \h </w:instrText>
         </w:r>
         <w:r>
           <w:rPr>
@@ -16485,7 +17250,7 @@
           <w14:ligatures w14:val="standardContextual"/>
         </w:rPr>
       </w:pPr>
-      <w:hyperlink w:anchor="_Toc239935904" w:history="1">
+      <w:hyperlink w:anchor="_Toc240038161" w:history="1">
         <w:r>
           <w:rPr>
             <w:rStyle w:val="Hyperlink"/>
@@ -16512,7 +17277,7 @@
             <w:noProof/>
             <w:webHidden/>
           </w:rPr>
-          <w:instrText xml:space="preserve"> PAGEREF _Toc239935904 \h </w:instrText>
+          <w:instrText xml:space="preserve"> PAGEREF _Toc240038161 \h </w:instrText>
         </w:r>
         <w:r>
           <w:rPr>
@@ -16557,7 +17322,7 @@
           <w14:ligatures w14:val="standardContextual"/>
         </w:rPr>
       </w:pPr>
-      <w:hyperlink w:anchor="_Toc239935905" w:history="1">
+      <w:hyperlink w:anchor="_Toc240038162" w:history="1">
         <w:r>
           <w:rPr>
             <w:rStyle w:val="Hyperlink"/>
@@ -16584,7 +17349,7 @@
             <w:noProof/>
             <w:webHidden/>
           </w:rPr>
-          <w:instrText xml:space="preserve"> PAGEREF _Toc239935905 \h </w:instrText>
+          <w:instrText xml:space="preserve"> PAGEREF _Toc240038162 \h </w:instrText>
         </w:r>
         <w:r>
           <w:rPr>
@@ -16629,7 +17394,7 @@
         </w:numPr>
         <w:ind w:left="425" w:hanging="425"/>
       </w:pPr>
-      <w:bookmarkStart w:id="61" w:name="_Toc239935749"/>
+      <w:bookmarkStart w:id="61" w:name="_Toc240038152"/>
       <w:r>
         <w:lastRenderedPageBreak/>
         <w:t>Popis kôdova</w:t>
@@ -16659,7 +17424,7 @@
       <w:r>
         <w:fldChar w:fldCharType="separate"/>
       </w:r>
-      <w:hyperlink w:anchor="_Toc239935921" w:history="1">
+      <w:hyperlink w:anchor="_Toc240038163" w:history="1">
         <w:r>
           <w:rPr>
             <w:rStyle w:val="Hyperlink"/>
@@ -16686,7 +17451,7 @@
             <w:noProof/>
             <w:webHidden/>
           </w:rPr>
-          <w:instrText xml:space="preserve"> PAGEREF _Toc239935921 \h </w:instrText>
+          <w:instrText xml:space="preserve"> PAGEREF _Toc240038163 \h </w:instrText>
         </w:r>
         <w:r>
           <w:rPr>
@@ -16731,7 +17496,7 @@
           <w14:ligatures w14:val="standardContextual"/>
         </w:rPr>
       </w:pPr>
-      <w:hyperlink w:anchor="_Toc239935922" w:history="1">
+      <w:hyperlink w:anchor="_Toc240038164" w:history="1">
         <w:r>
           <w:rPr>
             <w:rStyle w:val="Hyperlink"/>
@@ -16758,7 +17523,7 @@
             <w:noProof/>
             <w:webHidden/>
           </w:rPr>
-          <w:instrText xml:space="preserve"> PAGEREF _Toc239935922 \h </w:instrText>
+          <w:instrText xml:space="preserve"> PAGEREF _Toc240038164 \h </w:instrText>
         </w:r>
         <w:r>
           <w:rPr>
@@ -16803,7 +17568,7 @@
           <w14:ligatures w14:val="standardContextual"/>
         </w:rPr>
       </w:pPr>
-      <w:hyperlink w:anchor="_Toc239935923" w:history="1">
+      <w:hyperlink w:anchor="_Toc240038165" w:history="1">
         <w:r>
           <w:rPr>
             <w:rStyle w:val="Hyperlink"/>
@@ -16830,7 +17595,7 @@
             <w:noProof/>
             <w:webHidden/>
           </w:rPr>
-          <w:instrText xml:space="preserve"> PAGEREF _Toc239935923 \h </w:instrText>
+          <w:instrText xml:space="preserve"> PAGEREF _Toc240038165 \h </w:instrText>
         </w:r>
         <w:r>
           <w:rPr>
@@ -16875,7 +17640,7 @@
           <w14:ligatures w14:val="standardContextual"/>
         </w:rPr>
       </w:pPr>
-      <w:hyperlink w:anchor="_Toc239935924" w:history="1">
+      <w:hyperlink w:anchor="_Toc240038166" w:history="1">
         <w:r>
           <w:rPr>
             <w:rStyle w:val="Hyperlink"/>
@@ -16902,7 +17667,7 @@
             <w:noProof/>
             <w:webHidden/>
           </w:rPr>
-          <w:instrText xml:space="preserve"> PAGEREF _Toc239935924 \h </w:instrText>
+          <w:instrText xml:space="preserve"> PAGEREF _Toc240038166 \h </w:instrText>
         </w:r>
         <w:r>
           <w:rPr>
@@ -16947,7 +17712,7 @@
           <w14:ligatures w14:val="standardContextual"/>
         </w:rPr>
       </w:pPr>
-      <w:hyperlink w:anchor="_Toc239935925" w:history="1">
+      <w:hyperlink w:anchor="_Toc240038167" w:history="1">
         <w:r>
           <w:rPr>
             <w:rStyle w:val="Hyperlink"/>
@@ -16974,7 +17739,7 @@
             <w:noProof/>
             <w:webHidden/>
           </w:rPr>
-          <w:instrText xml:space="preserve"> PAGEREF _Toc239935925 \h </w:instrText>
+          <w:instrText xml:space="preserve"> PAGEREF _Toc240038167 \h </w:instrText>
         </w:r>
         <w:r>
           <w:rPr>
@@ -17010,192 +17775,280 @@
         <w:fldChar w:fldCharType="end"/>
       </w:r>
     </w:p>
-    <w:p>
-      <w:pPr>
-        <w:pStyle w:val="Heading1"/>
-        <w:numPr>
-          <w:ilvl w:val="0"/>
-          <w:numId w:val="0"/>
-        </w:numPr>
-        <w:ind w:left="425" w:hanging="425"/>
-      </w:pPr>
-      <w:bookmarkStart w:id="62" w:name="_Toc239935750"/>
-      <w:r>
-        <w:lastRenderedPageBreak/>
-        <w:t>L</w:t>
-      </w:r>
-      <w:r>
-        <w:t>iteratura</w:t>
-      </w:r>
-      <w:bookmarkEnd w:id="62"/>
-    </w:p>
-    <w:p>
-      <w:r>
-        <w:t>Završni rad mora imati</w:t>
-      </w:r>
-      <w:r>
-        <w:t xml:space="preserve"> popis literature na kraju </w:t>
-      </w:r>
-      <w:r>
-        <w:t>rada</w:t>
-      </w:r>
-      <w:r>
-        <w:t xml:space="preserve">. </w:t>
-      </w:r>
-      <w:r>
-        <w:t>Svaka stavka koja je navedena u popisu literature mora se nalaziti u radu.</w:t>
-      </w:r>
-    </w:p>
-    <w:p>
-      <w:r>
-        <w:t>Studenti studija s podru</w:t>
-      </w:r>
-      <w:r>
-        <w:t xml:space="preserve">čja tehničkih znanosti citiranje, referenciranje i navođenje literature rade </w:t>
-      </w:r>
-      <w:r>
-        <w:t>stilom IEEE, dok studenti svih ostalih studija za navedeno koriste Harvardski stil.</w:t>
-      </w:r>
-    </w:p>
-    <w:p>
-      <w:r>
-        <w:t xml:space="preserve">Pravila </w:t>
-      </w:r>
-      <w:r>
-        <w:t xml:space="preserve">korištenja stila IEEE </w:t>
-      </w:r>
-      <w:r>
-        <w:t xml:space="preserve">možete pronaći u dokumentu </w:t>
-      </w:r>
-      <w:hyperlink r:id="rId24" w:history="1">
-        <w:r>
-          <w:rPr>
-            <w:rStyle w:val="Hyperlink"/>
-          </w:rPr>
-          <w:t>https://www.bath.ac.uk/publications/library-guides-to-citing-referencing/attachments/ieee-style-guide.pdf</w:t>
-        </w:r>
-      </w:hyperlink>
-      <w:r>
-        <w:t>.</w:t>
-      </w:r>
-    </w:p>
-    <w:p>
-      <w:r>
-        <w:t>Pravila korištenja Harvardskog stila referenciranja pogledajte na stranici</w:t>
-      </w:r>
-      <w:r>
-        <w:t xml:space="preserve"> </w:t>
-      </w:r>
-      <w:hyperlink r:id="rId25" w:history="1">
-        <w:r>
-          <w:rPr>
-            <w:rStyle w:val="Hyperlink"/>
-          </w:rPr>
-          <w:t>https://www.student.unsw.edu.au/citing-different-sources</w:t>
-        </w:r>
-      </w:hyperlink>
-      <w:r>
-        <w:t>.</w:t>
-      </w:r>
-    </w:p>
-    <w:p/>
-    <w:p>
-      <w:pPr>
-        <w:tabs>
-          <w:tab w:val="left" w:pos="840"/>
-          <w:tab w:val="left" w:pos="5040"/>
-        </w:tabs>
-      </w:pPr>
-      <w:r>
-        <w:rPr>
-          <w:b/>
-          <w:bCs/>
-        </w:rPr>
-        <w:t>Napomena:</w:t>
-      </w:r>
-      <w:r>
-        <w:t xml:space="preserve"> </w:t>
-      </w:r>
-      <w:r>
-        <w:t xml:space="preserve">Na naslov </w:t>
-      </w:r>
-      <w:r>
-        <w:rPr>
-          <w:b/>
-          <w:bCs/>
-        </w:rPr>
-        <w:t>Literatura</w:t>
-      </w:r>
-      <w:r>
-        <w:t xml:space="preserve"> primijenite stil </w:t>
-      </w:r>
-      <w:r>
-        <w:rPr>
-          <w:i/>
-          <w:iCs/>
-        </w:rPr>
-        <w:t>Heading 1</w:t>
-      </w:r>
-      <w:r>
-        <w:t>, a zatim ručno maknite brojčanu oznaku</w:t>
-      </w:r>
-      <w:r>
-        <w:t>.</w:t>
-      </w:r>
-    </w:p>
-    <w:p>
-      <w:pPr>
-        <w:tabs>
-          <w:tab w:val="left" w:pos="840"/>
-          <w:tab w:val="left" w:pos="5040"/>
-        </w:tabs>
-      </w:pPr>
-      <w:r>
-        <w:t>Posebnu pozornost obratite na to da</w:t>
-      </w:r>
-      <w:r>
-        <w:t xml:space="preserve"> je</w:t>
-      </w:r>
-      <w:r>
-        <w:t>,</w:t>
-      </w:r>
-      <w:r>
-        <w:t xml:space="preserve"> ako</w:t>
-      </w:r>
-      <w:r>
-        <w:t xml:space="preserve"> </w:t>
-      </w:r>
-      <w:r>
-        <w:t xml:space="preserve">kao izvor koristite </w:t>
-      </w:r>
-      <w:r>
-        <w:t xml:space="preserve">dokument s </w:t>
-      </w:r>
-      <w:r>
-        <w:t>web</w:t>
-      </w:r>
-      <w:r>
-        <w:t>a</w:t>
-      </w:r>
-      <w:r>
-        <w:t xml:space="preserve">, </w:t>
-      </w:r>
-      <w:r>
-        <w:t>za njega potrebno</w:t>
-      </w:r>
-      <w:r>
-        <w:t xml:space="preserve"> navesti pun</w:t>
-      </w:r>
-      <w:r>
-        <w:t xml:space="preserve">u poveznicu </w:t>
-      </w:r>
-      <w:r>
-        <w:t xml:space="preserve">do korištenog dokumenta i datum kada je dokument preuzet. </w:t>
-      </w:r>
-    </w:p>
+    <w:bookmarkStart w:id="62" w:name="_Toc240038153" w:displacedByCustomXml="next"/>
+    <w:sdt>
+      <w:sdtPr>
+        <w:id w:val="456767432"/>
+        <w:docPartObj>
+          <w:docPartGallery w:val="Bibliographies"/>
+          <w:docPartUnique/>
+        </w:docPartObj>
+      </w:sdtPr>
+      <w:sdtEndPr>
+        <w:rPr>
+          <w:rFonts w:ascii="Times New Roman" w:hAnsi="Times New Roman" w:cs="Times New Roman"/>
+          <w:kern w:val="0"/>
+          <w:sz w:val="24"/>
+          <w:szCs w:val="24"/>
+        </w:rPr>
+      </w:sdtEndPr>
+      <w:sdtContent>
+        <w:p>
+          <w:pPr>
+            <w:pStyle w:val="Heading1"/>
+            <w:numPr>
+              <w:ilvl w:val="0"/>
+              <w:numId w:val="0"/>
+            </w:numPr>
+            <w:ind w:left="425" w:hanging="425"/>
+          </w:pPr>
+          <w:r>
+            <w:t>Literatura</w:t>
+          </w:r>
+          <w:bookmarkEnd w:id="62"/>
+        </w:p>
+        <w:p>
+          <w:pPr>
+            <w:rPr>
+              <w:noProof/>
+              <w:sz w:val="20"/>
+              <w:szCs w:val="20"/>
+              <w:lang w:eastAsia="hr-HR"/>
+            </w:rPr>
+          </w:pPr>
+          <w:r>
+            <w:fldChar w:fldCharType="begin"/>
+          </w:r>
+          <w:r>
+            <w:instrText xml:space="preserve"> BIBLIOGRAPHY </w:instrText>
+          </w:r>
+          <w:r>
+            <w:fldChar w:fldCharType="separate"/>
+          </w:r>
+        </w:p>
+        <w:tbl>
+          <w:tblPr>
+            <w:tblW w:w="5000" w:type="pct"/>
+            <w:tblCellSpacing w:w="15" w:type="dxa"/>
+            <w:tblCellMar>
+              <w:top w:w="15" w:type="dxa"/>
+              <w:left w:w="15" w:type="dxa"/>
+              <w:bottom w:w="15" w:type="dxa"/>
+              <w:right w:w="15" w:type="dxa"/>
+            </w:tblCellMar>
+            <w:tblLook w:val="04A0" w:firstRow="1" w:lastRow="0" w:firstColumn="1" w:lastColumn="0" w:noHBand="0" w:noVBand="1"/>
+          </w:tblPr>
+          <w:tblGrid>
+            <w:gridCol w:w="355"/>
+            <w:gridCol w:w="8433"/>
+          </w:tblGrid>
+          <w:tr>
+            <w:trPr>
+              <w:divId w:val="726029724"/>
+              <w:tblCellSpacing w:w="15" w:type="dxa"/>
+            </w:trPr>
+            <w:tc>
+              <w:tcPr>
+                <w:tcW w:w="50" w:type="pct"/>
+                <w:hideMark/>
+              </w:tcPr>
+              <w:p>
+                <w:pPr>
+                  <w:pStyle w:val="Bibliography"/>
+                  <w:rPr>
+                    <w:noProof/>
+                  </w:rPr>
+                </w:pPr>
+                <w:r>
+                  <w:rPr>
+                    <w:noProof/>
+                  </w:rPr>
+                  <w:t xml:space="preserve">[1] </w:t>
+                </w:r>
+              </w:p>
+            </w:tc>
+            <w:tc>
+              <w:tcPr>
+                <w:tcW w:w="0" w:type="auto"/>
+                <w:hideMark/>
+              </w:tcPr>
+              <w:p>
+                <w:pPr>
+                  <w:pStyle w:val="Bibliography"/>
+                  <w:rPr>
+                    <w:noProof/>
+                  </w:rPr>
+                </w:pPr>
+                <w:r>
+                  <w:rPr>
+                    <w:noProof/>
+                  </w:rPr>
+                  <w:t xml:space="preserve">A. Forrester i E. Boudjnah, How to Build Android Applications with Kotlin: A hands-on guide to developing, testing, and publishing production-grade Android 16 apps, Packt Publishing, 2025. </w:t>
+                </w:r>
+              </w:p>
+            </w:tc>
+          </w:tr>
+          <w:tr>
+            <w:trPr>
+              <w:divId w:val="726029724"/>
+              <w:tblCellSpacing w:w="15" w:type="dxa"/>
+            </w:trPr>
+            <w:tc>
+              <w:tcPr>
+                <w:tcW w:w="50" w:type="pct"/>
+                <w:hideMark/>
+              </w:tcPr>
+              <w:p>
+                <w:pPr>
+                  <w:pStyle w:val="Bibliography"/>
+                  <w:rPr>
+                    <w:noProof/>
+                  </w:rPr>
+                </w:pPr>
+                <w:r>
+                  <w:rPr>
+                    <w:noProof/>
+                  </w:rPr>
+                  <w:t xml:space="preserve">[2] </w:t>
+                </w:r>
+              </w:p>
+            </w:tc>
+            <w:tc>
+              <w:tcPr>
+                <w:tcW w:w="0" w:type="auto"/>
+                <w:hideMark/>
+              </w:tcPr>
+              <w:p>
+                <w:pPr>
+                  <w:pStyle w:val="Bibliography"/>
+                  <w:rPr>
+                    <w:noProof/>
+                  </w:rPr>
+                </w:pPr>
+                <w:r>
+                  <w:rPr>
+                    <w:noProof/>
+                  </w:rPr>
+                  <w:t xml:space="preserve">A. V. Aho, M. S. Lam, R. Sethi i J. Ullman, Compilers: Principles, techniques, and tools, 2nd ed. ur., Pearson Education, 2006. </w:t>
+                </w:r>
+              </w:p>
+            </w:tc>
+          </w:tr>
+          <w:tr>
+            <w:trPr>
+              <w:divId w:val="726029724"/>
+              <w:tblCellSpacing w:w="15" w:type="dxa"/>
+            </w:trPr>
+            <w:tc>
+              <w:tcPr>
+                <w:tcW w:w="50" w:type="pct"/>
+                <w:hideMark/>
+              </w:tcPr>
+              <w:p>
+                <w:pPr>
+                  <w:pStyle w:val="Bibliography"/>
+                  <w:rPr>
+                    <w:noProof/>
+                  </w:rPr>
+                </w:pPr>
+                <w:r>
+                  <w:rPr>
+                    <w:noProof/>
+                  </w:rPr>
+                  <w:t xml:space="preserve">[3] </w:t>
+                </w:r>
+              </w:p>
+            </w:tc>
+            <w:tc>
+              <w:tcPr>
+                <w:tcW w:w="0" w:type="auto"/>
+                <w:hideMark/>
+              </w:tcPr>
+              <w:p>
+                <w:pPr>
+                  <w:pStyle w:val="Bibliography"/>
+                  <w:rPr>
+                    <w:noProof/>
+                  </w:rPr>
+                </w:pPr>
+                <w:r>
+                  <w:rPr>
+                    <w:noProof/>
+                  </w:rPr>
+                  <w:t>T. Grudić, »Mobilna aplikacija za pretvorbu slike s tekstom u tekst primjenom tehnologije optičkog prepoznavanja znakova,« 2024.</w:t>
+                </w:r>
+              </w:p>
+            </w:tc>
+          </w:tr>
+          <w:tr>
+            <w:trPr>
+              <w:divId w:val="726029724"/>
+              <w:tblCellSpacing w:w="15" w:type="dxa"/>
+            </w:trPr>
+            <w:tc>
+              <w:tcPr>
+                <w:tcW w:w="50" w:type="pct"/>
+                <w:hideMark/>
+              </w:tcPr>
+              <w:p>
+                <w:pPr>
+                  <w:pStyle w:val="Bibliography"/>
+                  <w:rPr>
+                    <w:noProof/>
+                  </w:rPr>
+                </w:pPr>
+                <w:r>
+                  <w:rPr>
+                    <w:noProof/>
+                  </w:rPr>
+                  <w:t xml:space="preserve">[4] </w:t>
+                </w:r>
+              </w:p>
+            </w:tc>
+            <w:tc>
+              <w:tcPr>
+                <w:tcW w:w="0" w:type="auto"/>
+                <w:hideMark/>
+              </w:tcPr>
+              <w:p>
+                <w:pPr>
+                  <w:pStyle w:val="Bibliography"/>
+                  <w:rPr>
+                    <w:noProof/>
+                  </w:rPr>
+                </w:pPr>
+                <w:r>
+                  <w:rPr>
+                    <w:noProof/>
+                  </w:rPr>
+                  <w:t>Google for Developers, »Recognize text in images with ML Kit on Android,« 20 travanj 2026. [Mrežno]. Available: https://developers.google.com/ml-kit/vision/text-recognition/v2.</w:t>
+                </w:r>
+              </w:p>
+            </w:tc>
+          </w:tr>
+        </w:tbl>
+        <w:p>
+          <w:pPr>
+            <w:divId w:val="726029724"/>
+            <w:rPr>
+              <w:noProof/>
+            </w:rPr>
+          </w:pPr>
+        </w:p>
+        <w:p>
+          <w:r>
+            <w:rPr>
+              <w:b/>
+              <w:bCs/>
+            </w:rPr>
+            <w:fldChar w:fldCharType="end"/>
+          </w:r>
+        </w:p>
+      </w:sdtContent>
+    </w:sdt>
     <w:sectPr>
-      <w:footerReference w:type="default" r:id="rId26"/>
-      <w:footerReference w:type="first" r:id="rId27"/>
+      <w:footerReference w:type="default" r:id="rId24"/>
+      <w:footerReference w:type="first" r:id="rId25"/>
       <w:pgSz w:w="11907" w:h="16840" w:code="9"/>
       <w:pgMar w:top="1418" w:right="1418" w:bottom="1418" w:left="1701" w:header="851" w:footer="567" w:gutter="0"/>
       <w:pgNumType w:start="1"/>
@@ -18931,7 +19784,7 @@
   </w:docDefaults>
   <w:latentStyles w:defLockedState="0" w:defUIPriority="0" w:defSemiHidden="0" w:defUnhideWhenUsed="0" w:defQFormat="0" w:count="376">
     <w:lsdException w:name="Normal" w:qFormat="1"/>
-    <w:lsdException w:name="heading 1" w:qFormat="1"/>
+    <w:lsdException w:name="heading 1" w:uiPriority="9" w:qFormat="1"/>
     <w:lsdException w:name="heading 2" w:qFormat="1"/>
     <w:lsdException w:name="heading 3" w:qFormat="1"/>
     <w:lsdException w:name="heading 4" w:qFormat="1"/>
@@ -19317,6 +20170,8 @@
     <w:name w:val="heading 1"/>
     <w:basedOn w:val="Normal"/>
     <w:next w:val="Normal"/>
+    <w:link w:val="Heading1Char"/>
+    <w:uiPriority w:val="9"/>
     <w:qFormat/>
     <w:rsid w:val="00AC3ED4"/>
     <w:pPr>
@@ -20106,6 +20961,30 @@
       <w:color w:val="800080" w:themeColor="followedHyperlink"/>
       <w:u w:val="single"/>
     </w:rPr>
+  </w:style>
+  <w:style w:type="character" w:customStyle="1" w:styleId="Heading1Char">
+    <w:name w:val="Heading 1 Char"/>
+    <w:basedOn w:val="DefaultParagraphFont"/>
+    <w:link w:val="Heading1"/>
+    <w:uiPriority w:val="9"/>
+    <w:rsid w:val="00020A64"/>
+    <w:rPr>
+      <w:rFonts w:ascii="Arial" w:hAnsi="Arial" w:cs="Arial"/>
+      <w:b/>
+      <w:bCs/>
+      <w:kern w:val="32"/>
+      <w:sz w:val="36"/>
+      <w:szCs w:val="32"/>
+      <w:lang w:eastAsia="en-US"/>
+    </w:rPr>
+  </w:style>
+  <w:style w:type="paragraph" w:styleId="Bibliography">
+    <w:name w:val="Bibliography"/>
+    <w:basedOn w:val="Normal"/>
+    <w:next w:val="Normal"/>
+    <w:uiPriority w:val="37"/>
+    <w:unhideWhenUsed/>
+    <w:rsid w:val="00020A64"/>
   </w:style>
 </w:styles>
 </file>
@@ -21429,10 +22308,6 @@
 </file>
 
 <file path=customXml/item1.xml><?xml version="1.0" encoding="utf-8"?>
-<b:Sources xmlns:b="http://schemas.openxmlformats.org/officeDocument/2006/bibliography" xmlns="http://schemas.openxmlformats.org/officeDocument/2006/bibliography" SelectedStyle="" StyleName=""/>
-</file>
-
-<file path=customXml/item2.xml><?xml version="1.0" encoding="utf-8"?>
 <p:properties xmlns:p="http://schemas.microsoft.com/office/2006/metadata/properties" xmlns:xsi="http://www.w3.org/2001/XMLSchema-instance" xmlns:pc="http://schemas.microsoft.com/office/infopath/2007/PartnerControls">
   <documentManagement>
     <lcf76f155ced4ddcb4097134ff3c332f xmlns="346bc69e-9362-457f-8135-617ee6cc7bac">
@@ -21443,7 +22318,7 @@
 </p:properties>
 </file>
 
-<file path=customXml/item3.xml><?xml version="1.0" encoding="utf-8"?>
+<file path=customXml/item2.xml><?xml version="1.0" encoding="utf-8"?>
 <?mso-contentType ?>
 <FormTemplates xmlns="http://schemas.microsoft.com/sharepoint/v3/contenttype/forms">
   <Display>DocumentLibraryForm</Display>
@@ -21452,7 +22327,7 @@
 </FormTemplates>
 </file>
 
-<file path=customXml/item4.xml><?xml version="1.0" encoding="utf-8"?>
+<file path=customXml/item3.xml><?xml version="1.0" encoding="utf-8"?>
 <ct:contentTypeSchema xmlns:ct="http://schemas.microsoft.com/office/2006/metadata/contentType" xmlns:ma="http://schemas.microsoft.com/office/2006/metadata/properties/metaAttributes" ct:_="" ma:_="" ma:contentTypeName="Dokument" ma:contentTypeID="0x010100CE8A6C523F15BE45BBB2628A8D195F23" ma:contentTypeVersion="13" ma:contentTypeDescription="Stvaranje novog dokumenta." ma:contentTypeScope="" ma:versionID="6a86de1faa86fa16ad729fe3930c3d49">
   <xsd:schema xmlns:xsd="http://www.w3.org/2001/XMLSchema" xmlns:xs="http://www.w3.org/2001/XMLSchema" xmlns:p="http://schemas.microsoft.com/office/2006/metadata/properties" xmlns:ns2="346bc69e-9362-457f-8135-617ee6cc7bac" xmlns:ns3="05f9ff4f-fb41-4731-8e66-a25ebb0ec23b" targetNamespace="http://schemas.microsoft.com/office/2006/metadata/properties" ma:root="true" ma:fieldsID="8f7b465b8d64df515966ccfc620eb42a" ns2:_="" ns3:_="">
     <xsd:import namespace="346bc69e-9362-457f-8135-617ee6cc7bac"/>
@@ -21659,15 +22534,105 @@
 </ct:contentTypeSchema>
 </file>
 
-<file path=customXml/itemProps1.xml><?xml version="1.0" encoding="utf-8"?>
-<ds:datastoreItem xmlns:ds="http://schemas.openxmlformats.org/officeDocument/2006/customXml" ds:itemID="{6B01A4B5-8F2F-4A9B-8EF4-01CAE8ECC50E}">
-  <ds:schemaRefs>
-    <ds:schemaRef ds:uri="http://schemas.openxmlformats.org/officeDocument/2006/bibliography"/>
-  </ds:schemaRefs>
-</ds:datastoreItem>
+<file path=customXml/item4.xml><?xml version="1.0" encoding="utf-8"?>
+<b:Sources xmlns:b="http://schemas.openxmlformats.org/officeDocument/2006/bibliography" xmlns="http://schemas.openxmlformats.org/officeDocument/2006/bibliography" SelectedStyle="\IEEE2006OfficeOnline.xsl" StyleName="IEEE" Version="2006">
+  <b:Source>
+    <b:Tag>For25</b:Tag>
+    <b:SourceType>Book</b:SourceType>
+    <b:Guid>{D6407706-64AD-44C5-A4EE-A0130F49D198}</b:Guid>
+    <b:Title>How to Build Android Applications with Kotlin: A hands-on guide to developing, testing, and publishing production-grade Android 16 apps</b:Title>
+    <b:Year>2025</b:Year>
+    <b:Publisher>Packt Publishing</b:Publisher>
+    <b:Author>
+      <b:Author>
+        <b:NameList>
+          <b:Person>
+            <b:Last>Forrester</b:Last>
+            <b:First>A.</b:First>
+          </b:Person>
+          <b:Person>
+            <b:Last>Boudjnah</b:Last>
+            <b:First>E.</b:First>
+          </b:Person>
+        </b:NameList>
+      </b:Author>
+    </b:Author>
+    <b:RefOrder>1</b:RefOrder>
+  </b:Source>
+  <b:Source>
+    <b:Tag>Aho06</b:Tag>
+    <b:SourceType>Book</b:SourceType>
+    <b:Guid>{A67BE479-9547-4633-AD94-0E92F47A5A64}</b:Guid>
+    <b:Title>Compilers: Principles, techniques, and tools</b:Title>
+    <b:Year>2006</b:Year>
+    <b:Publisher>Pearson Education</b:Publisher>
+    <b:Author>
+      <b:Author>
+        <b:NameList>
+          <b:Person>
+            <b:Last>Aho</b:Last>
+            <b:First>A. V.</b:First>
+          </b:Person>
+          <b:Person>
+            <b:Last>Lam</b:Last>
+            <b:First>M. S.</b:First>
+          </b:Person>
+          <b:Person>
+            <b:Last>Sethi</b:Last>
+            <b:First>R.</b:First>
+          </b:Person>
+          <b:Person>
+            <b:Last>Ullman</b:Last>
+            <b:First>J.D.</b:First>
+          </b:Person>
+        </b:NameList>
+      </b:Author>
+    </b:Author>
+    <b:Edition>2nd ed.</b:Edition>
+    <b:RefOrder>2</b:RefOrder>
+  </b:Source>
+  <b:Source>
+    <b:Tag>Goo26</b:Tag>
+    <b:SourceType>DocumentFromInternetSite</b:SourceType>
+    <b:Guid>{CB463188-BCFD-4474-83A4-F557E4C9EE05}</b:Guid>
+    <b:Title>Recognize text in images with ML Kit on Android</b:Title>
+    <b:Year>2026</b:Year>
+    <b:Author>
+      <b:Author>
+        <b:Corporate>Google for Developers</b:Corporate>
+      </b:Author>
+    </b:Author>
+    <b:InternetSiteTitle>Google for Developers</b:InternetSiteTitle>
+    <b:Month>travanj</b:Month>
+    <b:Day>20</b:Day>
+    <b:URL>https://developers.google.com/ml-kit/vision/text-recognition/v2</b:URL>
+    <b:RefOrder>4</b:RefOrder>
+  </b:Source>
+  <b:Source>
+    <b:Tag>Gru24</b:Tag>
+    <b:SourceType>Report</b:SourceType>
+    <b:Guid>{F9673649-4FD3-438F-88A2-A18D972BA673}</b:Guid>
+    <b:Title>Mobilna aplikacija za pretvorbu slike s tekstom u tekst primjenom tehnologije optičkog prepoznavanja znakova</b:Title>
+    <b:Year>2024</b:Year>
+    <b:URL>https://urn.nsk.hr/urn:nbn:hr:168:587919</b:URL>
+    <b:Institution>Fakultet elektrotehnike i računarstva, Sveučilište u Zagrebu</b:Institution>
+    <b:ThesisType>Završni rad</b:ThesisType>
+    <b:Author>
+      <b:Author>
+        <b:NameList>
+          <b:Person>
+            <b:Last>Grudić</b:Last>
+            <b:First>T.</b:First>
+          </b:Person>
+        </b:NameList>
+      </b:Author>
+    </b:Author>
+    <b:RefOrder>3</b:RefOrder>
+  </b:Source>
+</b:Sources>
 </file>
 
-<file path=customXml/itemProps2.xml><?xml version="1.0" encoding="utf-8"?>
+<file path=customXml/itemProps1.xml><?xml version="1.0" encoding="utf-8"?>
 <ds:datastoreItem xmlns:ds="http://schemas.openxmlformats.org/officeDocument/2006/customXml" ds:itemID="{5D60AB73-315D-41F5-B86C-A733B1DE9D36}">
   <ds:schemaRefs>
     <ds:schemaRef ds:uri="http://schemas.microsoft.com/office/2006/metadata/properties"/>
@@ -21678,7 +22643,7 @@
 </ds:datastoreItem>
 </file>
 
-<file path=customXml/itemProps3.xml><?xml version="1.0" encoding="utf-8"?>
+<file path=customXml/itemProps2.xml><?xml version="1.0" encoding="utf-8"?>
 <ds:datastoreItem xmlns:ds="http://schemas.openxmlformats.org/officeDocument/2006/customXml" ds:itemID="{4B895F2A-9BBA-40EB-8B52-6127588571FA}">
   <ds:schemaRefs>
     <ds:schemaRef ds:uri="http://schemas.microsoft.com/sharepoint/v3/contenttype/forms"/>
@@ -21686,7 +22651,7 @@
 </ds:datastoreItem>
 </file>
 
-<file path=customXml/itemProps4.xml><?xml version="1.0" encoding="utf-8"?>
+<file path=customXml/itemProps3.xml><?xml version="1.0" encoding="utf-8"?>
 <ds:datastoreItem xmlns:ds="http://schemas.openxmlformats.org/officeDocument/2006/customXml" ds:itemID="{F1F35A86-14E7-45B7-8C97-55729988BED5}">
   <ds:schemaRefs>
     <ds:schemaRef ds:uri="http://schemas.microsoft.com/office/2006/metadata/contentType"/>
@@ -21703,4 +22668,12 @@
     <ds:schemaRef ds:uri="http://schemas.microsoft.com/internal/obd"/>
   </ds:schemaRefs>
 </ds:datastoreItem>
+</file>
+
+<file path=customXml/itemProps4.xml><?xml version="1.0" encoding="utf-8"?>
+<ds:datastoreItem xmlns:ds="http://schemas.openxmlformats.org/officeDocument/2006/customXml" ds:itemID="{E6746475-B202-49DA-9CB3-3E7BA13B2120}">
+  <ds:schemaRefs>
+    <ds:schemaRef ds:uri="http://schemas.openxmlformats.org/officeDocument/2006/bibliography"/>
+  </ds:schemaRefs>
+</ds:datastoreItem>
 </file>
</xml_diff>

<commit_message>
Numbering for conclusion, edit - obrazac
</commit_message>
<xml_diff>
--- a/Doc/Završni_rad_FilipFolnegović.docx
+++ b/Doc/Završni_rad_FilipFolnegović.docx
@@ -288,7 +288,7 @@
           <w:numId w:val="0"/>
         </w:numPr>
       </w:pPr>
-      <w:bookmarkStart w:id="0" w:name="_Toc242813363"/>
+      <w:bookmarkStart w:id="0" w:name="_Toc242946841"/>
       <w:r>
         <w:lastRenderedPageBreak/>
         <w:t>Abstract</w:t>
@@ -351,7 +351,7 @@
         </w:rPr>
       </w:pPr>
       <w:bookmarkStart w:id="1" w:name="_Toc161651753"/>
-      <w:bookmarkStart w:id="2" w:name="_Toc242813364"/>
+      <w:bookmarkStart w:id="2" w:name="_Toc242946842"/>
       <w:r>
         <w:lastRenderedPageBreak/>
         <w:t>Sadržaj</w:t>
@@ -379,7 +379,7 @@
       <w:r>
         <w:fldChar w:fldCharType="separate"/>
       </w:r>
-      <w:hyperlink w:anchor="_Toc242813363" w:history="1">
+      <w:hyperlink w:anchor="_Toc242946841" w:history="1">
         <w:r>
           <w:rPr>
             <w:rStyle w:val="Hyperlink"/>
@@ -407,7 +407,7 @@
           <w14:ligatures w14:val="standardContextual"/>
         </w:rPr>
       </w:pPr>
-      <w:hyperlink w:anchor="_Toc242813364" w:history="1">
+      <w:hyperlink w:anchor="_Toc242946842" w:history="1">
         <w:r>
           <w:rPr>
             <w:rStyle w:val="Hyperlink"/>
@@ -435,7 +435,7 @@
           <w14:ligatures w14:val="standardContextual"/>
         </w:rPr>
       </w:pPr>
-      <w:hyperlink w:anchor="_Toc242813365" w:history="1">
+      <w:hyperlink w:anchor="_Toc242946843" w:history="1">
         <w:r>
           <w:rPr>
             <w:rStyle w:val="Hyperlink"/>
@@ -479,7 +479,7 @@
             <w:noProof/>
             <w:webHidden/>
           </w:rPr>
-          <w:instrText xml:space="preserve"> PAGEREF _Toc242813365 \h </w:instrText>
+          <w:instrText xml:space="preserve"> PAGEREF _Toc242946843 \h </w:instrText>
         </w:r>
         <w:r>
           <w:rPr>
@@ -521,7 +521,7 @@
           <w14:ligatures w14:val="standardContextual"/>
         </w:rPr>
       </w:pPr>
-      <w:hyperlink w:anchor="_Toc242813366" w:history="1">
+      <w:hyperlink w:anchor="_Toc242946844" w:history="1">
         <w:r>
           <w:rPr>
             <w:rStyle w:val="Hyperlink"/>
@@ -565,7 +565,7 @@
             <w:noProof/>
             <w:webHidden/>
           </w:rPr>
-          <w:instrText xml:space="preserve"> PAGEREF _Toc242813366 \h </w:instrText>
+          <w:instrText xml:space="preserve"> PAGEREF _Toc242946844 \h </w:instrText>
         </w:r>
         <w:r>
           <w:rPr>
@@ -611,7 +611,7 @@
           <w14:ligatures w14:val="standardContextual"/>
         </w:rPr>
       </w:pPr>
-      <w:hyperlink w:anchor="_Toc242813367" w:history="1">
+      <w:hyperlink w:anchor="_Toc242946845" w:history="1">
         <w:r>
           <w:rPr>
             <w:rStyle w:val="Hyperlink"/>
@@ -655,7 +655,7 @@
             <w:noProof/>
             <w:webHidden/>
           </w:rPr>
-          <w:instrText xml:space="preserve"> PAGEREF _Toc242813367 \h </w:instrText>
+          <w:instrText xml:space="preserve"> PAGEREF _Toc242946845 \h </w:instrText>
         </w:r>
         <w:r>
           <w:rPr>
@@ -701,7 +701,7 @@
           <w14:ligatures w14:val="standardContextual"/>
         </w:rPr>
       </w:pPr>
-      <w:hyperlink w:anchor="_Toc242813368" w:history="1">
+      <w:hyperlink w:anchor="_Toc242946846" w:history="1">
         <w:r>
           <w:rPr>
             <w:rStyle w:val="Hyperlink"/>
@@ -745,7 +745,7 @@
             <w:noProof/>
             <w:webHidden/>
           </w:rPr>
-          <w:instrText xml:space="preserve"> PAGEREF _Toc242813368 \h </w:instrText>
+          <w:instrText xml:space="preserve"> PAGEREF _Toc242946846 \h </w:instrText>
         </w:r>
         <w:r>
           <w:rPr>
@@ -787,7 +787,7 @@
           <w14:ligatures w14:val="standardContextual"/>
         </w:rPr>
       </w:pPr>
-      <w:hyperlink w:anchor="_Toc242813369" w:history="1">
+      <w:hyperlink w:anchor="_Toc242946847" w:history="1">
         <w:r>
           <w:rPr>
             <w:rStyle w:val="Hyperlink"/>
@@ -831,7 +831,7 @@
             <w:noProof/>
             <w:webHidden/>
           </w:rPr>
-          <w:instrText xml:space="preserve"> PAGEREF _Toc242813369 \h </w:instrText>
+          <w:instrText xml:space="preserve"> PAGEREF _Toc242946847 \h </w:instrText>
         </w:r>
         <w:r>
           <w:rPr>
@@ -877,7 +877,7 @@
           <w14:ligatures w14:val="standardContextual"/>
         </w:rPr>
       </w:pPr>
-      <w:hyperlink w:anchor="_Toc242813370" w:history="1">
+      <w:hyperlink w:anchor="_Toc242946848" w:history="1">
         <w:r>
           <w:rPr>
             <w:rStyle w:val="Hyperlink"/>
@@ -921,7 +921,7 @@
             <w:noProof/>
             <w:webHidden/>
           </w:rPr>
-          <w:instrText xml:space="preserve"> PAGEREF _Toc242813370 \h </w:instrText>
+          <w:instrText xml:space="preserve"> PAGEREF _Toc242946848 \h </w:instrText>
         </w:r>
         <w:r>
           <w:rPr>
@@ -967,7 +967,7 @@
           <w14:ligatures w14:val="standardContextual"/>
         </w:rPr>
       </w:pPr>
-      <w:hyperlink w:anchor="_Toc242813371" w:history="1">
+      <w:hyperlink w:anchor="_Toc242946849" w:history="1">
         <w:r>
           <w:rPr>
             <w:rStyle w:val="Hyperlink"/>
@@ -1011,7 +1011,7 @@
             <w:noProof/>
             <w:webHidden/>
           </w:rPr>
-          <w:instrText xml:space="preserve"> PAGEREF _Toc242813371 \h </w:instrText>
+          <w:instrText xml:space="preserve"> PAGEREF _Toc242946849 \h </w:instrText>
         </w:r>
         <w:r>
           <w:rPr>
@@ -1057,7 +1057,7 @@
           <w14:ligatures w14:val="standardContextual"/>
         </w:rPr>
       </w:pPr>
-      <w:hyperlink w:anchor="_Toc242813372" w:history="1">
+      <w:hyperlink w:anchor="_Toc242946850" w:history="1">
         <w:r>
           <w:rPr>
             <w:rStyle w:val="Hyperlink"/>
@@ -1101,7 +1101,7 @@
             <w:noProof/>
             <w:webHidden/>
           </w:rPr>
-          <w:instrText xml:space="preserve"> PAGEREF _Toc242813372 \h </w:instrText>
+          <w:instrText xml:space="preserve"> PAGEREF _Toc242946850 \h </w:instrText>
         </w:r>
         <w:r>
           <w:rPr>
@@ -1147,7 +1147,7 @@
           <w14:ligatures w14:val="standardContextual"/>
         </w:rPr>
       </w:pPr>
-      <w:hyperlink w:anchor="_Toc242813373" w:history="1">
+      <w:hyperlink w:anchor="_Toc242946851" w:history="1">
         <w:r>
           <w:rPr>
             <w:rStyle w:val="Hyperlink"/>
@@ -1191,7 +1191,7 @@
             <w:noProof/>
             <w:webHidden/>
           </w:rPr>
-          <w:instrText xml:space="preserve"> PAGEREF _Toc242813373 \h </w:instrText>
+          <w:instrText xml:space="preserve"> PAGEREF _Toc242946851 \h </w:instrText>
         </w:r>
         <w:r>
           <w:rPr>
@@ -1233,7 +1233,7 @@
           <w14:ligatures w14:val="standardContextual"/>
         </w:rPr>
       </w:pPr>
-      <w:hyperlink w:anchor="_Toc242813374" w:history="1">
+      <w:hyperlink w:anchor="_Toc242946852" w:history="1">
         <w:r>
           <w:rPr>
             <w:rStyle w:val="Hyperlink"/>
@@ -1277,7 +1277,7 @@
             <w:noProof/>
             <w:webHidden/>
           </w:rPr>
-          <w:instrText xml:space="preserve"> PAGEREF _Toc242813374 \h </w:instrText>
+          <w:instrText xml:space="preserve"> PAGEREF _Toc242946852 \h </w:instrText>
         </w:r>
         <w:r>
           <w:rPr>
@@ -1323,7 +1323,7 @@
           <w14:ligatures w14:val="standardContextual"/>
         </w:rPr>
       </w:pPr>
-      <w:hyperlink w:anchor="_Toc242813375" w:history="1">
+      <w:hyperlink w:anchor="_Toc242946853" w:history="1">
         <w:r>
           <w:rPr>
             <w:rStyle w:val="Hyperlink"/>
@@ -1367,7 +1367,7 @@
             <w:noProof/>
             <w:webHidden/>
           </w:rPr>
-          <w:instrText xml:space="preserve"> PAGEREF _Toc242813375 \h </w:instrText>
+          <w:instrText xml:space="preserve"> PAGEREF _Toc242946853 \h </w:instrText>
         </w:r>
         <w:r>
           <w:rPr>
@@ -1413,7 +1413,7 @@
           <w14:ligatures w14:val="standardContextual"/>
         </w:rPr>
       </w:pPr>
-      <w:hyperlink w:anchor="_Toc242813376" w:history="1">
+      <w:hyperlink w:anchor="_Toc242946854" w:history="1">
         <w:r>
           <w:rPr>
             <w:rStyle w:val="Hyperlink"/>
@@ -1457,7 +1457,7 @@
             <w:noProof/>
             <w:webHidden/>
           </w:rPr>
-          <w:instrText xml:space="preserve"> PAGEREF _Toc242813376 \h </w:instrText>
+          <w:instrText xml:space="preserve"> PAGEREF _Toc242946854 \h </w:instrText>
         </w:r>
         <w:r>
           <w:rPr>
@@ -1503,7 +1503,7 @@
           <w14:ligatures w14:val="standardContextual"/>
         </w:rPr>
       </w:pPr>
-      <w:hyperlink w:anchor="_Toc242813377" w:history="1">
+      <w:hyperlink w:anchor="_Toc242946855" w:history="1">
         <w:r>
           <w:rPr>
             <w:rStyle w:val="Hyperlink"/>
@@ -1547,7 +1547,7 @@
             <w:noProof/>
             <w:webHidden/>
           </w:rPr>
-          <w:instrText xml:space="preserve"> PAGEREF _Toc242813377 \h </w:instrText>
+          <w:instrText xml:space="preserve"> PAGEREF _Toc242946855 \h </w:instrText>
         </w:r>
         <w:r>
           <w:rPr>
@@ -1589,7 +1589,7 @@
           <w14:ligatures w14:val="standardContextual"/>
         </w:rPr>
       </w:pPr>
-      <w:hyperlink w:anchor="_Toc242813378" w:history="1">
+      <w:hyperlink w:anchor="_Toc242946856" w:history="1">
         <w:r>
           <w:rPr>
             <w:rStyle w:val="Hyperlink"/>
@@ -1633,7 +1633,7 @@
             <w:noProof/>
             <w:webHidden/>
           </w:rPr>
-          <w:instrText xml:space="preserve"> PAGEREF _Toc242813378 \h </w:instrText>
+          <w:instrText xml:space="preserve"> PAGEREF _Toc242946856 \h </w:instrText>
         </w:r>
         <w:r>
           <w:rPr>
@@ -1679,7 +1679,7 @@
           <w14:ligatures w14:val="standardContextual"/>
         </w:rPr>
       </w:pPr>
-      <w:hyperlink w:anchor="_Toc242813379" w:history="1">
+      <w:hyperlink w:anchor="_Toc242946857" w:history="1">
         <w:r>
           <w:rPr>
             <w:rStyle w:val="Hyperlink"/>
@@ -1723,7 +1723,7 @@
             <w:noProof/>
             <w:webHidden/>
           </w:rPr>
-          <w:instrText xml:space="preserve"> PAGEREF _Toc242813379 \h </w:instrText>
+          <w:instrText xml:space="preserve"> PAGEREF _Toc242946857 \h </w:instrText>
         </w:r>
         <w:r>
           <w:rPr>
@@ -1769,7 +1769,7 @@
           <w14:ligatures w14:val="standardContextual"/>
         </w:rPr>
       </w:pPr>
-      <w:hyperlink w:anchor="_Toc242813380" w:history="1">
+      <w:hyperlink w:anchor="_Toc242946858" w:history="1">
         <w:r>
           <w:rPr>
             <w:rStyle w:val="Hyperlink"/>
@@ -1813,7 +1813,7 @@
             <w:noProof/>
             <w:webHidden/>
           </w:rPr>
-          <w:instrText xml:space="preserve"> PAGEREF _Toc242813380 \h </w:instrText>
+          <w:instrText xml:space="preserve"> PAGEREF _Toc242946858 \h </w:instrText>
         </w:r>
         <w:r>
           <w:rPr>
@@ -1859,7 +1859,7 @@
           <w14:ligatures w14:val="standardContextual"/>
         </w:rPr>
       </w:pPr>
-      <w:hyperlink w:anchor="_Toc242813381" w:history="1">
+      <w:hyperlink w:anchor="_Toc242946859" w:history="1">
         <w:r>
           <w:rPr>
             <w:rStyle w:val="Hyperlink"/>
@@ -1903,7 +1903,7 @@
             <w:noProof/>
             <w:webHidden/>
           </w:rPr>
-          <w:instrText xml:space="preserve"> PAGEREF _Toc242813381 \h </w:instrText>
+          <w:instrText xml:space="preserve"> PAGEREF _Toc242946859 \h </w:instrText>
         </w:r>
         <w:r>
           <w:rPr>
@@ -1949,7 +1949,7 @@
           <w14:ligatures w14:val="standardContextual"/>
         </w:rPr>
       </w:pPr>
-      <w:hyperlink w:anchor="_Toc242813382" w:history="1">
+      <w:hyperlink w:anchor="_Toc242946860" w:history="1">
         <w:r>
           <w:rPr>
             <w:rStyle w:val="Hyperlink"/>
@@ -1993,7 +1993,7 @@
             <w:noProof/>
             <w:webHidden/>
           </w:rPr>
-          <w:instrText xml:space="preserve"> PAGEREF _Toc242813382 \h </w:instrText>
+          <w:instrText xml:space="preserve"> PAGEREF _Toc242946860 \h </w:instrText>
         </w:r>
         <w:r>
           <w:rPr>
@@ -2039,7 +2039,7 @@
           <w14:ligatures w14:val="standardContextual"/>
         </w:rPr>
       </w:pPr>
-      <w:hyperlink w:anchor="_Toc242813383" w:history="1">
+      <w:hyperlink w:anchor="_Toc242946861" w:history="1">
         <w:r>
           <w:rPr>
             <w:rStyle w:val="Hyperlink"/>
@@ -2083,7 +2083,7 @@
             <w:noProof/>
             <w:webHidden/>
           </w:rPr>
-          <w:instrText xml:space="preserve"> PAGEREF _Toc242813383 \h </w:instrText>
+          <w:instrText xml:space="preserve"> PAGEREF _Toc242946861 \h </w:instrText>
         </w:r>
         <w:r>
           <w:rPr>
@@ -2129,7 +2129,7 @@
           <w14:ligatures w14:val="standardContextual"/>
         </w:rPr>
       </w:pPr>
-      <w:hyperlink w:anchor="_Toc242813384" w:history="1">
+      <w:hyperlink w:anchor="_Toc242946862" w:history="1">
         <w:r>
           <w:rPr>
             <w:rStyle w:val="Hyperlink"/>
@@ -2173,7 +2173,7 @@
             <w:noProof/>
             <w:webHidden/>
           </w:rPr>
-          <w:instrText xml:space="preserve"> PAGEREF _Toc242813384 \h </w:instrText>
+          <w:instrText xml:space="preserve"> PAGEREF _Toc242946862 \h </w:instrText>
         </w:r>
         <w:r>
           <w:rPr>
@@ -2219,7 +2219,7 @@
           <w14:ligatures w14:val="standardContextual"/>
         </w:rPr>
       </w:pPr>
-      <w:hyperlink w:anchor="_Toc242813385" w:history="1">
+      <w:hyperlink w:anchor="_Toc242946863" w:history="1">
         <w:r>
           <w:rPr>
             <w:rStyle w:val="Hyperlink"/>
@@ -2263,7 +2263,7 @@
             <w:noProof/>
             <w:webHidden/>
           </w:rPr>
-          <w:instrText xml:space="preserve"> PAGEREF _Toc242813385 \h </w:instrText>
+          <w:instrText xml:space="preserve"> PAGEREF _Toc242946863 \h </w:instrText>
         </w:r>
         <w:r>
           <w:rPr>
@@ -2309,7 +2309,7 @@
           <w14:ligatures w14:val="standardContextual"/>
         </w:rPr>
       </w:pPr>
-      <w:hyperlink w:anchor="_Toc242813386" w:history="1">
+      <w:hyperlink w:anchor="_Toc242946864" w:history="1">
         <w:r>
           <w:rPr>
             <w:rStyle w:val="Hyperlink"/>
@@ -2353,7 +2353,7 @@
             <w:noProof/>
             <w:webHidden/>
           </w:rPr>
-          <w:instrText xml:space="preserve"> PAGEREF _Toc242813386 \h </w:instrText>
+          <w:instrText xml:space="preserve"> PAGEREF _Toc242946864 \h </w:instrText>
         </w:r>
         <w:r>
           <w:rPr>
@@ -2395,7 +2395,7 @@
           <w14:ligatures w14:val="standardContextual"/>
         </w:rPr>
       </w:pPr>
-      <w:hyperlink w:anchor="_Toc242813387" w:history="1">
+      <w:hyperlink w:anchor="_Toc242946865" w:history="1">
         <w:r>
           <w:rPr>
             <w:rStyle w:val="Hyperlink"/>
@@ -2439,7 +2439,7 @@
             <w:noProof/>
             <w:webHidden/>
           </w:rPr>
-          <w:instrText xml:space="preserve"> PAGEREF _Toc242813387 \h </w:instrText>
+          <w:instrText xml:space="preserve"> PAGEREF _Toc242946865 \h </w:instrText>
         </w:r>
         <w:r>
           <w:rPr>
@@ -2485,7 +2485,7 @@
           <w14:ligatures w14:val="standardContextual"/>
         </w:rPr>
       </w:pPr>
-      <w:hyperlink w:anchor="_Toc242813388" w:history="1">
+      <w:hyperlink w:anchor="_Toc242946866" w:history="1">
         <w:r>
           <w:rPr>
             <w:rStyle w:val="Hyperlink"/>
@@ -2529,7 +2529,7 @@
             <w:noProof/>
             <w:webHidden/>
           </w:rPr>
-          <w:instrText xml:space="preserve"> PAGEREF _Toc242813388 \h </w:instrText>
+          <w:instrText xml:space="preserve"> PAGEREF _Toc242946866 \h </w:instrText>
         </w:r>
         <w:r>
           <w:rPr>
@@ -2575,7 +2575,7 @@
           <w14:ligatures w14:val="standardContextual"/>
         </w:rPr>
       </w:pPr>
-      <w:hyperlink w:anchor="_Toc242813389" w:history="1">
+      <w:hyperlink w:anchor="_Toc242946867" w:history="1">
         <w:r>
           <w:rPr>
             <w:rStyle w:val="Hyperlink"/>
@@ -2619,7 +2619,7 @@
             <w:noProof/>
             <w:webHidden/>
           </w:rPr>
-          <w:instrText xml:space="preserve"> PAGEREF _Toc242813389 \h </w:instrText>
+          <w:instrText xml:space="preserve"> PAGEREF _Toc242946867 \h </w:instrText>
         </w:r>
         <w:r>
           <w:rPr>
@@ -2665,7 +2665,7 @@
           <w14:ligatures w14:val="standardContextual"/>
         </w:rPr>
       </w:pPr>
-      <w:hyperlink w:anchor="_Toc242813390" w:history="1">
+      <w:hyperlink w:anchor="_Toc242946868" w:history="1">
         <w:r>
           <w:rPr>
             <w:rStyle w:val="Hyperlink"/>
@@ -2709,7 +2709,7 @@
             <w:noProof/>
             <w:webHidden/>
           </w:rPr>
-          <w:instrText xml:space="preserve"> PAGEREF _Toc242813390 \h </w:instrText>
+          <w:instrText xml:space="preserve"> PAGEREF _Toc242946868 \h </w:instrText>
         </w:r>
         <w:r>
           <w:rPr>
@@ -2755,7 +2755,7 @@
           <w14:ligatures w14:val="standardContextual"/>
         </w:rPr>
       </w:pPr>
-      <w:hyperlink w:anchor="_Toc242813391" w:history="1">
+      <w:hyperlink w:anchor="_Toc242946869" w:history="1">
         <w:r>
           <w:rPr>
             <w:rStyle w:val="Hyperlink"/>
@@ -2799,7 +2799,7 @@
             <w:noProof/>
             <w:webHidden/>
           </w:rPr>
-          <w:instrText xml:space="preserve"> PAGEREF _Toc242813391 \h </w:instrText>
+          <w:instrText xml:space="preserve"> PAGEREF _Toc242946869 \h </w:instrText>
         </w:r>
         <w:r>
           <w:rPr>
@@ -2845,7 +2845,7 @@
           <w14:ligatures w14:val="standardContextual"/>
         </w:rPr>
       </w:pPr>
-      <w:hyperlink w:anchor="_Toc242813392" w:history="1">
+      <w:hyperlink w:anchor="_Toc242946870" w:history="1">
         <w:r>
           <w:rPr>
             <w:rStyle w:val="Hyperlink"/>
@@ -2889,7 +2889,7 @@
             <w:noProof/>
             <w:webHidden/>
           </w:rPr>
-          <w:instrText xml:space="preserve"> PAGEREF _Toc242813392 \h </w:instrText>
+          <w:instrText xml:space="preserve"> PAGEREF _Toc242946870 \h </w:instrText>
         </w:r>
         <w:r>
           <w:rPr>
@@ -2935,7 +2935,7 @@
           <w14:ligatures w14:val="standardContextual"/>
         </w:rPr>
       </w:pPr>
-      <w:hyperlink w:anchor="_Toc242813393" w:history="1">
+      <w:hyperlink w:anchor="_Toc242946871" w:history="1">
         <w:r>
           <w:rPr>
             <w:rStyle w:val="Hyperlink"/>
@@ -2979,7 +2979,7 @@
             <w:noProof/>
             <w:webHidden/>
           </w:rPr>
-          <w:instrText xml:space="preserve"> PAGEREF _Toc242813393 \h </w:instrText>
+          <w:instrText xml:space="preserve"> PAGEREF _Toc242946871 \h </w:instrText>
         </w:r>
         <w:r>
           <w:rPr>
@@ -3021,12 +3021,29 @@
           <w14:ligatures w14:val="standardContextual"/>
         </w:rPr>
       </w:pPr>
-      <w:hyperlink w:anchor="_Toc242813394" w:history="1">
+      <w:hyperlink w:anchor="_Toc242946872" w:history="1">
         <w:r>
           <w:rPr>
             <w:rStyle w:val="Hyperlink"/>
             <w:noProof/>
           </w:rPr>
+          <w:t>7.</w:t>
+        </w:r>
+        <w:r>
+          <w:rPr>
+            <w:rFonts w:asciiTheme="minorHAnsi" w:eastAsiaTheme="minorEastAsia" w:hAnsiTheme="minorHAnsi" w:cstheme="minorBidi"/>
+            <w:noProof/>
+            <w:kern w:val="2"/>
+            <w:lang w:val="en-DE" w:eastAsia="en-DE"/>
+            <w14:ligatures w14:val="standardContextual"/>
+          </w:rPr>
+          <w:tab/>
+        </w:r>
+        <w:r>
+          <w:rPr>
+            <w:rStyle w:val="Hyperlink"/>
+            <w:noProof/>
+          </w:rPr>
           <w:t>Zaključak</w:t>
         </w:r>
         <w:r>
@@ -3048,7 +3065,7 @@
             <w:noProof/>
             <w:webHidden/>
           </w:rPr>
-          <w:instrText xml:space="preserve"> PAGEREF _Toc242813394 \h </w:instrText>
+          <w:instrText xml:space="preserve"> PAGEREF _Toc242946872 \h </w:instrText>
         </w:r>
         <w:r>
           <w:rPr>
@@ -3090,7 +3107,7 @@
           <w14:ligatures w14:val="standardContextual"/>
         </w:rPr>
       </w:pPr>
-      <w:hyperlink w:anchor="_Toc242813395" w:history="1">
+      <w:hyperlink w:anchor="_Toc242946873" w:history="1">
         <w:r>
           <w:rPr>
             <w:rStyle w:val="Hyperlink"/>
@@ -3117,7 +3134,7 @@
             <w:noProof/>
             <w:webHidden/>
           </w:rPr>
-          <w:instrText xml:space="preserve"> PAGEREF _Toc242813395 \h </w:instrText>
+          <w:instrText xml:space="preserve"> PAGEREF _Toc242946873 \h </w:instrText>
         </w:r>
         <w:r>
           <w:rPr>
@@ -3159,7 +3176,7 @@
           <w14:ligatures w14:val="standardContextual"/>
         </w:rPr>
       </w:pPr>
-      <w:hyperlink w:anchor="_Toc242813396" w:history="1">
+      <w:hyperlink w:anchor="_Toc242946874" w:history="1">
         <w:r>
           <w:rPr>
             <w:rStyle w:val="Hyperlink"/>
@@ -3186,7 +3203,7 @@
             <w:noProof/>
             <w:webHidden/>
           </w:rPr>
-          <w:instrText xml:space="preserve"> PAGEREF _Toc242813396 \h </w:instrText>
+          <w:instrText xml:space="preserve"> PAGEREF _Toc242946874 \h </w:instrText>
         </w:r>
         <w:r>
           <w:rPr>
@@ -3228,7 +3245,7 @@
           <w14:ligatures w14:val="standardContextual"/>
         </w:rPr>
       </w:pPr>
-      <w:hyperlink w:anchor="_Toc242813397" w:history="1">
+      <w:hyperlink w:anchor="_Toc242946875" w:history="1">
         <w:r>
           <w:rPr>
             <w:rStyle w:val="Hyperlink"/>
@@ -3255,7 +3272,7 @@
             <w:noProof/>
             <w:webHidden/>
           </w:rPr>
-          <w:instrText xml:space="preserve"> PAGEREF _Toc242813397 \h </w:instrText>
+          <w:instrText xml:space="preserve"> PAGEREF _Toc242946875 \h </w:instrText>
         </w:r>
         <w:r>
           <w:rPr>
@@ -3308,7 +3325,7 @@
       <w:pPr>
         <w:pStyle w:val="Heading1"/>
       </w:pPr>
-      <w:bookmarkStart w:id="3" w:name="_Toc242813365"/>
+      <w:bookmarkStart w:id="3" w:name="_Toc242946843"/>
       <w:r>
         <w:lastRenderedPageBreak/>
         <w:t>Uvod</w:t>
@@ -3412,7 +3429,7 @@
       <w:pPr>
         <w:pStyle w:val="Heading1"/>
       </w:pPr>
-      <w:bookmarkStart w:id="5" w:name="_Toc242813366"/>
+      <w:bookmarkStart w:id="5" w:name="_Toc242946844"/>
       <w:bookmarkEnd w:id="4"/>
       <w:r>
         <w:lastRenderedPageBreak/>
@@ -3447,7 +3464,7 @@
       <w:pPr>
         <w:pStyle w:val="Heading2"/>
       </w:pPr>
-      <w:bookmarkStart w:id="6" w:name="_Toc242813367"/>
+      <w:bookmarkStart w:id="6" w:name="_Toc242946845"/>
       <w:r>
         <w:t>Pregled sličnih mobilnih aplikacija na tržištu</w:t>
       </w:r>
@@ -3580,7 +3597,7 @@
       <w:pPr>
         <w:pStyle w:val="Heading2"/>
       </w:pPr>
-      <w:bookmarkStart w:id="7" w:name="_Toc242813368"/>
+      <w:bookmarkStart w:id="7" w:name="_Toc242946846"/>
       <w:r>
         <w:t>Prednosti i nedostaci dostupnih alata</w:t>
       </w:r>
@@ -3679,7 +3696,7 @@
       <w:pPr>
         <w:pStyle w:val="Heading1"/>
       </w:pPr>
-      <w:bookmarkStart w:id="8" w:name="_Toc242813369"/>
+      <w:bookmarkStart w:id="8" w:name="_Toc242946847"/>
       <w:r>
         <w:lastRenderedPageBreak/>
         <w:t>Arhitektura sustava i korištene tehnologije</w:t>
@@ -3701,7 +3718,7 @@
       <w:pPr>
         <w:pStyle w:val="Heading2"/>
       </w:pPr>
-      <w:bookmarkStart w:id="9" w:name="_Toc242813370"/>
+      <w:bookmarkStart w:id="9" w:name="_Toc242946848"/>
       <w:r>
         <w:t>Android platforma i programski jezik Kotlin</w:t>
       </w:r>
@@ -3865,7 +3882,7 @@
       <w:pPr>
         <w:pStyle w:val="Heading2"/>
       </w:pPr>
-      <w:bookmarkStart w:id="10" w:name="_Toc242813371"/>
+      <w:bookmarkStart w:id="10" w:name="_Toc242946849"/>
       <w:r>
         <w:t>Arhitektura aplikacije</w:t>
       </w:r>
@@ -3998,7 +4015,7 @@
                             <w:pPr>
                               <w:pStyle w:val="Caption"/>
                             </w:pPr>
-                            <w:bookmarkStart w:id="11" w:name="_Toc242813398"/>
+                            <w:bookmarkStart w:id="11" w:name="_Toc242946876"/>
                             <w:r>
                               <w:t xml:space="preserve">Slika </w:t>
                             </w:r>
@@ -4056,7 +4073,7 @@
                       <w:pPr>
                         <w:pStyle w:val="Caption"/>
                       </w:pPr>
-                      <w:bookmarkStart w:id="12" w:name="_Toc242813398"/>
+                      <w:bookmarkStart w:id="12" w:name="_Toc242946876"/>
                       <w:r>
                         <w:t xml:space="preserve">Slika </w:t>
                       </w:r>
@@ -4197,7 +4214,7 @@
       <w:pPr>
         <w:pStyle w:val="Heading2"/>
       </w:pPr>
-      <w:bookmarkStart w:id="13" w:name="_Toc242813372"/>
+      <w:bookmarkStart w:id="13" w:name="_Toc242946850"/>
       <w:r>
         <w:t>Sustav za lokalnu pohranu podataka</w:t>
       </w:r>
@@ -4252,7 +4269,7 @@
                                 <w:noProof/>
                               </w:rPr>
                             </w:pPr>
-                            <w:bookmarkStart w:id="14" w:name="_Toc242813399"/>
+                            <w:bookmarkStart w:id="14" w:name="_Toc242946877"/>
                             <w:r>
                               <w:t xml:space="preserve">Slika </w:t>
                             </w:r>
@@ -4309,7 +4326,7 @@
                           <w:noProof/>
                         </w:rPr>
                       </w:pPr>
-                      <w:bookmarkStart w:id="15" w:name="_Toc242813399"/>
+                      <w:bookmarkStart w:id="15" w:name="_Toc242946877"/>
                       <w:r>
                         <w:t xml:space="preserve">Slika </w:t>
                       </w:r>
@@ -4533,7 +4550,7 @@
       <w:pPr>
         <w:pStyle w:val="Heading2"/>
       </w:pPr>
-      <w:bookmarkStart w:id="16" w:name="_Toc242813373"/>
+      <w:bookmarkStart w:id="16" w:name="_Toc242946851"/>
       <w:r>
         <w:lastRenderedPageBreak/>
         <w:t>Postojeći alati i biblioteke za optičko prepoznavanje znakova (OCR)</w:t>
@@ -4640,7 +4657,7 @@
       <w:pPr>
         <w:pStyle w:val="Heading1"/>
       </w:pPr>
-      <w:bookmarkStart w:id="17" w:name="_Toc242813374"/>
+      <w:bookmarkStart w:id="17" w:name="_Toc242946852"/>
       <w:r>
         <w:lastRenderedPageBreak/>
         <w:t>Dizajn i funkcionalna specifikacija</w:t>
@@ -4662,7 +4679,7 @@
       <w:pPr>
         <w:pStyle w:val="Heading2"/>
       </w:pPr>
-      <w:bookmarkStart w:id="18" w:name="_Toc242813375"/>
+      <w:bookmarkStart w:id="18" w:name="_Toc242946853"/>
       <w:r>
         <w:t>Korisnički zahtjevi i slučajevi korištenja (Use Cases)</w:t>
       </w:r>
@@ -4718,7 +4735,7 @@
       <w:pPr>
         <w:pStyle w:val="Heading2"/>
       </w:pPr>
-      <w:bookmarkStart w:id="19" w:name="_Toc242813376"/>
+      <w:bookmarkStart w:id="19" w:name="_Toc242946854"/>
       <w:r>
         <w:lastRenderedPageBreak/>
         <w:t>Dizajn korisničkog sučelja (UI) i korisničkog iskustva (UX)</w:t>
@@ -4803,7 +4820,7 @@
       <w:pPr>
         <w:pStyle w:val="Heading2"/>
       </w:pPr>
-      <w:bookmarkStart w:id="20" w:name="_Toc242813377"/>
+      <w:bookmarkStart w:id="20" w:name="_Toc242946855"/>
       <w:r>
         <w:lastRenderedPageBreak/>
         <w:t>Koncept i svrha modula za grafički prikaz funkcija</w:t>
@@ -4897,7 +4914,7 @@
       <w:pPr>
         <w:pStyle w:val="Heading1"/>
       </w:pPr>
-      <w:bookmarkStart w:id="21" w:name="_Toc242813378"/>
+      <w:bookmarkStart w:id="21" w:name="_Toc242946856"/>
       <w:r>
         <w:lastRenderedPageBreak/>
         <w:t>Implementacija aplikacije EquationPocket</w:t>
@@ -4930,7 +4947,7 @@
       <w:pPr>
         <w:pStyle w:val="Heading2"/>
       </w:pPr>
-      <w:bookmarkStart w:id="22" w:name="_Toc242813379"/>
+      <w:bookmarkStart w:id="22" w:name="_Toc242946857"/>
       <w:r>
         <w:t>Razvoj korisničkog sučelja i navigacije u Kotlinu</w:t>
       </w:r>
@@ -5474,7 +5491,7 @@
                             <w:pPr>
                               <w:pStyle w:val="Caption"/>
                             </w:pPr>
-                            <w:bookmarkStart w:id="23" w:name="_Toc242813400"/>
+                            <w:bookmarkStart w:id="23" w:name="_Toc242946878"/>
                             <w:r>
                               <w:t xml:space="preserve">Slika </w:t>
                             </w:r>
@@ -5531,7 +5548,7 @@
                       <w:pPr>
                         <w:pStyle w:val="Caption"/>
                       </w:pPr>
-                      <w:bookmarkStart w:id="24" w:name="_Toc242813400"/>
+                      <w:bookmarkStart w:id="24" w:name="_Toc242946878"/>
                       <w:r>
                         <w:t xml:space="preserve">Slika </w:t>
                       </w:r>
@@ -5703,7 +5720,7 @@
       <w:pPr>
         <w:pStyle w:val="Heading2"/>
       </w:pPr>
-      <w:bookmarkStart w:id="25" w:name="_Toc242813380"/>
+      <w:bookmarkStart w:id="25" w:name="_Toc242946858"/>
       <w:r>
         <w:lastRenderedPageBreak/>
         <w:t>Sustav organizacije jednadžbi</w:t>
@@ -6310,7 +6327,7 @@
           <w:lang w:val="en-DE"/>
         </w:rPr>
       </w:pPr>
-      <w:bookmarkStart w:id="26" w:name="_Toc242813407"/>
+      <w:bookmarkStart w:id="26" w:name="_Toc242946885"/>
       <w:r>
         <w:t xml:space="preserve">Kôd </w:t>
       </w:r>
@@ -6596,7 +6613,7 @@
       <w:pPr>
         <w:pStyle w:val="Heading2"/>
       </w:pPr>
-      <w:bookmarkStart w:id="27" w:name="_Toc242813381"/>
+      <w:bookmarkStart w:id="27" w:name="_Toc242946859"/>
       <w:r>
         <w:t>Modul za unos podataka i integracija postojećih OCR funkcionalnosti</w:t>
       </w:r>
@@ -6927,7 +6944,7 @@
                             <w:pPr>
                               <w:pStyle w:val="Caption"/>
                             </w:pPr>
-                            <w:bookmarkStart w:id="28" w:name="_Toc242813401"/>
+                            <w:bookmarkStart w:id="28" w:name="_Toc242946879"/>
                             <w:r>
                               <w:t xml:space="preserve">Slika </w:t>
                             </w:r>
@@ -6981,7 +6998,7 @@
                       <w:pPr>
                         <w:pStyle w:val="Caption"/>
                       </w:pPr>
-                      <w:bookmarkStart w:id="29" w:name="_Toc242813401"/>
+                      <w:bookmarkStart w:id="29" w:name="_Toc242946879"/>
                       <w:r>
                         <w:t xml:space="preserve">Slika </w:t>
                       </w:r>
@@ -8196,7 +8213,7 @@
           <w:lang w:val="en-DE"/>
         </w:rPr>
       </w:pPr>
-      <w:bookmarkStart w:id="30" w:name="_Toc242813408"/>
+      <w:bookmarkStart w:id="30" w:name="_Toc242946886"/>
       <w:r>
         <w:t xml:space="preserve">Kôd </w:t>
       </w:r>
@@ -8293,7 +8310,7 @@
       <w:pPr>
         <w:pStyle w:val="Heading2"/>
       </w:pPr>
-      <w:bookmarkStart w:id="31" w:name="_Toc242813382"/>
+      <w:bookmarkStart w:id="31" w:name="_Toc242946860"/>
       <w:r>
         <w:t>Algoritam za parsiranje niza znakova i izgradnju stabla</w:t>
       </w:r>
@@ -8396,7 +8413,7 @@
                                 <w:noProof/>
                               </w:rPr>
                             </w:pPr>
-                            <w:bookmarkStart w:id="32" w:name="_Toc242813402"/>
+                            <w:bookmarkStart w:id="32" w:name="_Toc242946880"/>
                             <w:r>
                               <w:t xml:space="preserve">Slika </w:t>
                             </w:r>
@@ -8453,7 +8470,7 @@
                           <w:noProof/>
                         </w:rPr>
                       </w:pPr>
-                      <w:bookmarkStart w:id="33" w:name="_Toc242813402"/>
+                      <w:bookmarkStart w:id="33" w:name="_Toc242946880"/>
                       <w:r>
                         <w:t xml:space="preserve">Slika </w:t>
                       </w:r>
@@ -8724,7 +8741,7 @@
       <w:pPr>
         <w:pStyle w:val="Heading2"/>
       </w:pPr>
-      <w:bookmarkStart w:id="34" w:name="_Toc242813383"/>
+      <w:bookmarkStart w:id="34" w:name="_Toc242946861"/>
       <w:r>
         <w:t>Dinamičko generiranje ulaznih polja i kalkulator nepoznanica</w:t>
       </w:r>
@@ -8911,7 +8928,7 @@
                                 <w:noProof/>
                               </w:rPr>
                             </w:pPr>
-                            <w:bookmarkStart w:id="35" w:name="_Toc242813403"/>
+                            <w:bookmarkStart w:id="35" w:name="_Toc242946881"/>
                             <w:r>
                               <w:t xml:space="preserve">Slika </w:t>
                             </w:r>
@@ -8968,7 +8985,7 @@
                           <w:noProof/>
                         </w:rPr>
                       </w:pPr>
-                      <w:bookmarkStart w:id="36" w:name="_Toc242813403"/>
+                      <w:bookmarkStart w:id="36" w:name="_Toc242946881"/>
                       <w:r>
                         <w:t xml:space="preserve">Slika </w:t>
                       </w:r>
@@ -10475,7 +10492,7 @@
         <w:ind w:left="2160" w:firstLine="720"/>
         <w:jc w:val="left"/>
       </w:pPr>
-      <w:bookmarkStart w:id="37" w:name="_Toc242813409"/>
+      <w:bookmarkStart w:id="37" w:name="_Toc242946887"/>
       <w:r>
         <w:t xml:space="preserve">Kôd </w:t>
       </w:r>
@@ -10570,7 +10587,7 @@
       <w:pPr>
         <w:pStyle w:val="Heading2"/>
       </w:pPr>
-      <w:bookmarkStart w:id="38" w:name="_Toc242813384"/>
+      <w:bookmarkStart w:id="38" w:name="_Toc242946862"/>
       <w:r>
         <w:t>Implementacija modula za iscrtavanje grafova</w:t>
       </w:r>
@@ -10663,7 +10680,7 @@
                                 <w:noProof/>
                               </w:rPr>
                             </w:pPr>
-                            <w:bookmarkStart w:id="39" w:name="_Toc242813404"/>
+                            <w:bookmarkStart w:id="39" w:name="_Toc242946882"/>
                             <w:r>
                               <w:t xml:space="preserve">Slika </w:t>
                             </w:r>
@@ -10717,7 +10734,7 @@
                           <w:noProof/>
                         </w:rPr>
                       </w:pPr>
-                      <w:bookmarkStart w:id="40" w:name="_Toc242813404"/>
+                      <w:bookmarkStart w:id="40" w:name="_Toc242946882"/>
                       <w:r>
                         <w:t xml:space="preserve">Slika </w:t>
                       </w:r>
@@ -10921,7 +10938,7 @@
                             <w:pPr>
                               <w:pStyle w:val="Caption"/>
                             </w:pPr>
-                            <w:bookmarkStart w:id="41" w:name="_Toc242813405"/>
+                            <w:bookmarkStart w:id="41" w:name="_Toc242946883"/>
                             <w:r>
                               <w:t xml:space="preserve">Slika </w:t>
                             </w:r>
@@ -10972,7 +10989,7 @@
                       <w:pPr>
                         <w:pStyle w:val="Caption"/>
                       </w:pPr>
-                      <w:bookmarkStart w:id="42" w:name="_Toc242813405"/>
+                      <w:bookmarkStart w:id="42" w:name="_Toc242946883"/>
                       <w:r>
                         <w:t xml:space="preserve">Slika </w:t>
                       </w:r>
@@ -11211,7 +11228,7 @@
       <w:pPr>
         <w:pStyle w:val="Heading2"/>
       </w:pPr>
-      <w:bookmarkStart w:id="43" w:name="_Toc242813385"/>
+      <w:bookmarkStart w:id="43" w:name="_Toc242946863"/>
       <w:r>
         <w:t>Razvoj vodiča za nove korisnike</w:t>
       </w:r>
@@ -11541,7 +11558,7 @@
       <w:pPr>
         <w:pStyle w:val="Heading2"/>
       </w:pPr>
-      <w:bookmarkStart w:id="44" w:name="_Toc242813386"/>
+      <w:bookmarkStart w:id="44" w:name="_Toc242946864"/>
       <w:r>
         <w:t>Dijeljenje jednadžbi s drugim korisnicima</w:t>
       </w:r>
@@ -12010,7 +12027,7 @@
           <w:lang w:val="en-DE"/>
         </w:rPr>
       </w:pPr>
-      <w:bookmarkStart w:id="45" w:name="_Toc242813410"/>
+      <w:bookmarkStart w:id="45" w:name="_Toc242946888"/>
       <w:r>
         <w:t xml:space="preserve">Kôd </w:t>
       </w:r>
@@ -12141,7 +12158,7 @@
       <w:pPr>
         <w:pStyle w:val="Heading1"/>
       </w:pPr>
-      <w:bookmarkStart w:id="46" w:name="_Toc242813387"/>
+      <w:bookmarkStart w:id="46" w:name="_Toc242946865"/>
       <w:r>
         <w:lastRenderedPageBreak/>
         <w:t>Testiranje aplikacije</w:t>
@@ -12184,7 +12201,7 @@
       <w:pPr>
         <w:pStyle w:val="Heading2"/>
       </w:pPr>
-      <w:bookmarkStart w:id="47" w:name="_Toc242813388"/>
+      <w:bookmarkStart w:id="47" w:name="_Toc242946866"/>
       <w:r>
         <w:t>Metode testiranja na Android uređajima</w:t>
       </w:r>
@@ -12238,7 +12255,7 @@
       <w:pPr>
         <w:pStyle w:val="Heading3"/>
       </w:pPr>
-      <w:bookmarkStart w:id="48" w:name="_Toc242813389"/>
+      <w:bookmarkStart w:id="48" w:name="_Toc242946867"/>
       <w:r>
         <w:t>Unit testing modula za parsiranje i izračun</w:t>
       </w:r>
@@ -12817,7 +12834,7 @@
           <w:lang w:val="en-DE"/>
         </w:rPr>
       </w:pPr>
-      <w:bookmarkStart w:id="49" w:name="_Toc242813411"/>
+      <w:bookmarkStart w:id="49" w:name="_Toc242946889"/>
       <w:r>
         <w:t xml:space="preserve">Kôd </w:t>
       </w:r>
@@ -12888,7 +12905,7 @@
       <w:pPr>
         <w:pStyle w:val="Heading3"/>
       </w:pPr>
-      <w:bookmarkStart w:id="50" w:name="_Toc242813390"/>
+      <w:bookmarkStart w:id="50" w:name="_Toc242946868"/>
       <w:r>
         <w:t>Integracijsko testiranje korisničkog sučelja</w:t>
       </w:r>
@@ -12942,7 +12959,7 @@
       <w:pPr>
         <w:pStyle w:val="Heading2"/>
       </w:pPr>
-      <w:bookmarkStart w:id="51" w:name="_Toc242813391"/>
+      <w:bookmarkStart w:id="51" w:name="_Toc242946869"/>
       <w:r>
         <w:t>Analiza performansi i rezultata testiranja</w:t>
       </w:r>
@@ -12981,7 +12998,7 @@
       <w:pPr>
         <w:pStyle w:val="Heading3"/>
       </w:pPr>
-      <w:bookmarkStart w:id="52" w:name="_Toc242813392"/>
+      <w:bookmarkStart w:id="52" w:name="_Toc242946870"/>
       <w:r>
         <w:t>Analiza preciznosti prepoznavanja tiskanog teksta naspram rukopis</w:t>
       </w:r>
@@ -13016,7 +13033,7 @@
           <w:noProof/>
         </w:rPr>
         <w:drawing>
-          <wp:inline distT="0" distB="0" distL="0" distR="0" wp14:anchorId="2A1BC494" wp14:editId="09A7B9EA">
+          <wp:inline distT="0" distB="0" distL="0" distR="0" wp14:anchorId="2A1BC494" wp14:editId="6D7A19E8">
             <wp:extent cx="5580380" cy="2805430"/>
             <wp:effectExtent l="0" t="0" r="1270" b="13970"/>
             <wp:docPr id="23170721" name="Chart 1">
@@ -13042,7 +13059,7 @@
         <w:ind w:left="2160" w:firstLine="720"/>
         <w:jc w:val="both"/>
       </w:pPr>
-      <w:bookmarkStart w:id="53" w:name="_Toc242813406"/>
+      <w:bookmarkStart w:id="53" w:name="_Toc242946884"/>
       <w:r>
         <w:t xml:space="preserve">Slika </w:t>
       </w:r>
@@ -13183,7 +13200,7 @@
       <w:pPr>
         <w:pStyle w:val="Heading3"/>
       </w:pPr>
-      <w:bookmarkStart w:id="54" w:name="_Toc242813393"/>
+      <w:bookmarkStart w:id="54" w:name="_Toc242946871"/>
       <w:r>
         <w:t>Mjerenje vremena iscrtavanja grafa u ovisnosti o broju točaka i veličini liste rezultata</w:t>
       </w:r>
@@ -13276,6 +13293,817 @@
       <w:r>
         <w:lastRenderedPageBreak/>
         <w:t>grla koja jednostavni ispis vremena ne otkriva. Četvrto, rezultati pokazuju da kvaliteta slike snažno utječe na točnost prepoznavanja, pa bi se naknadno mogla ispitati dodatna predobrada snimke, na primjer povećanje kontrasta ili ispravljanje nagiba, i izmjeriti njezin učinak na točnost. Naposljetku, testiranje pristupačnosti, kao što je provjera sa čitačem zaslona i povećanim pismom, dopunilo bi dosadašnju provjeru tamne i svijetle teme.</w:t>
+      </w:r>
+    </w:p>
+    <w:p>
+      <w:pPr>
+        <w:pStyle w:val="Heading1"/>
+      </w:pPr>
+      <w:bookmarkStart w:id="55" w:name="_Toc242946872"/>
+      <w:r>
+        <w:lastRenderedPageBreak/>
+        <w:t>Zaključak</w:t>
+      </w:r>
+      <w:bookmarkEnd w:id="55"/>
+    </w:p>
+    <w:p>
+      <w:r>
+        <w:t xml:space="preserve">Razvoj mobilne aplikacije EquationPocket uspješan </w:t>
+      </w:r>
+      <w:r>
+        <w:t xml:space="preserve">je </w:t>
+      </w:r>
+      <w:r>
+        <w:t xml:space="preserve">primjer </w:t>
+      </w:r>
+      <w:r>
+        <w:t>spajanja</w:t>
+      </w:r>
+      <w:r>
+        <w:t xml:space="preserve"> modernih Android tehnologija i naprednih sustava za računalnu algebru. Kroz cijeli proces izrade, od analize inicijalnih korisničkih zahtjeva do finalnog testiranja na fizičkim uređajima, primarni fokus bio je na rješavanju konkretnih problema s kojima se susreću korisnici u STEM područjima.</w:t>
+      </w:r>
+    </w:p>
+    <w:p>
+      <w:r>
+        <w:t>Glavni cilj rada, isporuka funkcionalnog digitalnog repozitorija jednadžbi, potpuno je ostvaren. Implementirani sustav mapa omogućuje korisnicima intuitivnu organizaciju i brzo dohvaćanje formula, dok integrirani Symja CAS engine osigurava visoku razinu inteligencije pri rješavanju kompleksnih matematičkih problema. Poseban uspjeh postignut je u domeni unosa podataka; kombinacija prilagođene znanstvene tastature i OCR modula temeljenog na Google ML Kit tehnologiji drastično smanjuje vrijeme potrebno za digitalizaciju jednadžbi.</w:t>
+      </w:r>
+    </w:p>
+    <w:p>
+      <w:r>
+        <w:t>Testiranja su potvrdila da aplikacija stabilno rukuje rubnim slučajevima poput matematičkih nedefiniranosti i ekstremnih numeričkih raspona. Uvođenje vizualizacijskog modula s podrškom za logaritamske skale i automatskim generiranjem povijesti izračuna transformiralo je aplikaciju iz običnog kalkulatora u analitički alat. Konačni doprinos rada očituje se u softverskom rješenju koje je prilagodljivo, brzo i spremno za primjenu u realnim akademskim i laboratorijskim uvjetima.</w:t>
+      </w:r>
+    </w:p>
+    <w:p>
+      <w:r>
+        <w:t>Iako EquationPocket u trenutnoj verziji pokriva sve ključne funkcionalnosti predviđene temom rada, postoji zna</w:t>
+      </w:r>
+      <w:r>
+        <w:t>tan</w:t>
+      </w:r>
+      <w:r>
+        <w:t xml:space="preserve"> prostor za buduća proširenja. Prva </w:t>
+      </w:r>
+      <w:r>
+        <w:t xml:space="preserve">je </w:t>
+      </w:r>
+      <w:r>
+        <w:t>smjernica za daljnji razvoj uvođenje podrške za LaTeX renderiranje unutar popisa jednadžbi, čime bi se postigao vizualni prikaz formula identičan onome u tiskanim znanstvenim radovima.</w:t>
+      </w:r>
+      <w:r>
+        <w:t xml:space="preserve"> </w:t>
+      </w:r>
+      <w:r>
+        <w:t xml:space="preserve">Postojeći </w:t>
+      </w:r>
+      <w:r>
+        <w:t xml:space="preserve">Base64 sustav dijeljenja mogao bi se nadograditi integracijom s uslugama u oblaku (engl. </w:t>
+      </w:r>
+      <w:r>
+        <w:rPr>
+          <w:i/>
+          <w:iCs/>
+        </w:rPr>
+        <w:t>Cloud Sync</w:t>
+      </w:r>
+      <w:r>
+        <w:t>), što bi korisnicima omogućilo automatsku sinkronizaciju mapa na više različitih uređaja. Daljnja optimizacija OCR algoritama korištenjem specijaliziranih neuronskih mreža za matematički rukopis mogla bi dodatno povećati preciznost očitavanja u izazovnim uvjetima. Zaključno, EquationPocket postavlja čvrste temelje za razvoj napredne digitalne platforme koja bi u budućnosti mogla postati nezaobilazan dio standardne opreme svakog znanstvenika i studenta.</w:t>
+      </w:r>
+      <w:r>
+        <w:br w:type="page"/>
+      </w:r>
+    </w:p>
+    <w:p>
+      <w:r>
+        <w:lastRenderedPageBreak/>
+        <w:t>Pod punom odgovornošću pismeno potvrđujem da je ovo moj autorski rad čiji niti jedan dio nije nastao kopiranjem ili plagiranjem tuđeg sadržaja</w:t>
+      </w:r>
+      <w:r>
+        <w:t>, niti generiranjem od strane AI alata</w:t>
+      </w:r>
+      <w:r>
+        <w:t>. Prilikom izrade rada koristio sam tuđe materijale navedene u popisu literature, ali nisam kopirao niti jedan njihov dio, osim citata za koje sam naveo autora i izvor te ih jasno označio znakovima navodnika. U slučaju da se u bilo kojem trenutku dokaže suprotno, spreman sam snositi sve posljedice uključujući i poništenje javne isprave stečene dijelom i na temelju ovoga rada</w:t>
+      </w:r>
+      <w:r>
+        <w:t>.</w:t>
+      </w:r>
+    </w:p>
+    <w:p/>
+    <w:p>
+      <w:r>
+        <w:t xml:space="preserve">U Zagrebu, </w:t>
+      </w:r>
+      <w:r>
+        <w:t>16.10</w:t>
+      </w:r>
+      <w:r>
+        <w:t>.</w:t>
+      </w:r>
+      <w:r>
+        <w:t>2026</w:t>
+      </w:r>
+    </w:p>
+    <w:p>
+      <w:pPr>
+        <w:ind w:left="4536"/>
+        <w:jc w:val="center"/>
+      </w:pPr>
+      <w:r>
+        <w:t>Filip Folnegović</w:t>
+      </w:r>
+    </w:p>
+    <w:p>
+      <w:pPr>
+        <w:rPr>
+          <w:rFonts w:ascii="Arial" w:hAnsi="Arial" w:cs="Arial"/>
+          <w:b/>
+          <w:bCs/>
+          <w:kern w:val="32"/>
+          <w:sz w:val="36"/>
+          <w:szCs w:val="32"/>
+        </w:rPr>
+      </w:pPr>
+      <w:r>
+        <w:br w:type="page"/>
+      </w:r>
+    </w:p>
+    <w:p>
+      <w:pPr>
+        <w:pStyle w:val="Heading1"/>
+        <w:numPr>
+          <w:ilvl w:val="0"/>
+          <w:numId w:val="0"/>
+        </w:numPr>
+      </w:pPr>
+      <w:bookmarkStart w:id="56" w:name="_Toc242946873"/>
+      <w:r>
+        <w:lastRenderedPageBreak/>
+        <w:t xml:space="preserve">Popis </w:t>
+      </w:r>
+      <w:r>
+        <w:t>slika</w:t>
+      </w:r>
+      <w:bookmarkEnd w:id="56"/>
+    </w:p>
+    <w:p>
+      <w:pPr>
+        <w:pStyle w:val="TableofFigures"/>
+        <w:tabs>
+          <w:tab w:val="right" w:leader="dot" w:pos="8778"/>
+        </w:tabs>
+        <w:rPr>
+          <w:rFonts w:asciiTheme="minorHAnsi" w:eastAsiaTheme="minorEastAsia" w:hAnsiTheme="minorHAnsi" w:cstheme="minorBidi"/>
+          <w:noProof/>
+          <w:kern w:val="2"/>
+          <w:lang w:val="en-DE" w:eastAsia="en-DE"/>
+          <w14:ligatures w14:val="standardContextual"/>
+        </w:rPr>
+      </w:pPr>
+      <w:r>
+        <w:fldChar w:fldCharType="begin"/>
+      </w:r>
+      <w:r>
+        <w:instrText xml:space="preserve"> TOC \h \z \c "Slika" </w:instrText>
+      </w:r>
+      <w:r>
+        <w:fldChar w:fldCharType="separate"/>
+      </w:r>
+      <w:hyperlink w:anchor="_Toc242946876" w:history="1">
+        <w:r>
+          <w:rPr>
+            <w:rStyle w:val="Hyperlink"/>
+            <w:noProof/>
+          </w:rPr>
+          <w:t>Slika 3.1 Prikaz MVVM arhitekture aplikacije i protoka podataka kroz slojeve</w:t>
+        </w:r>
+        <w:r>
+          <w:rPr>
+            <w:noProof/>
+            <w:webHidden/>
+          </w:rPr>
+          <w:tab/>
+        </w:r>
+        <w:r>
+          <w:rPr>
+            <w:noProof/>
+            <w:webHidden/>
+          </w:rPr>
+          <w:fldChar w:fldCharType="begin"/>
+        </w:r>
+        <w:r>
+          <w:rPr>
+            <w:noProof/>
+            <w:webHidden/>
+          </w:rPr>
+          <w:instrText xml:space="preserve"> PAGEREF _Toc242946876 \h </w:instrText>
+        </w:r>
+        <w:r>
+          <w:rPr>
+            <w:noProof/>
+            <w:webHidden/>
+          </w:rPr>
+        </w:r>
+        <w:r>
+          <w:rPr>
+            <w:noProof/>
+            <w:webHidden/>
+          </w:rPr>
+          <w:fldChar w:fldCharType="separate"/>
+        </w:r>
+        <w:r>
+          <w:rPr>
+            <w:noProof/>
+            <w:webHidden/>
+          </w:rPr>
+          <w:t>6</w:t>
+        </w:r>
+        <w:r>
+          <w:rPr>
+            <w:noProof/>
+            <w:webHidden/>
+          </w:rPr>
+          <w:fldChar w:fldCharType="end"/>
+        </w:r>
+      </w:hyperlink>
+    </w:p>
+    <w:p>
+      <w:pPr>
+        <w:pStyle w:val="TableofFigures"/>
+        <w:tabs>
+          <w:tab w:val="right" w:leader="dot" w:pos="8778"/>
+        </w:tabs>
+        <w:rPr>
+          <w:rFonts w:asciiTheme="minorHAnsi" w:eastAsiaTheme="minorEastAsia" w:hAnsiTheme="minorHAnsi" w:cstheme="minorBidi"/>
+          <w:noProof/>
+          <w:kern w:val="2"/>
+          <w:lang w:val="en-DE" w:eastAsia="en-DE"/>
+          <w14:ligatures w14:val="standardContextual"/>
+        </w:rPr>
+      </w:pPr>
+      <w:hyperlink w:anchor="_Toc242946877" w:history="1">
+        <w:r>
+          <w:rPr>
+            <w:rStyle w:val="Hyperlink"/>
+            <w:noProof/>
+          </w:rPr>
+          <w:t>Slika 3.2 ER dijagram relacijske baze podataka s prikazom tablica Pocket i Equation</w:t>
+        </w:r>
+        <w:r>
+          <w:rPr>
+            <w:noProof/>
+            <w:webHidden/>
+          </w:rPr>
+          <w:tab/>
+        </w:r>
+        <w:r>
+          <w:rPr>
+            <w:noProof/>
+            <w:webHidden/>
+          </w:rPr>
+          <w:fldChar w:fldCharType="begin"/>
+        </w:r>
+        <w:r>
+          <w:rPr>
+            <w:noProof/>
+            <w:webHidden/>
+          </w:rPr>
+          <w:instrText xml:space="preserve"> PAGEREF _Toc242946877 \h </w:instrText>
+        </w:r>
+        <w:r>
+          <w:rPr>
+            <w:noProof/>
+            <w:webHidden/>
+          </w:rPr>
+        </w:r>
+        <w:r>
+          <w:rPr>
+            <w:noProof/>
+            <w:webHidden/>
+          </w:rPr>
+          <w:fldChar w:fldCharType="separate"/>
+        </w:r>
+        <w:r>
+          <w:rPr>
+            <w:noProof/>
+            <w:webHidden/>
+          </w:rPr>
+          <w:t>7</w:t>
+        </w:r>
+        <w:r>
+          <w:rPr>
+            <w:noProof/>
+            <w:webHidden/>
+          </w:rPr>
+          <w:fldChar w:fldCharType="end"/>
+        </w:r>
+      </w:hyperlink>
+    </w:p>
+    <w:p>
+      <w:pPr>
+        <w:pStyle w:val="TableofFigures"/>
+        <w:tabs>
+          <w:tab w:val="right" w:leader="dot" w:pos="8778"/>
+        </w:tabs>
+        <w:rPr>
+          <w:rFonts w:asciiTheme="minorHAnsi" w:eastAsiaTheme="minorEastAsia" w:hAnsiTheme="minorHAnsi" w:cstheme="minorBidi"/>
+          <w:noProof/>
+          <w:kern w:val="2"/>
+          <w:lang w:val="en-DE" w:eastAsia="en-DE"/>
+          <w14:ligatures w14:val="standardContextual"/>
+        </w:rPr>
+      </w:pPr>
+      <w:hyperlink w:anchor="_Toc242946878" w:history="1">
+        <w:r>
+          <w:rPr>
+            <w:rStyle w:val="Hyperlink"/>
+            <w:noProof/>
+          </w:rPr>
+          <w:t>Slika 5.1 Korisničko sučelje aplikacije na početnom ekranu u svijetlom i tamnom načinu rada</w:t>
+        </w:r>
+        <w:r>
+          <w:rPr>
+            <w:noProof/>
+            <w:webHidden/>
+          </w:rPr>
+          <w:tab/>
+        </w:r>
+        <w:r>
+          <w:rPr>
+            <w:noProof/>
+            <w:webHidden/>
+          </w:rPr>
+          <w:fldChar w:fldCharType="begin"/>
+        </w:r>
+        <w:r>
+          <w:rPr>
+            <w:noProof/>
+            <w:webHidden/>
+          </w:rPr>
+          <w:instrText xml:space="preserve"> PAGEREF _Toc242946878 \h </w:instrText>
+        </w:r>
+        <w:r>
+          <w:rPr>
+            <w:noProof/>
+            <w:webHidden/>
+          </w:rPr>
+        </w:r>
+        <w:r>
+          <w:rPr>
+            <w:noProof/>
+            <w:webHidden/>
+          </w:rPr>
+          <w:fldChar w:fldCharType="separate"/>
+        </w:r>
+        <w:r>
+          <w:rPr>
+            <w:noProof/>
+            <w:webHidden/>
+          </w:rPr>
+          <w:t>16</w:t>
+        </w:r>
+        <w:r>
+          <w:rPr>
+            <w:noProof/>
+            <w:webHidden/>
+          </w:rPr>
+          <w:fldChar w:fldCharType="end"/>
+        </w:r>
+      </w:hyperlink>
+    </w:p>
+    <w:p>
+      <w:pPr>
+        <w:pStyle w:val="TableofFigures"/>
+        <w:tabs>
+          <w:tab w:val="right" w:leader="dot" w:pos="8778"/>
+        </w:tabs>
+        <w:rPr>
+          <w:rFonts w:asciiTheme="minorHAnsi" w:eastAsiaTheme="minorEastAsia" w:hAnsiTheme="minorHAnsi" w:cstheme="minorBidi"/>
+          <w:noProof/>
+          <w:kern w:val="2"/>
+          <w:lang w:val="en-DE" w:eastAsia="en-DE"/>
+          <w14:ligatures w14:val="standardContextual"/>
+        </w:rPr>
+      </w:pPr>
+      <w:hyperlink w:anchor="_Toc242946879" w:history="1">
+        <w:r>
+          <w:rPr>
+            <w:rStyle w:val="Hyperlink"/>
+            <w:noProof/>
+          </w:rPr>
+          <w:t>Slika 5.2 Sučelje OCR skenera s definiranim okvirom za izdvajanje regije od interesa (ROI)</w:t>
+        </w:r>
+        <w:r>
+          <w:rPr>
+            <w:noProof/>
+            <w:webHidden/>
+          </w:rPr>
+          <w:tab/>
+        </w:r>
+        <w:r>
+          <w:rPr>
+            <w:noProof/>
+            <w:webHidden/>
+          </w:rPr>
+          <w:fldChar w:fldCharType="begin"/>
+        </w:r>
+        <w:r>
+          <w:rPr>
+            <w:noProof/>
+            <w:webHidden/>
+          </w:rPr>
+          <w:instrText xml:space="preserve"> PAGEREF _Toc242946879 \h </w:instrText>
+        </w:r>
+        <w:r>
+          <w:rPr>
+            <w:noProof/>
+            <w:webHidden/>
+          </w:rPr>
+        </w:r>
+        <w:r>
+          <w:rPr>
+            <w:noProof/>
+            <w:webHidden/>
+          </w:rPr>
+          <w:fldChar w:fldCharType="separate"/>
+        </w:r>
+        <w:r>
+          <w:rPr>
+            <w:noProof/>
+            <w:webHidden/>
+          </w:rPr>
+          <w:t>23</w:t>
+        </w:r>
+        <w:r>
+          <w:rPr>
+            <w:noProof/>
+            <w:webHidden/>
+          </w:rPr>
+          <w:fldChar w:fldCharType="end"/>
+        </w:r>
+      </w:hyperlink>
+    </w:p>
+    <w:p>
+      <w:pPr>
+        <w:pStyle w:val="TableofFigures"/>
+        <w:tabs>
+          <w:tab w:val="right" w:leader="dot" w:pos="8778"/>
+        </w:tabs>
+        <w:rPr>
+          <w:rFonts w:asciiTheme="minorHAnsi" w:eastAsiaTheme="minorEastAsia" w:hAnsiTheme="minorHAnsi" w:cstheme="minorBidi"/>
+          <w:noProof/>
+          <w:kern w:val="2"/>
+          <w:lang w:val="en-DE" w:eastAsia="en-DE"/>
+          <w14:ligatures w14:val="standardContextual"/>
+        </w:rPr>
+      </w:pPr>
+      <w:hyperlink w:anchor="_Toc242946880" w:history="1">
+        <w:r>
+          <w:rPr>
+            <w:rStyle w:val="Hyperlink"/>
+            <w:noProof/>
+          </w:rPr>
+          <w:t>Slika 5.3 Hijerarhijski prikaz apstraktnog sintaktičkog stabla (AST)</w:t>
+        </w:r>
+        <w:r>
+          <w:rPr>
+            <w:noProof/>
+            <w:webHidden/>
+          </w:rPr>
+          <w:tab/>
+        </w:r>
+        <w:r>
+          <w:rPr>
+            <w:noProof/>
+            <w:webHidden/>
+          </w:rPr>
+          <w:fldChar w:fldCharType="begin"/>
+        </w:r>
+        <w:r>
+          <w:rPr>
+            <w:noProof/>
+            <w:webHidden/>
+          </w:rPr>
+          <w:instrText xml:space="preserve"> PAGEREF _Toc242946880 \h </w:instrText>
+        </w:r>
+        <w:r>
+          <w:rPr>
+            <w:noProof/>
+            <w:webHidden/>
+          </w:rPr>
+        </w:r>
+        <w:r>
+          <w:rPr>
+            <w:noProof/>
+            <w:webHidden/>
+          </w:rPr>
+          <w:fldChar w:fldCharType="separate"/>
+        </w:r>
+        <w:r>
+          <w:rPr>
+            <w:noProof/>
+            <w:webHidden/>
+          </w:rPr>
+          <w:t>26</w:t>
+        </w:r>
+        <w:r>
+          <w:rPr>
+            <w:noProof/>
+            <w:webHidden/>
+          </w:rPr>
+          <w:fldChar w:fldCharType="end"/>
+        </w:r>
+      </w:hyperlink>
+    </w:p>
+    <w:p>
+      <w:pPr>
+        <w:pStyle w:val="TableofFigures"/>
+        <w:tabs>
+          <w:tab w:val="right" w:leader="dot" w:pos="8778"/>
+        </w:tabs>
+        <w:rPr>
+          <w:rFonts w:asciiTheme="minorHAnsi" w:eastAsiaTheme="minorEastAsia" w:hAnsiTheme="minorHAnsi" w:cstheme="minorBidi"/>
+          <w:noProof/>
+          <w:kern w:val="2"/>
+          <w:lang w:val="en-DE" w:eastAsia="en-DE"/>
+          <w14:ligatures w14:val="standardContextual"/>
+        </w:rPr>
+      </w:pPr>
+      <w:hyperlink w:anchor="_Toc242946881" w:history="1">
+        <w:r>
+          <w:rPr>
+            <w:rStyle w:val="Hyperlink"/>
+            <w:noProof/>
+          </w:rPr>
+          <w:t>Slika 5.4 Ekran Solvera s dinamički izgeneriranim poljima za varijable i prilagođenom znanstvenom tipkovnicom</w:t>
+        </w:r>
+        <w:r>
+          <w:rPr>
+            <w:noProof/>
+            <w:webHidden/>
+          </w:rPr>
+          <w:tab/>
+        </w:r>
+        <w:r>
+          <w:rPr>
+            <w:noProof/>
+            <w:webHidden/>
+          </w:rPr>
+          <w:fldChar w:fldCharType="begin"/>
+        </w:r>
+        <w:r>
+          <w:rPr>
+            <w:noProof/>
+            <w:webHidden/>
+          </w:rPr>
+          <w:instrText xml:space="preserve"> PAGEREF _Toc242946881 \h </w:instrText>
+        </w:r>
+        <w:r>
+          <w:rPr>
+            <w:noProof/>
+            <w:webHidden/>
+          </w:rPr>
+        </w:r>
+        <w:r>
+          <w:rPr>
+            <w:noProof/>
+            <w:webHidden/>
+          </w:rPr>
+          <w:fldChar w:fldCharType="separate"/>
+        </w:r>
+        <w:r>
+          <w:rPr>
+            <w:noProof/>
+            <w:webHidden/>
+          </w:rPr>
+          <w:t>30</w:t>
+        </w:r>
+        <w:r>
+          <w:rPr>
+            <w:noProof/>
+            <w:webHidden/>
+          </w:rPr>
+          <w:fldChar w:fldCharType="end"/>
+        </w:r>
+      </w:hyperlink>
+    </w:p>
+    <w:p>
+      <w:pPr>
+        <w:pStyle w:val="TableofFigures"/>
+        <w:tabs>
+          <w:tab w:val="right" w:leader="dot" w:pos="8778"/>
+        </w:tabs>
+        <w:rPr>
+          <w:rFonts w:asciiTheme="minorHAnsi" w:eastAsiaTheme="minorEastAsia" w:hAnsiTheme="minorHAnsi" w:cstheme="minorBidi"/>
+          <w:noProof/>
+          <w:kern w:val="2"/>
+          <w:lang w:val="en-DE" w:eastAsia="en-DE"/>
+          <w14:ligatures w14:val="standardContextual"/>
+        </w:rPr>
+      </w:pPr>
+      <w:hyperlink w:anchor="_Toc242946882" w:history="1">
+        <w:r>
+          <w:rPr>
+            <w:rStyle w:val="Hyperlink"/>
+            <w:noProof/>
+          </w:rPr>
+          <w:t>Slika 5.5 Povijest izračuna</w:t>
+        </w:r>
+        <w:r>
+          <w:rPr>
+            <w:noProof/>
+            <w:webHidden/>
+          </w:rPr>
+          <w:tab/>
+        </w:r>
+        <w:r>
+          <w:rPr>
+            <w:noProof/>
+            <w:webHidden/>
+          </w:rPr>
+          <w:fldChar w:fldCharType="begin"/>
+        </w:r>
+        <w:r>
+          <w:rPr>
+            <w:noProof/>
+            <w:webHidden/>
+          </w:rPr>
+          <w:instrText xml:space="preserve"> PAGEREF _Toc242946882 \h </w:instrText>
+        </w:r>
+        <w:r>
+          <w:rPr>
+            <w:noProof/>
+            <w:webHidden/>
+          </w:rPr>
+        </w:r>
+        <w:r>
+          <w:rPr>
+            <w:noProof/>
+            <w:webHidden/>
+          </w:rPr>
+          <w:fldChar w:fldCharType="separate"/>
+        </w:r>
+        <w:r>
+          <w:rPr>
+            <w:noProof/>
+            <w:webHidden/>
+          </w:rPr>
+          <w:t>36</w:t>
+        </w:r>
+        <w:r>
+          <w:rPr>
+            <w:noProof/>
+            <w:webHidden/>
+          </w:rPr>
+          <w:fldChar w:fldCharType="end"/>
+        </w:r>
+      </w:hyperlink>
+    </w:p>
+    <w:p>
+      <w:pPr>
+        <w:pStyle w:val="TableofFigures"/>
+        <w:tabs>
+          <w:tab w:val="right" w:leader="dot" w:pos="8778"/>
+        </w:tabs>
+        <w:rPr>
+          <w:rFonts w:asciiTheme="minorHAnsi" w:eastAsiaTheme="minorEastAsia" w:hAnsiTheme="minorHAnsi" w:cstheme="minorBidi"/>
+          <w:noProof/>
+          <w:kern w:val="2"/>
+          <w:lang w:val="en-DE" w:eastAsia="en-DE"/>
+          <w14:ligatures w14:val="standardContextual"/>
+        </w:rPr>
+      </w:pPr>
+      <w:hyperlink w:anchor="_Toc242946883" w:history="1">
+        <w:r>
+          <w:rPr>
+            <w:rStyle w:val="Hyperlink"/>
+            <w:noProof/>
+          </w:rPr>
+          <w:t>Slika 5.6 Graf s prilagođenim osima</w:t>
+        </w:r>
+        <w:r>
+          <w:rPr>
+            <w:noProof/>
+            <w:webHidden/>
+          </w:rPr>
+          <w:tab/>
+        </w:r>
+        <w:r>
+          <w:rPr>
+            <w:noProof/>
+            <w:webHidden/>
+          </w:rPr>
+          <w:fldChar w:fldCharType="begin"/>
+        </w:r>
+        <w:r>
+          <w:rPr>
+            <w:noProof/>
+            <w:webHidden/>
+          </w:rPr>
+          <w:instrText xml:space="preserve"> PAGEREF _Toc242946883 \h </w:instrText>
+        </w:r>
+        <w:r>
+          <w:rPr>
+            <w:noProof/>
+            <w:webHidden/>
+          </w:rPr>
+        </w:r>
+        <w:r>
+          <w:rPr>
+            <w:noProof/>
+            <w:webHidden/>
+          </w:rPr>
+          <w:fldChar w:fldCharType="separate"/>
+        </w:r>
+        <w:r>
+          <w:rPr>
+            <w:noProof/>
+            <w:webHidden/>
+          </w:rPr>
+          <w:t>37</w:t>
+        </w:r>
+        <w:r>
+          <w:rPr>
+            <w:noProof/>
+            <w:webHidden/>
+          </w:rPr>
+          <w:fldChar w:fldCharType="end"/>
+        </w:r>
+      </w:hyperlink>
+    </w:p>
+    <w:p>
+      <w:pPr>
+        <w:pStyle w:val="TableofFigures"/>
+        <w:tabs>
+          <w:tab w:val="right" w:leader="dot" w:pos="8778"/>
+        </w:tabs>
+        <w:rPr>
+          <w:rFonts w:asciiTheme="minorHAnsi" w:eastAsiaTheme="minorEastAsia" w:hAnsiTheme="minorHAnsi" w:cstheme="minorBidi"/>
+          <w:noProof/>
+          <w:kern w:val="2"/>
+          <w:lang w:val="en-DE" w:eastAsia="en-DE"/>
+          <w14:ligatures w14:val="standardContextual"/>
+        </w:rPr>
+      </w:pPr>
+      <w:hyperlink w:anchor="_Toc242946884" w:history="1">
+        <w:r>
+          <w:rPr>
+            <w:rStyle w:val="Hyperlink"/>
+            <w:noProof/>
+          </w:rPr>
+          <w:t>Slika 6.1 Graf agregiranih rezultata</w:t>
+        </w:r>
+        <w:r>
+          <w:rPr>
+            <w:noProof/>
+            <w:webHidden/>
+          </w:rPr>
+          <w:tab/>
+        </w:r>
+        <w:r>
+          <w:rPr>
+            <w:noProof/>
+            <w:webHidden/>
+          </w:rPr>
+          <w:fldChar w:fldCharType="begin"/>
+        </w:r>
+        <w:r>
+          <w:rPr>
+            <w:noProof/>
+            <w:webHidden/>
+          </w:rPr>
+          <w:instrText xml:space="preserve"> PAGEREF _Toc242946884 \h </w:instrText>
+        </w:r>
+        <w:r>
+          <w:rPr>
+            <w:noProof/>
+            <w:webHidden/>
+          </w:rPr>
+        </w:r>
+        <w:r>
+          <w:rPr>
+            <w:noProof/>
+            <w:webHidden/>
+          </w:rPr>
+          <w:fldChar w:fldCharType="separate"/>
+        </w:r>
+        <w:r>
+          <w:rPr>
+            <w:noProof/>
+            <w:webHidden/>
+          </w:rPr>
+          <w:t>47</w:t>
+        </w:r>
+        <w:r>
+          <w:rPr>
+            <w:noProof/>
+            <w:webHidden/>
+          </w:rPr>
+          <w:fldChar w:fldCharType="end"/>
+        </w:r>
+      </w:hyperlink>
+    </w:p>
+    <w:p>
+      <w:r>
+        <w:fldChar w:fldCharType="end"/>
       </w:r>
     </w:p>
     <w:p>
@@ -13287,141 +14115,12 @@
         </w:numPr>
         <w:ind w:left="425" w:hanging="425"/>
       </w:pPr>
-      <w:bookmarkStart w:id="55" w:name="_Toc242813394"/>
+      <w:bookmarkStart w:id="57" w:name="_Toc242946874"/>
       <w:r>
         <w:lastRenderedPageBreak/>
-        <w:t>Zaključak</w:t>
-      </w:r>
-      <w:bookmarkEnd w:id="55"/>
-    </w:p>
-    <w:p>
-      <w:r>
-        <w:t xml:space="preserve">Razvoj mobilne aplikacije EquationPocket uspješan </w:t>
-      </w:r>
-      <w:r>
-        <w:t xml:space="preserve">je </w:t>
-      </w:r>
-      <w:r>
-        <w:t xml:space="preserve">primjer </w:t>
-      </w:r>
-      <w:r>
-        <w:t>spajanja</w:t>
-      </w:r>
-      <w:r>
-        <w:t xml:space="preserve"> modernih Android tehnologija i naprednih sustava za računalnu algebru. Kroz cijeli proces izrade, od analize inicijalnih korisničkih zahtjeva do finalnog testiranja na fizičkim uređajima, primarni fokus bio je na rješavanju konkretnih problema s kojima se susreću korisnici u STEM područjima.</w:t>
-      </w:r>
-    </w:p>
-    <w:p>
-      <w:r>
-        <w:t>Glavni cilj rada, isporuka funkcionalnog digitalnog repozitorija jednadžbi, potpuno je ostvaren. Implementirani sustav mapa omogućuje korisnicima intuitivnu organizaciju i brzo dohvaćanje formula, dok integrirani Symja CAS engine osigurava visoku razinu inteligencije pri rješavanju kompleksnih matematičkih problema. Poseban uspjeh postignut je u domeni unosa podataka; kombinacija prilagođene znanstvene tastature i OCR modula temeljenog na Google ML Kit tehnologiji drastično smanjuje vrijeme potrebno za digitalizaciju jednadžbi.</w:t>
-      </w:r>
-    </w:p>
-    <w:p>
-      <w:r>
-        <w:t>Testiranja su potvrdila da aplikacija stabilno rukuje rubnim slučajevima poput matematičkih nedefiniranosti i ekstremnih numeričkih raspona. Uvođenje vizualizacijskog modula s podrškom za logaritamske skale i automatskim generiranjem povijesti izračuna transformiralo je aplikaciju iz običnog kalkulatora u analitički alat. Konačni doprinos rada očituje se u softverskom rješenju koje je prilagodljivo, brzo i spremno za primjenu u realnim akademskim i laboratorijskim uvjetima.</w:t>
-      </w:r>
-    </w:p>
-    <w:p>
-      <w:r>
-        <w:t>Iako EquationPocket u trenutnoj verziji pokriva sve ključne funkcionalnosti predviđene temom rada, postoji zna</w:t>
-      </w:r>
-      <w:r>
-        <w:t>tan</w:t>
-      </w:r>
-      <w:r>
-        <w:t xml:space="preserve"> prostor za buduća proširenja. Prva </w:t>
-      </w:r>
-      <w:r>
-        <w:t xml:space="preserve">je </w:t>
-      </w:r>
-      <w:r>
-        <w:t>smjernica za daljnji razvoj uvođenje podrške za LaTeX renderiranje unutar popisa jednadžbi, čime bi se postigao vizualni prikaz formula identičan onome u tiskanim znanstvenim radovima.</w:t>
-      </w:r>
-      <w:r>
-        <w:t xml:space="preserve"> </w:t>
-      </w:r>
-      <w:r>
-        <w:t xml:space="preserve">Postojeći </w:t>
-      </w:r>
-      <w:r>
-        <w:t xml:space="preserve">Base64 sustav dijeljenja mogao bi se nadograditi integracijom s uslugama u oblaku (engl. </w:t>
-      </w:r>
-      <w:r>
-        <w:rPr>
-          <w:i/>
-          <w:iCs/>
-        </w:rPr>
-        <w:t>Cloud Sync</w:t>
-      </w:r>
-      <w:r>
-        <w:t>), što bi korisnicima omogućilo automatsku sinkronizaciju mapa na više različitih uređaja. Daljnja optimizacija OCR algoritama korištenjem specijaliziranih neuronskih mreža za matematički rukopis mogla bi dodatno povećati preciznost očitavanja u izazovnim uvjetima. Zaključno, EquationPocket postavlja čvrste temelje za razvoj napredne digitalne platforme koja bi u budućnosti mogla postati nezaobilazan dio standardne opreme svakog znanstvenika i studenta.</w:t>
-      </w:r>
-      <w:r>
-        <w:br w:type="page"/>
-      </w:r>
-    </w:p>
-    <w:p>
-      <w:r>
-        <w:lastRenderedPageBreak/>
-        <w:t>Pod punom odgovornošću pismeno potvrđujem da je ovo moj autorski rad čiji niti jedan dio nije nastao kopiranjem ili plagiranjem tuđeg sadržaja</w:t>
-      </w:r>
-      <w:r>
-        <w:t>, niti generiranjem od strane AI alata</w:t>
-      </w:r>
-      <w:r>
-        <w:t>. Prilikom izrade rada koristio sam tuđe materijale navedene u popisu literature, ali nisam kopirao niti jedan njihov dio, osim citata za koje sam naveo autora i izvor te ih jasno označio znakovima navodnika. U slučaju da se u bilo kojem trenutku dokaže suprotno, spreman sam snositi sve posljedice uključujući i poništenje javne isprave stečene dijelom i na temelju ovoga rada</w:t>
-      </w:r>
-      <w:r>
-        <w:t>.</w:t>
-      </w:r>
-    </w:p>
-    <w:p/>
-    <w:p>
-      <w:r>
-        <w:t>U Zagrebu, datum mjesec 202x.</w:t>
-      </w:r>
-    </w:p>
-    <w:p>
-      <w:pPr>
-        <w:ind w:left="4536"/>
-        <w:jc w:val="center"/>
-      </w:pPr>
-      <w:r>
-        <w:t>Ime i prezime studenta</w:t>
-      </w:r>
-    </w:p>
-    <w:p>
-      <w:pPr>
-        <w:rPr>
-          <w:rFonts w:ascii="Arial" w:hAnsi="Arial" w:cs="Arial"/>
-          <w:b/>
-          <w:bCs/>
-          <w:kern w:val="32"/>
-          <w:sz w:val="36"/>
-          <w:szCs w:val="32"/>
-        </w:rPr>
-      </w:pPr>
-      <w:r>
-        <w:br w:type="page"/>
-      </w:r>
-    </w:p>
-    <w:p>
-      <w:pPr>
-        <w:pStyle w:val="Heading1"/>
-        <w:numPr>
-          <w:ilvl w:val="0"/>
-          <w:numId w:val="0"/>
-        </w:numPr>
-      </w:pPr>
-      <w:bookmarkStart w:id="56" w:name="_Toc242813395"/>
-      <w:r>
-        <w:lastRenderedPageBreak/>
-        <w:t xml:space="preserve">Popis </w:t>
-      </w:r>
-      <w:r>
-        <w:t>slika</w:t>
-      </w:r>
-      <w:bookmarkEnd w:id="56"/>
+        <w:t>Popis kôdova</w:t>
+      </w:r>
+      <w:bookmarkEnd w:id="57"/>
     </w:p>
     <w:p>
       <w:pPr>
@@ -13441,18 +14140,18 @@
         <w:fldChar w:fldCharType="begin"/>
       </w:r>
       <w:r>
-        <w:instrText xml:space="preserve"> TOC \h \z \c "Slika" </w:instrText>
+        <w:instrText xml:space="preserve"> TOC \h \z \c "Kôd" </w:instrText>
       </w:r>
       <w:r>
         <w:fldChar w:fldCharType="separate"/>
       </w:r>
-      <w:hyperlink w:anchor="_Toc242813398" w:history="1">
+      <w:hyperlink w:anchor="_Toc242946885" w:history="1">
         <w:r>
           <w:rPr>
             <w:rStyle w:val="Hyperlink"/>
             <w:noProof/>
           </w:rPr>
-          <w:t>Slika 3.1 Prikaz MVVM arhitekture aplikacije i protoka podataka kroz slojeve</w:t>
+          <w:t>Kôd 5.1 EquationDao</w:t>
         </w:r>
         <w:r>
           <w:rPr>
@@ -13473,7 +14172,7 @@
             <w:noProof/>
             <w:webHidden/>
           </w:rPr>
-          <w:instrText xml:space="preserve"> PAGEREF _Toc242813398 \h </w:instrText>
+          <w:instrText xml:space="preserve"> PAGEREF _Toc242946885 \h </w:instrText>
         </w:r>
         <w:r>
           <w:rPr>
@@ -13493,7 +14192,7 @@
             <w:noProof/>
             <w:webHidden/>
           </w:rPr>
-          <w:t>6</w:t>
+          <w:t>19</w:t>
         </w:r>
         <w:r>
           <w:rPr>
@@ -13518,13 +14217,13 @@
           <w14:ligatures w14:val="standardContextual"/>
         </w:rPr>
       </w:pPr>
-      <w:hyperlink w:anchor="_Toc242813399" w:history="1">
+      <w:hyperlink w:anchor="_Toc242946886" w:history="1">
         <w:r>
           <w:rPr>
             <w:rStyle w:val="Hyperlink"/>
             <w:noProof/>
           </w:rPr>
-          <w:t>Slika 3.2 ER dijagram relacijske baze podataka s prikazom tablica Pocket i Equation</w:t>
+          <w:t>Kôd 5.2 Kôd za OCR post-procesiranje</w:t>
         </w:r>
         <w:r>
           <w:rPr>
@@ -13545,7 +14244,7 @@
             <w:noProof/>
             <w:webHidden/>
           </w:rPr>
-          <w:instrText xml:space="preserve"> PAGEREF _Toc242813399 \h </w:instrText>
+          <w:instrText xml:space="preserve"> PAGEREF _Toc242946886 \h </w:instrText>
         </w:r>
         <w:r>
           <w:rPr>
@@ -13565,7 +14264,7 @@
             <w:noProof/>
             <w:webHidden/>
           </w:rPr>
-          <w:t>7</w:t>
+          <w:t>25</w:t>
         </w:r>
         <w:r>
           <w:rPr>
@@ -13590,13 +14289,13 @@
           <w14:ligatures w14:val="standardContextual"/>
         </w:rPr>
       </w:pPr>
-      <w:hyperlink w:anchor="_Toc242813400" w:history="1">
+      <w:hyperlink w:anchor="_Toc242946887" w:history="1">
         <w:r>
           <w:rPr>
             <w:rStyle w:val="Hyperlink"/>
             <w:noProof/>
           </w:rPr>
-          <w:t>Slika 5.1 Korisničko sučelje aplikacije na početnom ekranu u svijetlom i tamnom načinu rada</w:t>
+          <w:t>Kôd 5.3 Kôd za konstrukciju Solve() upita</w:t>
         </w:r>
         <w:r>
           <w:rPr>
@@ -13617,7 +14316,7 @@
             <w:noProof/>
             <w:webHidden/>
           </w:rPr>
-          <w:instrText xml:space="preserve"> PAGEREF _Toc242813400 \h </w:instrText>
+          <w:instrText xml:space="preserve"> PAGEREF _Toc242946887 \h </w:instrText>
         </w:r>
         <w:r>
           <w:rPr>
@@ -13637,7 +14336,7 @@
             <w:noProof/>
             <w:webHidden/>
           </w:rPr>
-          <w:t>16</w:t>
+          <w:t>34</w:t>
         </w:r>
         <w:r>
           <w:rPr>
@@ -13662,13 +14361,13 @@
           <w14:ligatures w14:val="standardContextual"/>
         </w:rPr>
       </w:pPr>
-      <w:hyperlink w:anchor="_Toc242813401" w:history="1">
+      <w:hyperlink w:anchor="_Toc242946888" w:history="1">
         <w:r>
           <w:rPr>
             <w:rStyle w:val="Hyperlink"/>
             <w:noProof/>
           </w:rPr>
-          <w:t>Slika 5.2 Sučelje OCR skenera s definiranim okvirom za izdvajanje regije od interesa (ROI)</w:t>
+          <w:t>Kôd 5.4 Kôd za serijalizaciju i Base64 enkodiranje</w:t>
         </w:r>
         <w:r>
           <w:rPr>
@@ -13689,7 +14388,7 @@
             <w:noProof/>
             <w:webHidden/>
           </w:rPr>
-          <w:instrText xml:space="preserve"> PAGEREF _Toc242813401 \h </w:instrText>
+          <w:instrText xml:space="preserve"> PAGEREF _Toc242946888 \h </w:instrText>
         </w:r>
         <w:r>
           <w:rPr>
@@ -13709,7 +14408,7 @@
             <w:noProof/>
             <w:webHidden/>
           </w:rPr>
-          <w:t>23</w:t>
+          <w:t>41</w:t>
         </w:r>
         <w:r>
           <w:rPr>
@@ -13734,13 +14433,13 @@
           <w14:ligatures w14:val="standardContextual"/>
         </w:rPr>
       </w:pPr>
-      <w:hyperlink w:anchor="_Toc242813402" w:history="1">
+      <w:hyperlink w:anchor="_Toc242946889" w:history="1">
         <w:r>
           <w:rPr>
             <w:rStyle w:val="Hyperlink"/>
             <w:noProof/>
           </w:rPr>
-          <w:t>Slika 5.3 Hijerarhijski prikaz apstraktnog sintaktičkog stabla (AST)</w:t>
+          <w:t>Kôd 6.1 Kod za unit testove</w:t>
         </w:r>
         <w:r>
           <w:rPr>
@@ -13761,7 +14460,7 @@
             <w:noProof/>
             <w:webHidden/>
           </w:rPr>
-          <w:instrText xml:space="preserve"> PAGEREF _Toc242813402 \h </w:instrText>
+          <w:instrText xml:space="preserve"> PAGEREF _Toc242946889 \h </w:instrText>
         </w:r>
         <w:r>
           <w:rPr>
@@ -13781,7 +14480,7 @@
             <w:noProof/>
             <w:webHidden/>
           </w:rPr>
-          <w:t>26</w:t>
+          <w:t>46</w:t>
         </w:r>
         <w:r>
           <w:rPr>
@@ -13793,689 +14492,11 @@
       </w:hyperlink>
     </w:p>
     <w:p>
-      <w:pPr>
-        <w:pStyle w:val="TableofFigures"/>
-        <w:tabs>
-          <w:tab w:val="right" w:leader="dot" w:pos="8778"/>
-        </w:tabs>
-        <w:rPr>
-          <w:rFonts w:asciiTheme="minorHAnsi" w:eastAsiaTheme="minorEastAsia" w:hAnsiTheme="minorHAnsi" w:cstheme="minorBidi"/>
-          <w:noProof/>
-          <w:kern w:val="2"/>
-          <w:lang w:val="en-DE" w:eastAsia="en-DE"/>
-          <w14:ligatures w14:val="standardContextual"/>
-        </w:rPr>
-      </w:pPr>
-      <w:hyperlink w:anchor="_Toc242813403" w:history="1">
-        <w:r>
-          <w:rPr>
-            <w:rStyle w:val="Hyperlink"/>
-            <w:noProof/>
-          </w:rPr>
-          <w:t>Slika 5.4 Ekran Solvera s dinamički izgeneriranim poljima za varijable i prilagođenom znanstvenom tipkovnicom</w:t>
-        </w:r>
-        <w:r>
-          <w:rPr>
-            <w:noProof/>
-            <w:webHidden/>
-          </w:rPr>
-          <w:tab/>
-        </w:r>
-        <w:r>
-          <w:rPr>
-            <w:noProof/>
-            <w:webHidden/>
-          </w:rPr>
-          <w:fldChar w:fldCharType="begin"/>
-        </w:r>
-        <w:r>
-          <w:rPr>
-            <w:noProof/>
-            <w:webHidden/>
-          </w:rPr>
-          <w:instrText xml:space="preserve"> PAGEREF _Toc242813403 \h </w:instrText>
-        </w:r>
-        <w:r>
-          <w:rPr>
-            <w:noProof/>
-            <w:webHidden/>
-          </w:rPr>
-        </w:r>
-        <w:r>
-          <w:rPr>
-            <w:noProof/>
-            <w:webHidden/>
-          </w:rPr>
-          <w:fldChar w:fldCharType="separate"/>
-        </w:r>
-        <w:r>
-          <w:rPr>
-            <w:noProof/>
-            <w:webHidden/>
-          </w:rPr>
-          <w:t>30</w:t>
-        </w:r>
-        <w:r>
-          <w:rPr>
-            <w:noProof/>
-            <w:webHidden/>
-          </w:rPr>
-          <w:fldChar w:fldCharType="end"/>
-        </w:r>
-      </w:hyperlink>
-    </w:p>
-    <w:p>
-      <w:pPr>
-        <w:pStyle w:val="TableofFigures"/>
-        <w:tabs>
-          <w:tab w:val="right" w:leader="dot" w:pos="8778"/>
-        </w:tabs>
-        <w:rPr>
-          <w:rFonts w:asciiTheme="minorHAnsi" w:eastAsiaTheme="minorEastAsia" w:hAnsiTheme="minorHAnsi" w:cstheme="minorBidi"/>
-          <w:noProof/>
-          <w:kern w:val="2"/>
-          <w:lang w:val="en-DE" w:eastAsia="en-DE"/>
-          <w14:ligatures w14:val="standardContextual"/>
-        </w:rPr>
-      </w:pPr>
-      <w:hyperlink w:anchor="_Toc242813404" w:history="1">
-        <w:r>
-          <w:rPr>
-            <w:rStyle w:val="Hyperlink"/>
-            <w:noProof/>
-          </w:rPr>
-          <w:t>Slika 5.5 Povijest izračuna</w:t>
-        </w:r>
-        <w:r>
-          <w:rPr>
-            <w:noProof/>
-            <w:webHidden/>
-          </w:rPr>
-          <w:tab/>
-        </w:r>
-        <w:r>
-          <w:rPr>
-            <w:noProof/>
-            <w:webHidden/>
-          </w:rPr>
-          <w:fldChar w:fldCharType="begin"/>
-        </w:r>
-        <w:r>
-          <w:rPr>
-            <w:noProof/>
-            <w:webHidden/>
-          </w:rPr>
-          <w:instrText xml:space="preserve"> PAGEREF _Toc242813404 \h </w:instrText>
-        </w:r>
-        <w:r>
-          <w:rPr>
-            <w:noProof/>
-            <w:webHidden/>
-          </w:rPr>
-        </w:r>
-        <w:r>
-          <w:rPr>
-            <w:noProof/>
-            <w:webHidden/>
-          </w:rPr>
-          <w:fldChar w:fldCharType="separate"/>
-        </w:r>
-        <w:r>
-          <w:rPr>
-            <w:noProof/>
-            <w:webHidden/>
-          </w:rPr>
-          <w:t>36</w:t>
-        </w:r>
-        <w:r>
-          <w:rPr>
-            <w:noProof/>
-            <w:webHidden/>
-          </w:rPr>
-          <w:fldChar w:fldCharType="end"/>
-        </w:r>
-      </w:hyperlink>
-    </w:p>
-    <w:p>
-      <w:pPr>
-        <w:pStyle w:val="TableofFigures"/>
-        <w:tabs>
-          <w:tab w:val="right" w:leader="dot" w:pos="8778"/>
-        </w:tabs>
-        <w:rPr>
-          <w:rFonts w:asciiTheme="minorHAnsi" w:eastAsiaTheme="minorEastAsia" w:hAnsiTheme="minorHAnsi" w:cstheme="minorBidi"/>
-          <w:noProof/>
-          <w:kern w:val="2"/>
-          <w:lang w:val="en-DE" w:eastAsia="en-DE"/>
-          <w14:ligatures w14:val="standardContextual"/>
-        </w:rPr>
-      </w:pPr>
-      <w:hyperlink w:anchor="_Toc242813405" w:history="1">
-        <w:r>
-          <w:rPr>
-            <w:rStyle w:val="Hyperlink"/>
-            <w:noProof/>
-          </w:rPr>
-          <w:t>Slika 5.6 Graf s prilagođenim osima</w:t>
-        </w:r>
-        <w:r>
-          <w:rPr>
-            <w:noProof/>
-            <w:webHidden/>
-          </w:rPr>
-          <w:tab/>
-        </w:r>
-        <w:r>
-          <w:rPr>
-            <w:noProof/>
-            <w:webHidden/>
-          </w:rPr>
-          <w:fldChar w:fldCharType="begin"/>
-        </w:r>
-        <w:r>
-          <w:rPr>
-            <w:noProof/>
-            <w:webHidden/>
-          </w:rPr>
-          <w:instrText xml:space="preserve"> PAGEREF _Toc242813405 \h </w:instrText>
-        </w:r>
-        <w:r>
-          <w:rPr>
-            <w:noProof/>
-            <w:webHidden/>
-          </w:rPr>
-        </w:r>
-        <w:r>
-          <w:rPr>
-            <w:noProof/>
-            <w:webHidden/>
-          </w:rPr>
-          <w:fldChar w:fldCharType="separate"/>
-        </w:r>
-        <w:r>
-          <w:rPr>
-            <w:noProof/>
-            <w:webHidden/>
-          </w:rPr>
-          <w:t>37</w:t>
-        </w:r>
-        <w:r>
-          <w:rPr>
-            <w:noProof/>
-            <w:webHidden/>
-          </w:rPr>
-          <w:fldChar w:fldCharType="end"/>
-        </w:r>
-      </w:hyperlink>
-    </w:p>
-    <w:p>
-      <w:pPr>
-        <w:pStyle w:val="TableofFigures"/>
-        <w:tabs>
-          <w:tab w:val="right" w:leader="dot" w:pos="8778"/>
-        </w:tabs>
-        <w:rPr>
-          <w:rFonts w:asciiTheme="minorHAnsi" w:eastAsiaTheme="minorEastAsia" w:hAnsiTheme="minorHAnsi" w:cstheme="minorBidi"/>
-          <w:noProof/>
-          <w:kern w:val="2"/>
-          <w:lang w:val="en-DE" w:eastAsia="en-DE"/>
-          <w14:ligatures w14:val="standardContextual"/>
-        </w:rPr>
-      </w:pPr>
-      <w:hyperlink w:anchor="_Toc242813406" w:history="1">
-        <w:r>
-          <w:rPr>
-            <w:rStyle w:val="Hyperlink"/>
-            <w:noProof/>
-          </w:rPr>
-          <w:t>Slika 6.1 Graf agregiranih rezultata</w:t>
-        </w:r>
-        <w:r>
-          <w:rPr>
-            <w:noProof/>
-            <w:webHidden/>
-          </w:rPr>
-          <w:tab/>
-        </w:r>
-        <w:r>
-          <w:rPr>
-            <w:noProof/>
-            <w:webHidden/>
-          </w:rPr>
-          <w:fldChar w:fldCharType="begin"/>
-        </w:r>
-        <w:r>
-          <w:rPr>
-            <w:noProof/>
-            <w:webHidden/>
-          </w:rPr>
-          <w:instrText xml:space="preserve"> PAGEREF _Toc242813406 \h </w:instrText>
-        </w:r>
-        <w:r>
-          <w:rPr>
-            <w:noProof/>
-            <w:webHidden/>
-          </w:rPr>
-        </w:r>
-        <w:r>
-          <w:rPr>
-            <w:noProof/>
-            <w:webHidden/>
-          </w:rPr>
-          <w:fldChar w:fldCharType="separate"/>
-        </w:r>
-        <w:r>
-          <w:rPr>
-            <w:noProof/>
-            <w:webHidden/>
-          </w:rPr>
-          <w:t>47</w:t>
-        </w:r>
-        <w:r>
-          <w:rPr>
-            <w:noProof/>
-            <w:webHidden/>
-          </w:rPr>
-          <w:fldChar w:fldCharType="end"/>
-        </w:r>
-      </w:hyperlink>
-    </w:p>
-    <w:p>
       <w:r>
         <w:fldChar w:fldCharType="end"/>
       </w:r>
     </w:p>
-    <w:p>
-      <w:pPr>
-        <w:pStyle w:val="Heading1"/>
-        <w:numPr>
-          <w:ilvl w:val="0"/>
-          <w:numId w:val="0"/>
-        </w:numPr>
-        <w:ind w:left="425" w:hanging="425"/>
-      </w:pPr>
-      <w:bookmarkStart w:id="57" w:name="_Toc242813396"/>
-      <w:r>
-        <w:lastRenderedPageBreak/>
-        <w:t>Popis kôdova</w:t>
-      </w:r>
-      <w:bookmarkEnd w:id="57"/>
-    </w:p>
-    <w:p>
-      <w:pPr>
-        <w:pStyle w:val="TableofFigures"/>
-        <w:tabs>
-          <w:tab w:val="right" w:leader="dot" w:pos="8778"/>
-        </w:tabs>
-        <w:rPr>
-          <w:rFonts w:asciiTheme="minorHAnsi" w:eastAsiaTheme="minorEastAsia" w:hAnsiTheme="minorHAnsi" w:cstheme="minorBidi"/>
-          <w:noProof/>
-          <w:kern w:val="2"/>
-          <w:lang w:val="en-DE" w:eastAsia="en-DE"/>
-          <w14:ligatures w14:val="standardContextual"/>
-        </w:rPr>
-      </w:pPr>
-      <w:r>
-        <w:fldChar w:fldCharType="begin"/>
-      </w:r>
-      <w:r>
-        <w:instrText xml:space="preserve"> TOC \h \z \c "Kôd" </w:instrText>
-      </w:r>
-      <w:r>
-        <w:fldChar w:fldCharType="separate"/>
-      </w:r>
-      <w:hyperlink w:anchor="_Toc242813407" w:history="1">
-        <w:r>
-          <w:rPr>
-            <w:rStyle w:val="Hyperlink"/>
-            <w:noProof/>
-          </w:rPr>
-          <w:t>Kôd 5.1 EquationDao</w:t>
-        </w:r>
-        <w:r>
-          <w:rPr>
-            <w:noProof/>
-            <w:webHidden/>
-          </w:rPr>
-          <w:tab/>
-        </w:r>
-        <w:r>
-          <w:rPr>
-            <w:noProof/>
-            <w:webHidden/>
-          </w:rPr>
-          <w:fldChar w:fldCharType="begin"/>
-        </w:r>
-        <w:r>
-          <w:rPr>
-            <w:noProof/>
-            <w:webHidden/>
-          </w:rPr>
-          <w:instrText xml:space="preserve"> PAGEREF _Toc242813407 \h </w:instrText>
-        </w:r>
-        <w:r>
-          <w:rPr>
-            <w:noProof/>
-            <w:webHidden/>
-          </w:rPr>
-        </w:r>
-        <w:r>
-          <w:rPr>
-            <w:noProof/>
-            <w:webHidden/>
-          </w:rPr>
-          <w:fldChar w:fldCharType="separate"/>
-        </w:r>
-        <w:r>
-          <w:rPr>
-            <w:noProof/>
-            <w:webHidden/>
-          </w:rPr>
-          <w:t>19</w:t>
-        </w:r>
-        <w:r>
-          <w:rPr>
-            <w:noProof/>
-            <w:webHidden/>
-          </w:rPr>
-          <w:fldChar w:fldCharType="end"/>
-        </w:r>
-      </w:hyperlink>
-    </w:p>
-    <w:p>
-      <w:pPr>
-        <w:pStyle w:val="TableofFigures"/>
-        <w:tabs>
-          <w:tab w:val="right" w:leader="dot" w:pos="8778"/>
-        </w:tabs>
-        <w:rPr>
-          <w:rFonts w:asciiTheme="minorHAnsi" w:eastAsiaTheme="minorEastAsia" w:hAnsiTheme="minorHAnsi" w:cstheme="minorBidi"/>
-          <w:noProof/>
-          <w:kern w:val="2"/>
-          <w:lang w:val="en-DE" w:eastAsia="en-DE"/>
-          <w14:ligatures w14:val="standardContextual"/>
-        </w:rPr>
-      </w:pPr>
-      <w:hyperlink w:anchor="_Toc242813408" w:history="1">
-        <w:r>
-          <w:rPr>
-            <w:rStyle w:val="Hyperlink"/>
-            <w:noProof/>
-          </w:rPr>
-          <w:t>Kôd 5.2 Kôd za OCR post-procesiranje</w:t>
-        </w:r>
-        <w:r>
-          <w:rPr>
-            <w:noProof/>
-            <w:webHidden/>
-          </w:rPr>
-          <w:tab/>
-        </w:r>
-        <w:r>
-          <w:rPr>
-            <w:noProof/>
-            <w:webHidden/>
-          </w:rPr>
-          <w:fldChar w:fldCharType="begin"/>
-        </w:r>
-        <w:r>
-          <w:rPr>
-            <w:noProof/>
-            <w:webHidden/>
-          </w:rPr>
-          <w:instrText xml:space="preserve"> PAGEREF _Toc242813408 \h </w:instrText>
-        </w:r>
-        <w:r>
-          <w:rPr>
-            <w:noProof/>
-            <w:webHidden/>
-          </w:rPr>
-        </w:r>
-        <w:r>
-          <w:rPr>
-            <w:noProof/>
-            <w:webHidden/>
-          </w:rPr>
-          <w:fldChar w:fldCharType="separate"/>
-        </w:r>
-        <w:r>
-          <w:rPr>
-            <w:noProof/>
-            <w:webHidden/>
-          </w:rPr>
-          <w:t>25</w:t>
-        </w:r>
-        <w:r>
-          <w:rPr>
-            <w:noProof/>
-            <w:webHidden/>
-          </w:rPr>
-          <w:fldChar w:fldCharType="end"/>
-        </w:r>
-      </w:hyperlink>
-    </w:p>
-    <w:p>
-      <w:pPr>
-        <w:pStyle w:val="TableofFigures"/>
-        <w:tabs>
-          <w:tab w:val="right" w:leader="dot" w:pos="8778"/>
-        </w:tabs>
-        <w:rPr>
-          <w:rFonts w:asciiTheme="minorHAnsi" w:eastAsiaTheme="minorEastAsia" w:hAnsiTheme="minorHAnsi" w:cstheme="minorBidi"/>
-          <w:noProof/>
-          <w:kern w:val="2"/>
-          <w:lang w:val="en-DE" w:eastAsia="en-DE"/>
-          <w14:ligatures w14:val="standardContextual"/>
-        </w:rPr>
-      </w:pPr>
-      <w:hyperlink w:anchor="_Toc242813409" w:history="1">
-        <w:r>
-          <w:rPr>
-            <w:rStyle w:val="Hyperlink"/>
-            <w:noProof/>
-          </w:rPr>
-          <w:t>Kôd 5.3 Kôd za konstrukciju Solve() upita</w:t>
-        </w:r>
-        <w:r>
-          <w:rPr>
-            <w:noProof/>
-            <w:webHidden/>
-          </w:rPr>
-          <w:tab/>
-        </w:r>
-        <w:r>
-          <w:rPr>
-            <w:noProof/>
-            <w:webHidden/>
-          </w:rPr>
-          <w:fldChar w:fldCharType="begin"/>
-        </w:r>
-        <w:r>
-          <w:rPr>
-            <w:noProof/>
-            <w:webHidden/>
-          </w:rPr>
-          <w:instrText xml:space="preserve"> PAGEREF _Toc242813409 \h </w:instrText>
-        </w:r>
-        <w:r>
-          <w:rPr>
-            <w:noProof/>
-            <w:webHidden/>
-          </w:rPr>
-        </w:r>
-        <w:r>
-          <w:rPr>
-            <w:noProof/>
-            <w:webHidden/>
-          </w:rPr>
-          <w:fldChar w:fldCharType="separate"/>
-        </w:r>
-        <w:r>
-          <w:rPr>
-            <w:noProof/>
-            <w:webHidden/>
-          </w:rPr>
-          <w:t>34</w:t>
-        </w:r>
-        <w:r>
-          <w:rPr>
-            <w:noProof/>
-            <w:webHidden/>
-          </w:rPr>
-          <w:fldChar w:fldCharType="end"/>
-        </w:r>
-      </w:hyperlink>
-    </w:p>
-    <w:p>
-      <w:pPr>
-        <w:pStyle w:val="TableofFigures"/>
-        <w:tabs>
-          <w:tab w:val="right" w:leader="dot" w:pos="8778"/>
-        </w:tabs>
-        <w:rPr>
-          <w:rFonts w:asciiTheme="minorHAnsi" w:eastAsiaTheme="minorEastAsia" w:hAnsiTheme="minorHAnsi" w:cstheme="minorBidi"/>
-          <w:noProof/>
-          <w:kern w:val="2"/>
-          <w:lang w:val="en-DE" w:eastAsia="en-DE"/>
-          <w14:ligatures w14:val="standardContextual"/>
-        </w:rPr>
-      </w:pPr>
-      <w:hyperlink w:anchor="_Toc242813410" w:history="1">
-        <w:r>
-          <w:rPr>
-            <w:rStyle w:val="Hyperlink"/>
-            <w:noProof/>
-          </w:rPr>
-          <w:t>Kôd 5.4 Kôd za serijalizaciju i Base64 enkodiranje</w:t>
-        </w:r>
-        <w:r>
-          <w:rPr>
-            <w:noProof/>
-            <w:webHidden/>
-          </w:rPr>
-          <w:tab/>
-        </w:r>
-        <w:r>
-          <w:rPr>
-            <w:noProof/>
-            <w:webHidden/>
-          </w:rPr>
-          <w:fldChar w:fldCharType="begin"/>
-        </w:r>
-        <w:r>
-          <w:rPr>
-            <w:noProof/>
-            <w:webHidden/>
-          </w:rPr>
-          <w:instrText xml:space="preserve"> PAGEREF _Toc242813410 \h </w:instrText>
-        </w:r>
-        <w:r>
-          <w:rPr>
-            <w:noProof/>
-            <w:webHidden/>
-          </w:rPr>
-        </w:r>
-        <w:r>
-          <w:rPr>
-            <w:noProof/>
-            <w:webHidden/>
-          </w:rPr>
-          <w:fldChar w:fldCharType="separate"/>
-        </w:r>
-        <w:r>
-          <w:rPr>
-            <w:noProof/>
-            <w:webHidden/>
-          </w:rPr>
-          <w:t>41</w:t>
-        </w:r>
-        <w:r>
-          <w:rPr>
-            <w:noProof/>
-            <w:webHidden/>
-          </w:rPr>
-          <w:fldChar w:fldCharType="end"/>
-        </w:r>
-      </w:hyperlink>
-    </w:p>
-    <w:p>
-      <w:pPr>
-        <w:pStyle w:val="TableofFigures"/>
-        <w:tabs>
-          <w:tab w:val="right" w:leader="dot" w:pos="8778"/>
-        </w:tabs>
-        <w:rPr>
-          <w:rFonts w:asciiTheme="minorHAnsi" w:eastAsiaTheme="minorEastAsia" w:hAnsiTheme="minorHAnsi" w:cstheme="minorBidi"/>
-          <w:noProof/>
-          <w:kern w:val="2"/>
-          <w:lang w:val="en-DE" w:eastAsia="en-DE"/>
-          <w14:ligatures w14:val="standardContextual"/>
-        </w:rPr>
-      </w:pPr>
-      <w:hyperlink w:anchor="_Toc242813411" w:history="1">
-        <w:r>
-          <w:rPr>
-            <w:rStyle w:val="Hyperlink"/>
-            <w:noProof/>
-          </w:rPr>
-          <w:t>Kôd 6.1 Kod za unit testove</w:t>
-        </w:r>
-        <w:r>
-          <w:rPr>
-            <w:noProof/>
-            <w:webHidden/>
-          </w:rPr>
-          <w:tab/>
-        </w:r>
-        <w:r>
-          <w:rPr>
-            <w:noProof/>
-            <w:webHidden/>
-          </w:rPr>
-          <w:fldChar w:fldCharType="begin"/>
-        </w:r>
-        <w:r>
-          <w:rPr>
-            <w:noProof/>
-            <w:webHidden/>
-          </w:rPr>
-          <w:instrText xml:space="preserve"> PAGEREF _Toc242813411 \h </w:instrText>
-        </w:r>
-        <w:r>
-          <w:rPr>
-            <w:noProof/>
-            <w:webHidden/>
-          </w:rPr>
-        </w:r>
-        <w:r>
-          <w:rPr>
-            <w:noProof/>
-            <w:webHidden/>
-          </w:rPr>
-          <w:fldChar w:fldCharType="separate"/>
-        </w:r>
-        <w:r>
-          <w:rPr>
-            <w:noProof/>
-            <w:webHidden/>
-          </w:rPr>
-          <w:t>46</w:t>
-        </w:r>
-        <w:r>
-          <w:rPr>
-            <w:noProof/>
-            <w:webHidden/>
-          </w:rPr>
-          <w:fldChar w:fldCharType="end"/>
-        </w:r>
-      </w:hyperlink>
-    </w:p>
-    <w:p>
-      <w:r>
-        <w:fldChar w:fldCharType="end"/>
-      </w:r>
-    </w:p>
-    <w:bookmarkStart w:id="58" w:name="_Toc242813397" w:displacedByCustomXml="next"/>
+    <w:bookmarkStart w:id="58" w:name="_Toc242946875" w:displacedByCustomXml="next"/>
     <w:sdt>
       <w:sdtPr>
         <w:rPr>
@@ -14544,7 +14565,7 @@
           </w:tblGrid>
           <w:tr>
             <w:trPr>
-              <w:divId w:val="2063405386"/>
+              <w:divId w:val="1827352802"/>
               <w:tblCellSpacing w:w="15" w:type="dxa"/>
             </w:trPr>
             <w:tc>
@@ -14590,7 +14611,7 @@
           </w:tr>
           <w:tr>
             <w:trPr>
-              <w:divId w:val="2063405386"/>
+              <w:divId w:val="1827352802"/>
               <w:tblCellSpacing w:w="15" w:type="dxa"/>
             </w:trPr>
             <w:tc>
@@ -14636,7 +14657,7 @@
           </w:tr>
           <w:tr>
             <w:trPr>
-              <w:divId w:val="2063405386"/>
+              <w:divId w:val="1827352802"/>
               <w:tblCellSpacing w:w="15" w:type="dxa"/>
             </w:trPr>
             <w:tc>
@@ -14682,7 +14703,7 @@
           </w:tr>
           <w:tr>
             <w:trPr>
-              <w:divId w:val="2063405386"/>
+              <w:divId w:val="1827352802"/>
               <w:tblCellSpacing w:w="15" w:type="dxa"/>
             </w:trPr>
             <w:tc>
@@ -14729,7 +14750,7 @@
         </w:tbl>
         <w:p>
           <w:pPr>
-            <w:divId w:val="2063405386"/>
+            <w:divId w:val="1827352802"/>
             <w:rPr>
               <w:noProof/>
             </w:rPr>
@@ -17045,6 +17066,7 @@
   <w:style w:type="character" w:default="1" w:styleId="DefaultParagraphFont">
     <w:name w:val="Default Paragraph Font"/>
     <w:uiPriority w:val="1"/>
+    <w:semiHidden/>
     <w:unhideWhenUsed/>
   </w:style>
   <w:style w:type="table" w:default="1" w:styleId="TableNormal">
@@ -18996,6 +19018,15 @@
 </file>
 
 <file path=customXml/item1.xml><?xml version="1.0" encoding="utf-8"?>
+<?mso-contentType ?>
+<FormTemplates xmlns="http://schemas.microsoft.com/sharepoint/v3/contenttype/forms">
+  <Display>DocumentLibraryForm</Display>
+  <Edit>DocumentLibraryForm</Edit>
+  <New>DocumentLibraryForm</New>
+</FormTemplates>
+</file>
+
+<file path=customXml/item2.xml><?xml version="1.0" encoding="utf-8"?>
 <p:properties xmlns:p="http://schemas.microsoft.com/office/2006/metadata/properties" xmlns:xsi="http://www.w3.org/2001/XMLSchema-instance" xmlns:pc="http://schemas.microsoft.com/office/infopath/2007/PartnerControls">
   <documentManagement>
     <lcf76f155ced4ddcb4097134ff3c332f xmlns="346bc69e-9362-457f-8135-617ee6cc7bac">
@@ -19006,16 +19037,105 @@
 </p:properties>
 </file>
 
-<file path=customXml/item2.xml><?xml version="1.0" encoding="utf-8"?>
-<?mso-contentType ?>
-<FormTemplates xmlns="http://schemas.microsoft.com/sharepoint/v3/contenttype/forms">
-  <Display>DocumentLibraryForm</Display>
-  <Edit>DocumentLibraryForm</Edit>
-  <New>DocumentLibraryForm</New>
-</FormTemplates>
+<file path=customXml/item3.xml><?xml version="1.0" encoding="utf-8"?>
+<b:Sources xmlns:b="http://schemas.openxmlformats.org/officeDocument/2006/bibliography" xmlns="http://schemas.openxmlformats.org/officeDocument/2006/bibliography" SelectedStyle="\IEEE2006OfficeOnline.xsl" StyleName="IEEE" Version="2006">
+  <b:Source>
+    <b:Tag>For25</b:Tag>
+    <b:SourceType>Book</b:SourceType>
+    <b:Guid>{D6407706-64AD-44C5-A4EE-A0130F49D198}</b:Guid>
+    <b:Title>How to Build Android Applications with Kotlin: A hands-on guide to developing, testing, and publishing production-grade Android 16 apps</b:Title>
+    <b:Year>2025</b:Year>
+    <b:Publisher>Packt Publishing</b:Publisher>
+    <b:Author>
+      <b:Author>
+        <b:NameList>
+          <b:Person>
+            <b:Last>Forrester</b:Last>
+            <b:First>A.</b:First>
+          </b:Person>
+          <b:Person>
+            <b:Last>Boudjnah</b:Last>
+            <b:First>E.</b:First>
+          </b:Person>
+        </b:NameList>
+      </b:Author>
+    </b:Author>
+    <b:RefOrder>1</b:RefOrder>
+  </b:Source>
+  <b:Source>
+    <b:Tag>Aho06</b:Tag>
+    <b:SourceType>Book</b:SourceType>
+    <b:Guid>{A67BE479-9547-4633-AD94-0E92F47A5A64}</b:Guid>
+    <b:Title>Compilers: Principles, techniques, and tools</b:Title>
+    <b:Year>2006</b:Year>
+    <b:Publisher>Pearson Education</b:Publisher>
+    <b:Author>
+      <b:Author>
+        <b:NameList>
+          <b:Person>
+            <b:Last>Aho</b:Last>
+            <b:First>A. V.</b:First>
+          </b:Person>
+          <b:Person>
+            <b:Last>Lam</b:Last>
+            <b:First>M. S.</b:First>
+          </b:Person>
+          <b:Person>
+            <b:Last>Sethi</b:Last>
+            <b:First>R.</b:First>
+          </b:Person>
+          <b:Person>
+            <b:Last>Ullman</b:Last>
+            <b:First>J.D.</b:First>
+          </b:Person>
+        </b:NameList>
+      </b:Author>
+    </b:Author>
+    <b:Edition>2nd ed.</b:Edition>
+    <b:RefOrder>2</b:RefOrder>
+  </b:Source>
+  <b:Source>
+    <b:Tag>Goo26</b:Tag>
+    <b:SourceType>DocumentFromInternetSite</b:SourceType>
+    <b:Guid>{CB463188-BCFD-4474-83A4-F557E4C9EE05}</b:Guid>
+    <b:Title>Recognize text in images with ML Kit on Android</b:Title>
+    <b:Year>2026</b:Year>
+    <b:Author>
+      <b:Author>
+        <b:Corporate>Google for Developers</b:Corporate>
+      </b:Author>
+    </b:Author>
+    <b:InternetSiteTitle>Google for Developers</b:InternetSiteTitle>
+    <b:Month>travanj</b:Month>
+    <b:Day>20</b:Day>
+    <b:URL>https://developers.google.com/ml-kit/vision/text-recognition/v2</b:URL>
+    <b:RefOrder>4</b:RefOrder>
+  </b:Source>
+  <b:Source>
+    <b:Tag>Gru24</b:Tag>
+    <b:SourceType>Report</b:SourceType>
+    <b:Guid>{F9673649-4FD3-438F-88A2-A18D972BA673}</b:Guid>
+    <b:Title>Mobilna aplikacija za pretvorbu slike s tekstom u tekst primjenom tehnologije optičkog prepoznavanja znakova</b:Title>
+    <b:Year>2024</b:Year>
+    <b:URL>https://urn.nsk.hr/urn:nbn:hr:168:587919</b:URL>
+    <b:Institution>Fakultet elektrotehnike i računarstva, Sveučilište u Zagrebu</b:Institution>
+    <b:ThesisType>Završni rad</b:ThesisType>
+    <b:Author>
+      <b:Author>
+        <b:NameList>
+          <b:Person>
+            <b:Last>Grudić</b:Last>
+            <b:First>T.</b:First>
+          </b:Person>
+        </b:NameList>
+      </b:Author>
+    </b:Author>
+    <b:RefOrder>3</b:RefOrder>
+  </b:Source>
+</b:Sources>
 </file>
 
-<file path=customXml/item3.xml><?xml version="1.0" encoding="utf-8"?>
+<file path=customXml/item4.xml><?xml version="1.0" encoding="utf-8"?>
 <ct:contentTypeSchema xmlns:ct="http://schemas.microsoft.com/office/2006/metadata/contentType" xmlns:ma="http://schemas.microsoft.com/office/2006/metadata/properties/metaAttributes" ct:_="" ma:_="" ma:contentTypeName="Dokument" ma:contentTypeID="0x010100CE8A6C523F15BE45BBB2628A8D195F23" ma:contentTypeVersion="13" ma:contentTypeDescription="Stvaranje novog dokumenta." ma:contentTypeScope="" ma:versionID="6a86de1faa86fa16ad729fe3930c3d49">
   <xsd:schema xmlns:xsd="http://www.w3.org/2001/XMLSchema" xmlns:xs="http://www.w3.org/2001/XMLSchema" xmlns:p="http://schemas.microsoft.com/office/2006/metadata/properties" xmlns:ns2="346bc69e-9362-457f-8135-617ee6cc7bac" xmlns:ns3="05f9ff4f-fb41-4731-8e66-a25ebb0ec23b" targetNamespace="http://schemas.microsoft.com/office/2006/metadata/properties" ma:root="true" ma:fieldsID="8f7b465b8d64df515966ccfc620eb42a" ns2:_="" ns3:_="">
     <xsd:import namespace="346bc69e-9362-457f-8135-617ee6cc7bac"/>
@@ -19222,105 +19342,15 @@
 </ct:contentTypeSchema>
 </file>
 
-<file path=customXml/item4.xml><?xml version="1.0" encoding="utf-8"?>
-<b:Sources xmlns:b="http://schemas.openxmlformats.org/officeDocument/2006/bibliography" xmlns="http://schemas.openxmlformats.org/officeDocument/2006/bibliography" SelectedStyle="\IEEE2006OfficeOnline.xsl" StyleName="IEEE" Version="2006">
-  <b:Source>
-    <b:Tag>For25</b:Tag>
-    <b:SourceType>Book</b:SourceType>
-    <b:Guid>{D6407706-64AD-44C5-A4EE-A0130F49D198}</b:Guid>
-    <b:Title>How to Build Android Applications with Kotlin: A hands-on guide to developing, testing, and publishing production-grade Android 16 apps</b:Title>
-    <b:Year>2025</b:Year>
-    <b:Publisher>Packt Publishing</b:Publisher>
-    <b:Author>
-      <b:Author>
-        <b:NameList>
-          <b:Person>
-            <b:Last>Forrester</b:Last>
-            <b:First>A.</b:First>
-          </b:Person>
-          <b:Person>
-            <b:Last>Boudjnah</b:Last>
-            <b:First>E.</b:First>
-          </b:Person>
-        </b:NameList>
-      </b:Author>
-    </b:Author>
-    <b:RefOrder>1</b:RefOrder>
-  </b:Source>
-  <b:Source>
-    <b:Tag>Aho06</b:Tag>
-    <b:SourceType>Book</b:SourceType>
-    <b:Guid>{A67BE479-9547-4633-AD94-0E92F47A5A64}</b:Guid>
-    <b:Title>Compilers: Principles, techniques, and tools</b:Title>
-    <b:Year>2006</b:Year>
-    <b:Publisher>Pearson Education</b:Publisher>
-    <b:Author>
-      <b:Author>
-        <b:NameList>
-          <b:Person>
-            <b:Last>Aho</b:Last>
-            <b:First>A. V.</b:First>
-          </b:Person>
-          <b:Person>
-            <b:Last>Lam</b:Last>
-            <b:First>M. S.</b:First>
-          </b:Person>
-          <b:Person>
-            <b:Last>Sethi</b:Last>
-            <b:First>R.</b:First>
-          </b:Person>
-          <b:Person>
-            <b:Last>Ullman</b:Last>
-            <b:First>J.D.</b:First>
-          </b:Person>
-        </b:NameList>
-      </b:Author>
-    </b:Author>
-    <b:Edition>2nd ed.</b:Edition>
-    <b:RefOrder>2</b:RefOrder>
-  </b:Source>
-  <b:Source>
-    <b:Tag>Goo26</b:Tag>
-    <b:SourceType>DocumentFromInternetSite</b:SourceType>
-    <b:Guid>{CB463188-BCFD-4474-83A4-F557E4C9EE05}</b:Guid>
-    <b:Title>Recognize text in images with ML Kit on Android</b:Title>
-    <b:Year>2026</b:Year>
-    <b:Author>
-      <b:Author>
-        <b:Corporate>Google for Developers</b:Corporate>
-      </b:Author>
-    </b:Author>
-    <b:InternetSiteTitle>Google for Developers</b:InternetSiteTitle>
-    <b:Month>travanj</b:Month>
-    <b:Day>20</b:Day>
-    <b:URL>https://developers.google.com/ml-kit/vision/text-recognition/v2</b:URL>
-    <b:RefOrder>4</b:RefOrder>
-  </b:Source>
-  <b:Source>
-    <b:Tag>Gru24</b:Tag>
-    <b:SourceType>Report</b:SourceType>
-    <b:Guid>{F9673649-4FD3-438F-88A2-A18D972BA673}</b:Guid>
-    <b:Title>Mobilna aplikacija za pretvorbu slike s tekstom u tekst primjenom tehnologije optičkog prepoznavanja znakova</b:Title>
-    <b:Year>2024</b:Year>
-    <b:URL>https://urn.nsk.hr/urn:nbn:hr:168:587919</b:URL>
-    <b:Institution>Fakultet elektrotehnike i računarstva, Sveučilište u Zagrebu</b:Institution>
-    <b:ThesisType>Završni rad</b:ThesisType>
-    <b:Author>
-      <b:Author>
-        <b:NameList>
-          <b:Person>
-            <b:Last>Grudić</b:Last>
-            <b:First>T.</b:First>
-          </b:Person>
-        </b:NameList>
-      </b:Author>
-    </b:Author>
-    <b:RefOrder>3</b:RefOrder>
-  </b:Source>
-</b:Sources>
+<file path=customXml/itemProps1.xml><?xml version="1.0" encoding="utf-8"?>
+<ds:datastoreItem xmlns:ds="http://schemas.openxmlformats.org/officeDocument/2006/customXml" ds:itemID="{4B895F2A-9BBA-40EB-8B52-6127588571FA}">
+  <ds:schemaRefs>
+    <ds:schemaRef ds:uri="http://schemas.microsoft.com/sharepoint/v3/contenttype/forms"/>
+  </ds:schemaRefs>
+</ds:datastoreItem>
 </file>
 
-<file path=customXml/itemProps1.xml><?xml version="1.0" encoding="utf-8"?>
+<file path=customXml/itemProps2.xml><?xml version="1.0" encoding="utf-8"?>
 <ds:datastoreItem xmlns:ds="http://schemas.openxmlformats.org/officeDocument/2006/customXml" ds:itemID="{5D60AB73-315D-41F5-B86C-A733B1DE9D36}">
   <ds:schemaRefs>
     <ds:schemaRef ds:uri="http://schemas.microsoft.com/office/2006/metadata/properties"/>
@@ -19331,15 +19361,15 @@
 </ds:datastoreItem>
 </file>
 
-<file path=customXml/itemProps2.xml><?xml version="1.0" encoding="utf-8"?>
-<ds:datastoreItem xmlns:ds="http://schemas.openxmlformats.org/officeDocument/2006/customXml" ds:itemID="{4B895F2A-9BBA-40EB-8B52-6127588571FA}">
+<file path=customXml/itemProps3.xml><?xml version="1.0" encoding="utf-8"?>
+<ds:datastoreItem xmlns:ds="http://schemas.openxmlformats.org/officeDocument/2006/customXml" ds:itemID="{E6746475-B202-49DA-9CB3-3E7BA13B2120}">
   <ds:schemaRefs>
-    <ds:schemaRef ds:uri="http://schemas.microsoft.com/sharepoint/v3/contenttype/forms"/>
+    <ds:schemaRef ds:uri="http://schemas.openxmlformats.org/officeDocument/2006/bibliography"/>
   </ds:schemaRefs>
 </ds:datastoreItem>
 </file>
 
-<file path=customXml/itemProps3.xml><?xml version="1.0" encoding="utf-8"?>
+<file path=customXml/itemProps4.xml><?xml version="1.0" encoding="utf-8"?>
 <ds:datastoreItem xmlns:ds="http://schemas.openxmlformats.org/officeDocument/2006/customXml" ds:itemID="{F1F35A86-14E7-45B7-8C97-55729988BED5}">
   <ds:schemaRefs>
     <ds:schemaRef ds:uri="http://schemas.microsoft.com/office/2006/metadata/contentType"/>
@@ -19356,12 +19386,4 @@
     <ds:schemaRef ds:uri="http://schemas.microsoft.com/internal/obd"/>
   </ds:schemaRefs>
 </ds:datastoreItem>
-</file>
-
-<file path=customXml/itemProps4.xml><?xml version="1.0" encoding="utf-8"?>
-<ds:datastoreItem xmlns:ds="http://schemas.openxmlformats.org/officeDocument/2006/customXml" ds:itemID="{E6746475-B202-49DA-9CB3-3E7BA13B2120}">
-  <ds:schemaRefs>
-    <ds:schemaRef ds:uri="http://schemas.openxmlformats.org/officeDocument/2006/bibliography"/>
-  </ds:schemaRefs>
-</ds:datastoreItem>
 </file>
</xml_diff>